<commit_message>
docs: finalize public demo and submission artifacts
</commit_message>
<xml_diff>
--- a/portfolio_artifacts/ReOrch_智策_AI产品作品集_20260727.docx
+++ b/portfolio_artifacts/ReOrch_智策_AI产品作品集_20260727.docx
@@ -142,6 +142,28 @@
           <w:sz w:val="21"/>
         </w:rPr>
         <w:t>github.com/eulalee001020-star/reorch-zhice</w:t>
+      </w:r>
+    </w:p>
+    <w:p>
+      <w:pPr>
+        <w:spacing w:after="40"/>
+      </w:pPr>
+      <w:r>
+        <w:rPr>
+          <w:rFonts w:ascii="Calibri" w:hAnsi="Calibri" w:eastAsia="Arial Unicode MS" w:cs="Arial Unicode MS"/>
+          <w:b/>
+          <w:color w:val="191F1D"/>
+          <w:sz w:val="21"/>
+        </w:rPr>
+        <w:t>在线 Demo：</w:t>
+      </w:r>
+      <w:r>
+        <w:rPr>
+          <w:rFonts w:ascii="Calibri" w:hAnsi="Calibri" w:eastAsia="Arial Unicode MS" w:cs="Arial Unicode MS"/>
+          <w:color w:val="191F1D"/>
+          <w:sz w:val="21"/>
+        </w:rPr>
+        <w:t>reorch-zhice-portfolio.eula-lee001020.chatgpt.site</w:t>
       </w:r>
     </w:p>
     <w:p>
@@ -5181,6 +5203,29 @@
           <w:color w:val="191F1D"/>
           <w:sz w:val="21"/>
         </w:rPr>
+        <w:t>在线 Demo：https://reorch-zhice-portfolio.eula-lee001020.chatgpt.site</w:t>
+      </w:r>
+    </w:p>
+    <w:p>
+      <w:pPr>
+        <w:spacing w:after="160" w:line="280" w:lineRule="auto"/>
+        <w:ind w:left="720" w:hanging="360"/>
+      </w:pPr>
+      <w:r>
+        <w:rPr>
+          <w:rFonts w:ascii="Calibri" w:hAnsi="Calibri" w:eastAsia="Arial Unicode MS" w:cs="Arial Unicode MS"/>
+          <w:b/>
+          <w:color w:val="176B4D"/>
+          <w:sz w:val="21"/>
+        </w:rPr>
+        <w:t xml:space="preserve">• </w:t>
+      </w:r>
+      <w:r>
+        <w:rPr>
+          <w:rFonts w:ascii="Calibri" w:hAnsi="Calibri" w:eastAsia="Arial Unicode MS" w:cs="Arial Unicode MS"/>
+          <w:color w:val="191F1D"/>
+          <w:sz w:val="21"/>
+        </w:rPr>
         <w:t>产品 PRD：docs/product/prd_decision_workbench.md</w:t>
       </w:r>
     </w:p>

</xml_diff>

<commit_message>
fix: harden portfolio artifact delivery
</commit_message>
<xml_diff>
--- a/portfolio_artifacts/ReOrch_智策_AI产品作品集_20260727.docx
+++ b/portfolio_artifacts/ReOrch_智策_AI产品作品集_20260727.docx
@@ -13,7 +13,7 @@
       </w:pPr>
       <w:r>
         <w:rPr>
-          <w:rFonts w:ascii="Calibri" w:hAnsi="Calibri" w:eastAsia="Arial Unicode MS" w:cs="Arial Unicode MS"/>
+          <w:rFonts w:ascii="Arial Unicode MS" w:hAnsi="Arial Unicode MS" w:eastAsia="Arial Unicode MS" w:cs="Arial Unicode MS"/>
           <w:b/>
           <w:color w:val="191F1D"/>
           <w:sz w:val="54"/>
@@ -27,7 +27,7 @@
       </w:pPr>
       <w:r>
         <w:rPr>
-          <w:rFonts w:ascii="Calibri" w:hAnsi="Calibri" w:eastAsia="Arial Unicode MS" w:cs="Arial Unicode MS"/>
+          <w:rFonts w:ascii="Arial Unicode MS" w:hAnsi="Arial Unicode MS" w:eastAsia="Arial Unicode MS" w:cs="Arial Unicode MS"/>
           <w:color w:val="1F4D78"/>
           <w:sz w:val="30"/>
         </w:rPr>
@@ -40,7 +40,7 @@
       </w:pPr>
       <w:r>
         <w:rPr>
-          <w:rFonts w:ascii="Calibri" w:hAnsi="Calibri" w:eastAsia="Arial Unicode MS" w:cs="Arial Unicode MS"/>
+          <w:rFonts w:ascii="Arial Unicode MS" w:hAnsi="Arial Unicode MS" w:eastAsia="Arial Unicode MS" w:cs="Arial Unicode MS"/>
           <w:b/>
           <w:color w:val="191F1D"/>
           <w:sz w:val="21"/>
@@ -49,7 +49,7 @@
       </w:r>
       <w:r>
         <w:rPr>
-          <w:rFonts w:ascii="Calibri" w:hAnsi="Calibri" w:eastAsia="Arial Unicode MS" w:cs="Arial Unicode MS"/>
+          <w:rFonts w:ascii="Arial Unicode MS" w:hAnsi="Arial Unicode MS" w:eastAsia="Arial Unicode MS" w:cs="Arial Unicode MS"/>
           <w:color w:val="191F1D"/>
           <w:sz w:val="21"/>
         </w:rPr>
@@ -62,7 +62,7 @@
       </w:pPr>
       <w:r>
         <w:rPr>
-          <w:rFonts w:ascii="Calibri" w:hAnsi="Calibri" w:eastAsia="Arial Unicode MS" w:cs="Arial Unicode MS"/>
+          <w:rFonts w:ascii="Arial Unicode MS" w:hAnsi="Arial Unicode MS" w:eastAsia="Arial Unicode MS" w:cs="Arial Unicode MS"/>
           <w:b/>
           <w:color w:val="191F1D"/>
           <w:sz w:val="21"/>
@@ -71,7 +71,7 @@
       </w:r>
       <w:r>
         <w:rPr>
-          <w:rFonts w:ascii="Calibri" w:hAnsi="Calibri" w:eastAsia="Arial Unicode MS" w:cs="Arial Unicode MS"/>
+          <w:rFonts w:ascii="Arial Unicode MS" w:hAnsi="Arial Unicode MS" w:eastAsia="Arial Unicode MS" w:cs="Arial Unicode MS"/>
           <w:color w:val="191F1D"/>
           <w:sz w:val="21"/>
         </w:rPr>
@@ -84,7 +84,7 @@
       </w:pPr>
       <w:r>
         <w:rPr>
-          <w:rFonts w:ascii="Calibri" w:hAnsi="Calibri" w:eastAsia="Arial Unicode MS" w:cs="Arial Unicode MS"/>
+          <w:rFonts w:ascii="Arial Unicode MS" w:hAnsi="Arial Unicode MS" w:eastAsia="Arial Unicode MS" w:cs="Arial Unicode MS"/>
           <w:b/>
           <w:color w:val="191F1D"/>
           <w:sz w:val="21"/>
@@ -93,7 +93,7 @@
       </w:r>
       <w:r>
         <w:rPr>
-          <w:rFonts w:ascii="Calibri" w:hAnsi="Calibri" w:eastAsia="Arial Unicode MS" w:cs="Arial Unicode MS"/>
+          <w:rFonts w:ascii="Arial Unicode MS" w:hAnsi="Arial Unicode MS" w:eastAsia="Arial Unicode MS" w:cs="Arial Unicode MS"/>
           <w:color w:val="191F1D"/>
           <w:sz w:val="21"/>
         </w:rPr>
@@ -106,7 +106,7 @@
       </w:pPr>
       <w:r>
         <w:rPr>
-          <w:rFonts w:ascii="Calibri" w:hAnsi="Calibri" w:eastAsia="Arial Unicode MS" w:cs="Arial Unicode MS"/>
+          <w:rFonts w:ascii="Arial Unicode MS" w:hAnsi="Arial Unicode MS" w:eastAsia="Arial Unicode MS" w:cs="Arial Unicode MS"/>
           <w:b/>
           <w:color w:val="191F1D"/>
           <w:sz w:val="21"/>
@@ -115,7 +115,7 @@
       </w:r>
       <w:r>
         <w:rPr>
-          <w:rFonts w:ascii="Calibri" w:hAnsi="Calibri" w:eastAsia="Arial Unicode MS" w:cs="Arial Unicode MS"/>
+          <w:rFonts w:ascii="Arial Unicode MS" w:hAnsi="Arial Unicode MS" w:eastAsia="Arial Unicode MS" w:cs="Arial Unicode MS"/>
           <w:color w:val="191F1D"/>
           <w:sz w:val="21"/>
         </w:rPr>
@@ -128,7 +128,7 @@
       </w:pPr>
       <w:r>
         <w:rPr>
-          <w:rFonts w:ascii="Calibri" w:hAnsi="Calibri" w:eastAsia="Arial Unicode MS" w:cs="Arial Unicode MS"/>
+          <w:rFonts w:ascii="Arial Unicode MS" w:hAnsi="Arial Unicode MS" w:eastAsia="Arial Unicode MS" w:cs="Arial Unicode MS"/>
           <w:b/>
           <w:color w:val="191F1D"/>
           <w:sz w:val="21"/>
@@ -137,7 +137,7 @@
       </w:r>
       <w:r>
         <w:rPr>
-          <w:rFonts w:ascii="Calibri" w:hAnsi="Calibri" w:eastAsia="Arial Unicode MS" w:cs="Arial Unicode MS"/>
+          <w:rFonts w:ascii="Arial Unicode MS" w:hAnsi="Arial Unicode MS" w:eastAsia="Arial Unicode MS" w:cs="Arial Unicode MS"/>
           <w:color w:val="191F1D"/>
           <w:sz w:val="21"/>
         </w:rPr>
@@ -150,7 +150,7 @@
       </w:pPr>
       <w:r>
         <w:rPr>
-          <w:rFonts w:ascii="Calibri" w:hAnsi="Calibri" w:eastAsia="Arial Unicode MS" w:cs="Arial Unicode MS"/>
+          <w:rFonts w:ascii="Arial Unicode MS" w:hAnsi="Arial Unicode MS" w:eastAsia="Arial Unicode MS" w:cs="Arial Unicode MS"/>
           <w:b/>
           <w:color w:val="191F1D"/>
           <w:sz w:val="21"/>
@@ -159,7 +159,7 @@
       </w:r>
       <w:r>
         <w:rPr>
-          <w:rFonts w:ascii="Calibri" w:hAnsi="Calibri" w:eastAsia="Arial Unicode MS" w:cs="Arial Unicode MS"/>
+          <w:rFonts w:ascii="Arial Unicode MS" w:hAnsi="Arial Unicode MS" w:eastAsia="Arial Unicode MS" w:cs="Arial Unicode MS"/>
           <w:color w:val="191F1D"/>
           <w:sz w:val="21"/>
         </w:rPr>
@@ -203,7 +203,7 @@
             <w:r/>
             <w:r>
               <w:rPr>
-                <w:rFonts w:ascii="Calibri" w:hAnsi="Calibri" w:eastAsia="Arial Unicode MS" w:cs="Arial Unicode MS"/>
+                <w:rFonts w:ascii="Arial Unicode MS" w:hAnsi="Arial Unicode MS" w:eastAsia="Arial Unicode MS" w:cs="Arial Unicode MS"/>
                 <w:b/>
                 <w:color w:val="176B4D"/>
                 <w:sz w:val="18"/>
@@ -222,7 +222,7 @@
       </w:pPr>
       <w:r>
         <w:rPr>
-          <w:rFonts w:ascii="Calibri" w:hAnsi="Calibri" w:eastAsia="Arial Unicode MS" w:cs="Arial Unicode MS"/>
+          <w:rFonts w:ascii="Arial Unicode MS" w:hAnsi="Arial Unicode MS" w:eastAsia="Arial Unicode MS" w:cs="Arial Unicode MS"/>
           <w:b/>
           <w:color w:val="2E74B5"/>
           <w:sz w:val="32"/>
@@ -236,7 +236,7 @@
       </w:pPr>
       <w:r>
         <w:rPr>
-          <w:rFonts w:ascii="Calibri" w:hAnsi="Calibri" w:eastAsia="Arial Unicode MS" w:cs="Arial Unicode MS"/>
+          <w:rFonts w:ascii="Arial Unicode MS" w:hAnsi="Arial Unicode MS" w:eastAsia="Arial Unicode MS" w:cs="Arial Unicode MS"/>
           <w:color w:val="191F1D"/>
           <w:sz w:val="22"/>
         </w:rPr>
@@ -280,7 +280,7 @@
             <w:r/>
             <w:r>
               <w:rPr>
-                <w:rFonts w:ascii="Calibri" w:hAnsi="Calibri" w:eastAsia="Arial Unicode MS" w:cs="Arial Unicode MS"/>
+                <w:rFonts w:ascii="Arial Unicode MS" w:hAnsi="Arial Unicode MS" w:eastAsia="Arial Unicode MS" w:cs="Arial Unicode MS"/>
                 <w:b/>
                 <w:color w:val="1F4D78"/>
                 <w:sz w:val="18"/>
@@ -308,7 +308,7 @@
             <w:r/>
             <w:r>
               <w:rPr>
-                <w:rFonts w:ascii="Calibri" w:hAnsi="Calibri" w:eastAsia="Arial Unicode MS" w:cs="Arial Unicode MS"/>
+                <w:rFonts w:ascii="Arial Unicode MS" w:hAnsi="Arial Unicode MS" w:eastAsia="Arial Unicode MS" w:cs="Arial Unicode MS"/>
                 <w:b/>
                 <w:color w:val="1F4D78"/>
                 <w:sz w:val="18"/>
@@ -336,7 +336,7 @@
             <w:r/>
             <w:r>
               <w:rPr>
-                <w:rFonts w:ascii="Calibri" w:hAnsi="Calibri" w:eastAsia="Arial Unicode MS" w:cs="Arial Unicode MS"/>
+                <w:rFonts w:ascii="Arial Unicode MS" w:hAnsi="Arial Unicode MS" w:eastAsia="Arial Unicode MS" w:cs="Arial Unicode MS"/>
                 <w:b/>
                 <w:color w:val="1F4D78"/>
                 <w:sz w:val="18"/>
@@ -368,7 +368,7 @@
             <w:r/>
             <w:r>
               <w:rPr>
-                <w:rFonts w:ascii="Calibri" w:hAnsi="Calibri" w:eastAsia="Arial Unicode MS" w:cs="Arial Unicode MS"/>
+                <w:rFonts w:ascii="Arial Unicode MS" w:hAnsi="Arial Unicode MS" w:eastAsia="Arial Unicode MS" w:cs="Arial Unicode MS"/>
                 <w:b w:val="0"/>
                 <w:sz w:val="18"/>
               </w:rPr>
@@ -394,7 +394,7 @@
             <w:r/>
             <w:r>
               <w:rPr>
-                <w:rFonts w:ascii="Calibri" w:hAnsi="Calibri" w:eastAsia="Arial Unicode MS" w:cs="Arial Unicode MS"/>
+                <w:rFonts w:ascii="Arial Unicode MS" w:hAnsi="Arial Unicode MS" w:eastAsia="Arial Unicode MS" w:cs="Arial Unicode MS"/>
                 <w:b w:val="0"/>
                 <w:sz w:val="18"/>
               </w:rPr>
@@ -420,7 +420,7 @@
             <w:r/>
             <w:r>
               <w:rPr>
-                <w:rFonts w:ascii="Calibri" w:hAnsi="Calibri" w:eastAsia="Arial Unicode MS" w:cs="Arial Unicode MS"/>
+                <w:rFonts w:ascii="Arial Unicode MS" w:hAnsi="Arial Unicode MS" w:eastAsia="Arial Unicode MS" w:cs="Arial Unicode MS"/>
                 <w:b w:val="0"/>
                 <w:sz w:val="18"/>
               </w:rPr>
@@ -451,7 +451,7 @@
             <w:r/>
             <w:r>
               <w:rPr>
-                <w:rFonts w:ascii="Calibri" w:hAnsi="Calibri" w:eastAsia="Arial Unicode MS" w:cs="Arial Unicode MS"/>
+                <w:rFonts w:ascii="Arial Unicode MS" w:hAnsi="Arial Unicode MS" w:eastAsia="Arial Unicode MS" w:cs="Arial Unicode MS"/>
                 <w:b w:val="0"/>
                 <w:sz w:val="18"/>
               </w:rPr>
@@ -477,7 +477,7 @@
             <w:r/>
             <w:r>
               <w:rPr>
-                <w:rFonts w:ascii="Calibri" w:hAnsi="Calibri" w:eastAsia="Arial Unicode MS" w:cs="Arial Unicode MS"/>
+                <w:rFonts w:ascii="Arial Unicode MS" w:hAnsi="Arial Unicode MS" w:eastAsia="Arial Unicode MS" w:cs="Arial Unicode MS"/>
                 <w:b w:val="0"/>
                 <w:sz w:val="18"/>
               </w:rPr>
@@ -503,7 +503,7 @@
             <w:r/>
             <w:r>
               <w:rPr>
-                <w:rFonts w:ascii="Calibri" w:hAnsi="Calibri" w:eastAsia="Arial Unicode MS" w:cs="Arial Unicode MS"/>
+                <w:rFonts w:ascii="Arial Unicode MS" w:hAnsi="Arial Unicode MS" w:eastAsia="Arial Unicode MS" w:cs="Arial Unicode MS"/>
                 <w:b w:val="0"/>
                 <w:sz w:val="18"/>
               </w:rPr>
@@ -534,7 +534,7 @@
             <w:r/>
             <w:r>
               <w:rPr>
-                <w:rFonts w:ascii="Calibri" w:hAnsi="Calibri" w:eastAsia="Arial Unicode MS" w:cs="Arial Unicode MS"/>
+                <w:rFonts w:ascii="Arial Unicode MS" w:hAnsi="Arial Unicode MS" w:eastAsia="Arial Unicode MS" w:cs="Arial Unicode MS"/>
                 <w:b w:val="0"/>
                 <w:sz w:val="18"/>
               </w:rPr>
@@ -560,7 +560,7 @@
             <w:r/>
             <w:r>
               <w:rPr>
-                <w:rFonts w:ascii="Calibri" w:hAnsi="Calibri" w:eastAsia="Arial Unicode MS" w:cs="Arial Unicode MS"/>
+                <w:rFonts w:ascii="Arial Unicode MS" w:hAnsi="Arial Unicode MS" w:eastAsia="Arial Unicode MS" w:cs="Arial Unicode MS"/>
                 <w:b w:val="0"/>
                 <w:sz w:val="18"/>
               </w:rPr>
@@ -586,7 +586,7 @@
             <w:r/>
             <w:r>
               <w:rPr>
-                <w:rFonts w:ascii="Calibri" w:hAnsi="Calibri" w:eastAsia="Arial Unicode MS" w:cs="Arial Unicode MS"/>
+                <w:rFonts w:ascii="Arial Unicode MS" w:hAnsi="Arial Unicode MS" w:eastAsia="Arial Unicode MS" w:cs="Arial Unicode MS"/>
                 <w:b w:val="0"/>
                 <w:sz w:val="18"/>
               </w:rPr>
@@ -617,7 +617,7 @@
             <w:r/>
             <w:r>
               <w:rPr>
-                <w:rFonts w:ascii="Calibri" w:hAnsi="Calibri" w:eastAsia="Arial Unicode MS" w:cs="Arial Unicode MS"/>
+                <w:rFonts w:ascii="Arial Unicode MS" w:hAnsi="Arial Unicode MS" w:eastAsia="Arial Unicode MS" w:cs="Arial Unicode MS"/>
                 <w:b w:val="0"/>
                 <w:sz w:val="18"/>
               </w:rPr>
@@ -643,7 +643,7 @@
             <w:r/>
             <w:r>
               <w:rPr>
-                <w:rFonts w:ascii="Calibri" w:hAnsi="Calibri" w:eastAsia="Arial Unicode MS" w:cs="Arial Unicode MS"/>
+                <w:rFonts w:ascii="Arial Unicode MS" w:hAnsi="Arial Unicode MS" w:eastAsia="Arial Unicode MS" w:cs="Arial Unicode MS"/>
                 <w:b w:val="0"/>
                 <w:sz w:val="18"/>
               </w:rPr>
@@ -669,7 +669,7 @@
             <w:r/>
             <w:r>
               <w:rPr>
-                <w:rFonts w:ascii="Calibri" w:hAnsi="Calibri" w:eastAsia="Arial Unicode MS" w:cs="Arial Unicode MS"/>
+                <w:rFonts w:ascii="Arial Unicode MS" w:hAnsi="Arial Unicode MS" w:eastAsia="Arial Unicode MS" w:cs="Arial Unicode MS"/>
                 <w:b w:val="0"/>
                 <w:sz w:val="18"/>
               </w:rPr>
@@ -731,7 +731,7 @@
       </w:pPr>
       <w:r>
         <w:rPr>
-          <w:rFonts w:ascii="Calibri" w:hAnsi="Calibri" w:eastAsia="Arial Unicode MS" w:cs="Arial Unicode MS"/>
+          <w:rFonts w:ascii="Arial Unicode MS" w:hAnsi="Arial Unicode MS" w:eastAsia="Arial Unicode MS" w:cs="Arial Unicode MS"/>
           <w:color w:val="5B6560"/>
           <w:sz w:val="17"/>
         </w:rPr>
@@ -745,7 +745,7 @@
       </w:pPr>
       <w:r>
         <w:rPr>
-          <w:rFonts w:ascii="Calibri" w:hAnsi="Calibri" w:eastAsia="Arial Unicode MS" w:cs="Arial Unicode MS"/>
+          <w:rFonts w:ascii="Arial Unicode MS" w:hAnsi="Arial Unicode MS" w:eastAsia="Arial Unicode MS" w:cs="Arial Unicode MS"/>
           <w:b/>
           <w:color w:val="2E74B5"/>
           <w:sz w:val="32"/>
@@ -759,7 +759,7 @@
       </w:pPr>
       <w:r>
         <w:rPr>
-          <w:rFonts w:ascii="Calibri" w:hAnsi="Calibri" w:eastAsia="Arial Unicode MS" w:cs="Arial Unicode MS"/>
+          <w:rFonts w:ascii="Arial Unicode MS" w:hAnsi="Arial Unicode MS" w:eastAsia="Arial Unicode MS" w:cs="Arial Unicode MS"/>
           <w:color w:val="191F1D"/>
           <w:sz w:val="22"/>
         </w:rPr>
@@ -772,7 +772,7 @@
       </w:pPr>
       <w:r>
         <w:rPr>
-          <w:rFonts w:ascii="Calibri" w:hAnsi="Calibri" w:eastAsia="Arial Unicode MS" w:cs="Arial Unicode MS"/>
+          <w:rFonts w:ascii="Arial Unicode MS" w:hAnsi="Arial Unicode MS" w:eastAsia="Arial Unicode MS" w:cs="Arial Unicode MS"/>
           <w:color w:val="191F1D"/>
           <w:sz w:val="22"/>
         </w:rPr>
@@ -786,7 +786,7 @@
       </w:pPr>
       <w:r>
         <w:rPr>
-          <w:rFonts w:ascii="Calibri" w:hAnsi="Calibri" w:eastAsia="Arial Unicode MS" w:cs="Arial Unicode MS"/>
+          <w:rFonts w:ascii="Arial Unicode MS" w:hAnsi="Arial Unicode MS" w:eastAsia="Arial Unicode MS" w:cs="Arial Unicode MS"/>
           <w:b/>
           <w:color w:val="176B4D"/>
           <w:sz w:val="21"/>
@@ -795,7 +795,7 @@
       </w:r>
       <w:r>
         <w:rPr>
-          <w:rFonts w:ascii="Calibri" w:hAnsi="Calibri" w:eastAsia="Arial Unicode MS" w:cs="Arial Unicode MS"/>
+          <w:rFonts w:ascii="Arial Unicode MS" w:hAnsi="Arial Unicode MS" w:eastAsia="Arial Unicode MS" w:cs="Arial Unicode MS"/>
           <w:color w:val="191F1D"/>
           <w:sz w:val="21"/>
         </w:rPr>
@@ -809,7 +809,7 @@
       </w:pPr>
       <w:r>
         <w:rPr>
-          <w:rFonts w:ascii="Calibri" w:hAnsi="Calibri" w:eastAsia="Arial Unicode MS" w:cs="Arial Unicode MS"/>
+          <w:rFonts w:ascii="Arial Unicode MS" w:hAnsi="Arial Unicode MS" w:eastAsia="Arial Unicode MS" w:cs="Arial Unicode MS"/>
           <w:b/>
           <w:color w:val="176B4D"/>
           <w:sz w:val="21"/>
@@ -818,7 +818,7 @@
       </w:r>
       <w:r>
         <w:rPr>
-          <w:rFonts w:ascii="Calibri" w:hAnsi="Calibri" w:eastAsia="Arial Unicode MS" w:cs="Arial Unicode MS"/>
+          <w:rFonts w:ascii="Arial Unicode MS" w:hAnsi="Arial Unicode MS" w:eastAsia="Arial Unicode MS" w:cs="Arial Unicode MS"/>
           <w:color w:val="191F1D"/>
           <w:sz w:val="21"/>
         </w:rPr>
@@ -832,7 +832,7 @@
       </w:pPr>
       <w:r>
         <w:rPr>
-          <w:rFonts w:ascii="Calibri" w:hAnsi="Calibri" w:eastAsia="Arial Unicode MS" w:cs="Arial Unicode MS"/>
+          <w:rFonts w:ascii="Arial Unicode MS" w:hAnsi="Arial Unicode MS" w:eastAsia="Arial Unicode MS" w:cs="Arial Unicode MS"/>
           <w:b/>
           <w:color w:val="176B4D"/>
           <w:sz w:val="21"/>
@@ -841,7 +841,7 @@
       </w:r>
       <w:r>
         <w:rPr>
-          <w:rFonts w:ascii="Calibri" w:hAnsi="Calibri" w:eastAsia="Arial Unicode MS" w:cs="Arial Unicode MS"/>
+          <w:rFonts w:ascii="Arial Unicode MS" w:hAnsi="Arial Unicode MS" w:eastAsia="Arial Unicode MS" w:cs="Arial Unicode MS"/>
           <w:color w:val="191F1D"/>
           <w:sz w:val="21"/>
         </w:rPr>
@@ -855,7 +855,7 @@
       </w:pPr>
       <w:r>
         <w:rPr>
-          <w:rFonts w:ascii="Calibri" w:hAnsi="Calibri" w:eastAsia="Arial Unicode MS" w:cs="Arial Unicode MS"/>
+          <w:rFonts w:ascii="Arial Unicode MS" w:hAnsi="Arial Unicode MS" w:eastAsia="Arial Unicode MS" w:cs="Arial Unicode MS"/>
           <w:b/>
           <w:color w:val="176B4D"/>
           <w:sz w:val="21"/>
@@ -864,7 +864,7 @@
       </w:r>
       <w:r>
         <w:rPr>
-          <w:rFonts w:ascii="Calibri" w:hAnsi="Calibri" w:eastAsia="Arial Unicode MS" w:cs="Arial Unicode MS"/>
+          <w:rFonts w:ascii="Arial Unicode MS" w:hAnsi="Arial Unicode MS" w:eastAsia="Arial Unicode MS" w:cs="Arial Unicode MS"/>
           <w:color w:val="191F1D"/>
           <w:sz w:val="21"/>
         </w:rPr>
@@ -878,7 +878,7 @@
       </w:pPr>
       <w:r>
         <w:rPr>
-          <w:rFonts w:ascii="Calibri" w:hAnsi="Calibri" w:eastAsia="Arial Unicode MS" w:cs="Arial Unicode MS"/>
+          <w:rFonts w:ascii="Arial Unicode MS" w:hAnsi="Arial Unicode MS" w:eastAsia="Arial Unicode MS" w:cs="Arial Unicode MS"/>
           <w:b/>
           <w:color w:val="2E74B5"/>
           <w:sz w:val="32"/>
@@ -923,7 +923,7 @@
             <w:r/>
             <w:r>
               <w:rPr>
-                <w:rFonts w:ascii="Calibri" w:hAnsi="Calibri" w:eastAsia="Arial Unicode MS" w:cs="Arial Unicode MS"/>
+                <w:rFonts w:ascii="Arial Unicode MS" w:hAnsi="Arial Unicode MS" w:eastAsia="Arial Unicode MS" w:cs="Arial Unicode MS"/>
                 <w:b/>
                 <w:color w:val="1F4D78"/>
                 <w:sz w:val="18"/>
@@ -951,7 +951,7 @@
             <w:r/>
             <w:r>
               <w:rPr>
-                <w:rFonts w:ascii="Calibri" w:hAnsi="Calibri" w:eastAsia="Arial Unicode MS" w:cs="Arial Unicode MS"/>
+                <w:rFonts w:ascii="Arial Unicode MS" w:hAnsi="Arial Unicode MS" w:eastAsia="Arial Unicode MS" w:cs="Arial Unicode MS"/>
                 <w:b/>
                 <w:color w:val="1F4D78"/>
                 <w:sz w:val="18"/>
@@ -979,7 +979,7 @@
             <w:r/>
             <w:r>
               <w:rPr>
-                <w:rFonts w:ascii="Calibri" w:hAnsi="Calibri" w:eastAsia="Arial Unicode MS" w:cs="Arial Unicode MS"/>
+                <w:rFonts w:ascii="Arial Unicode MS" w:hAnsi="Arial Unicode MS" w:eastAsia="Arial Unicode MS" w:cs="Arial Unicode MS"/>
                 <w:b/>
                 <w:color w:val="1F4D78"/>
                 <w:sz w:val="18"/>
@@ -1011,7 +1011,7 @@
             <w:r/>
             <w:r>
               <w:rPr>
-                <w:rFonts w:ascii="Calibri" w:hAnsi="Calibri" w:eastAsia="Arial Unicode MS" w:cs="Arial Unicode MS"/>
+                <w:rFonts w:ascii="Arial Unicode MS" w:hAnsi="Arial Unicode MS" w:eastAsia="Arial Unicode MS" w:cs="Arial Unicode MS"/>
                 <w:b w:val="0"/>
                 <w:sz w:val="18"/>
               </w:rPr>
@@ -1037,7 +1037,7 @@
             <w:r/>
             <w:r>
               <w:rPr>
-                <w:rFonts w:ascii="Calibri" w:hAnsi="Calibri" w:eastAsia="Arial Unicode MS" w:cs="Arial Unicode MS"/>
+                <w:rFonts w:ascii="Arial Unicode MS" w:hAnsi="Arial Unicode MS" w:eastAsia="Arial Unicode MS" w:cs="Arial Unicode MS"/>
                 <w:b w:val="0"/>
                 <w:sz w:val="18"/>
               </w:rPr>
@@ -1063,7 +1063,7 @@
             <w:r/>
             <w:r>
               <w:rPr>
-                <w:rFonts w:ascii="Calibri" w:hAnsi="Calibri" w:eastAsia="Arial Unicode MS" w:cs="Arial Unicode MS"/>
+                <w:rFonts w:ascii="Arial Unicode MS" w:hAnsi="Arial Unicode MS" w:eastAsia="Arial Unicode MS" w:cs="Arial Unicode MS"/>
                 <w:b w:val="0"/>
                 <w:sz w:val="18"/>
               </w:rPr>
@@ -1094,7 +1094,7 @@
             <w:r/>
             <w:r>
               <w:rPr>
-                <w:rFonts w:ascii="Calibri" w:hAnsi="Calibri" w:eastAsia="Arial Unicode MS" w:cs="Arial Unicode MS"/>
+                <w:rFonts w:ascii="Arial Unicode MS" w:hAnsi="Arial Unicode MS" w:eastAsia="Arial Unicode MS" w:cs="Arial Unicode MS"/>
                 <w:b w:val="0"/>
                 <w:sz w:val="18"/>
               </w:rPr>
@@ -1120,7 +1120,7 @@
             <w:r/>
             <w:r>
               <w:rPr>
-                <w:rFonts w:ascii="Calibri" w:hAnsi="Calibri" w:eastAsia="Arial Unicode MS" w:cs="Arial Unicode MS"/>
+                <w:rFonts w:ascii="Arial Unicode MS" w:hAnsi="Arial Unicode MS" w:eastAsia="Arial Unicode MS" w:cs="Arial Unicode MS"/>
                 <w:b w:val="0"/>
                 <w:sz w:val="18"/>
               </w:rPr>
@@ -1146,7 +1146,7 @@
             <w:r/>
             <w:r>
               <w:rPr>
-                <w:rFonts w:ascii="Calibri" w:hAnsi="Calibri" w:eastAsia="Arial Unicode MS" w:cs="Arial Unicode MS"/>
+                <w:rFonts w:ascii="Arial Unicode MS" w:hAnsi="Arial Unicode MS" w:eastAsia="Arial Unicode MS" w:cs="Arial Unicode MS"/>
                 <w:b w:val="0"/>
                 <w:sz w:val="18"/>
               </w:rPr>
@@ -1177,7 +1177,7 @@
             <w:r/>
             <w:r>
               <w:rPr>
-                <w:rFonts w:ascii="Calibri" w:hAnsi="Calibri" w:eastAsia="Arial Unicode MS" w:cs="Arial Unicode MS"/>
+                <w:rFonts w:ascii="Arial Unicode MS" w:hAnsi="Arial Unicode MS" w:eastAsia="Arial Unicode MS" w:cs="Arial Unicode MS"/>
                 <w:b w:val="0"/>
                 <w:sz w:val="18"/>
               </w:rPr>
@@ -1203,7 +1203,7 @@
             <w:r/>
             <w:r>
               <w:rPr>
-                <w:rFonts w:ascii="Calibri" w:hAnsi="Calibri" w:eastAsia="Arial Unicode MS" w:cs="Arial Unicode MS"/>
+                <w:rFonts w:ascii="Arial Unicode MS" w:hAnsi="Arial Unicode MS" w:eastAsia="Arial Unicode MS" w:cs="Arial Unicode MS"/>
                 <w:b w:val="0"/>
                 <w:sz w:val="18"/>
               </w:rPr>
@@ -1229,7 +1229,7 @@
             <w:r/>
             <w:r>
               <w:rPr>
-                <w:rFonts w:ascii="Calibri" w:hAnsi="Calibri" w:eastAsia="Arial Unicode MS" w:cs="Arial Unicode MS"/>
+                <w:rFonts w:ascii="Arial Unicode MS" w:hAnsi="Arial Unicode MS" w:eastAsia="Arial Unicode MS" w:cs="Arial Unicode MS"/>
                 <w:b w:val="0"/>
                 <w:sz w:val="18"/>
               </w:rPr>
@@ -1260,7 +1260,7 @@
             <w:r/>
             <w:r>
               <w:rPr>
-                <w:rFonts w:ascii="Calibri" w:hAnsi="Calibri" w:eastAsia="Arial Unicode MS" w:cs="Arial Unicode MS"/>
+                <w:rFonts w:ascii="Arial Unicode MS" w:hAnsi="Arial Unicode MS" w:eastAsia="Arial Unicode MS" w:cs="Arial Unicode MS"/>
                 <w:b w:val="0"/>
                 <w:sz w:val="18"/>
               </w:rPr>
@@ -1286,7 +1286,7 @@
             <w:r/>
             <w:r>
               <w:rPr>
-                <w:rFonts w:ascii="Calibri" w:hAnsi="Calibri" w:eastAsia="Arial Unicode MS" w:cs="Arial Unicode MS"/>
+                <w:rFonts w:ascii="Arial Unicode MS" w:hAnsi="Arial Unicode MS" w:eastAsia="Arial Unicode MS" w:cs="Arial Unicode MS"/>
                 <w:b w:val="0"/>
                 <w:sz w:val="18"/>
               </w:rPr>
@@ -1312,7 +1312,7 @@
             <w:r/>
             <w:r>
               <w:rPr>
-                <w:rFonts w:ascii="Calibri" w:hAnsi="Calibri" w:eastAsia="Arial Unicode MS" w:cs="Arial Unicode MS"/>
+                <w:rFonts w:ascii="Arial Unicode MS" w:hAnsi="Arial Unicode MS" w:eastAsia="Arial Unicode MS" w:cs="Arial Unicode MS"/>
                 <w:b w:val="0"/>
                 <w:sz w:val="18"/>
               </w:rPr>
@@ -1343,7 +1343,7 @@
             <w:r/>
             <w:r>
               <w:rPr>
-                <w:rFonts w:ascii="Calibri" w:hAnsi="Calibri" w:eastAsia="Arial Unicode MS" w:cs="Arial Unicode MS"/>
+                <w:rFonts w:ascii="Arial Unicode MS" w:hAnsi="Arial Unicode MS" w:eastAsia="Arial Unicode MS" w:cs="Arial Unicode MS"/>
                 <w:b w:val="0"/>
                 <w:sz w:val="18"/>
               </w:rPr>
@@ -1369,7 +1369,7 @@
             <w:r/>
             <w:r>
               <w:rPr>
-                <w:rFonts w:ascii="Calibri" w:hAnsi="Calibri" w:eastAsia="Arial Unicode MS" w:cs="Arial Unicode MS"/>
+                <w:rFonts w:ascii="Arial Unicode MS" w:hAnsi="Arial Unicode MS" w:eastAsia="Arial Unicode MS" w:cs="Arial Unicode MS"/>
                 <w:b w:val="0"/>
                 <w:sz w:val="18"/>
               </w:rPr>
@@ -1395,7 +1395,7 @@
             <w:r/>
             <w:r>
               <w:rPr>
-                <w:rFonts w:ascii="Calibri" w:hAnsi="Calibri" w:eastAsia="Arial Unicode MS" w:cs="Arial Unicode MS"/>
+                <w:rFonts w:ascii="Arial Unicode MS" w:hAnsi="Arial Unicode MS" w:eastAsia="Arial Unicode MS" w:cs="Arial Unicode MS"/>
                 <w:b w:val="0"/>
                 <w:sz w:val="18"/>
               </w:rPr>
@@ -1417,7 +1417,7 @@
       </w:pPr>
       <w:r>
         <w:rPr>
-          <w:rFonts w:ascii="Calibri" w:hAnsi="Calibri" w:eastAsia="Arial Unicode MS" w:cs="Arial Unicode MS"/>
+          <w:rFonts w:ascii="Arial Unicode MS" w:hAnsi="Arial Unicode MS" w:eastAsia="Arial Unicode MS" w:cs="Arial Unicode MS"/>
           <w:b/>
           <w:color w:val="2E74B5"/>
           <w:sz w:val="32"/>
@@ -1431,7 +1431,7 @@
       </w:pPr>
       <w:r>
         <w:rPr>
-          <w:rFonts w:ascii="Calibri" w:hAnsi="Calibri" w:eastAsia="Arial Unicode MS" w:cs="Arial Unicode MS"/>
+          <w:rFonts w:ascii="Arial Unicode MS" w:hAnsi="Arial Unicode MS" w:eastAsia="Arial Unicode MS" w:cs="Arial Unicode MS"/>
           <w:color w:val="191F1D"/>
           <w:sz w:val="22"/>
         </w:rPr>
@@ -1475,7 +1475,7 @@
             <w:r/>
             <w:r>
               <w:rPr>
-                <w:rFonts w:ascii="Calibri" w:hAnsi="Calibri" w:eastAsia="Arial Unicode MS" w:cs="Arial Unicode MS"/>
+                <w:rFonts w:ascii="Arial Unicode MS" w:hAnsi="Arial Unicode MS" w:eastAsia="Arial Unicode MS" w:cs="Arial Unicode MS"/>
                 <w:b/>
                 <w:color w:val="1F4D78"/>
                 <w:sz w:val="18"/>
@@ -1503,7 +1503,7 @@
             <w:r/>
             <w:r>
               <w:rPr>
-                <w:rFonts w:ascii="Calibri" w:hAnsi="Calibri" w:eastAsia="Arial Unicode MS" w:cs="Arial Unicode MS"/>
+                <w:rFonts w:ascii="Arial Unicode MS" w:hAnsi="Arial Unicode MS" w:eastAsia="Arial Unicode MS" w:cs="Arial Unicode MS"/>
                 <w:b/>
                 <w:color w:val="1F4D78"/>
                 <w:sz w:val="18"/>
@@ -1531,7 +1531,7 @@
             <w:r/>
             <w:r>
               <w:rPr>
-                <w:rFonts w:ascii="Calibri" w:hAnsi="Calibri" w:eastAsia="Arial Unicode MS" w:cs="Arial Unicode MS"/>
+                <w:rFonts w:ascii="Arial Unicode MS" w:hAnsi="Arial Unicode MS" w:eastAsia="Arial Unicode MS" w:cs="Arial Unicode MS"/>
                 <w:b/>
                 <w:color w:val="1F4D78"/>
                 <w:sz w:val="18"/>
@@ -1563,7 +1563,7 @@
             <w:r/>
             <w:r>
               <w:rPr>
-                <w:rFonts w:ascii="Calibri" w:hAnsi="Calibri" w:eastAsia="Arial Unicode MS" w:cs="Arial Unicode MS"/>
+                <w:rFonts w:ascii="Arial Unicode MS" w:hAnsi="Arial Unicode MS" w:eastAsia="Arial Unicode MS" w:cs="Arial Unicode MS"/>
                 <w:b w:val="0"/>
                 <w:sz w:val="18"/>
               </w:rPr>
@@ -1589,7 +1589,7 @@
             <w:r/>
             <w:r>
               <w:rPr>
-                <w:rFonts w:ascii="Calibri" w:hAnsi="Calibri" w:eastAsia="Arial Unicode MS" w:cs="Arial Unicode MS"/>
+                <w:rFonts w:ascii="Arial Unicode MS" w:hAnsi="Arial Unicode MS" w:eastAsia="Arial Unicode MS" w:cs="Arial Unicode MS"/>
                 <w:b w:val="0"/>
                 <w:sz w:val="18"/>
               </w:rPr>
@@ -1615,7 +1615,7 @@
             <w:r/>
             <w:r>
               <w:rPr>
-                <w:rFonts w:ascii="Calibri" w:hAnsi="Calibri" w:eastAsia="Arial Unicode MS" w:cs="Arial Unicode MS"/>
+                <w:rFonts w:ascii="Arial Unicode MS" w:hAnsi="Arial Unicode MS" w:eastAsia="Arial Unicode MS" w:cs="Arial Unicode MS"/>
                 <w:b w:val="0"/>
                 <w:sz w:val="18"/>
               </w:rPr>
@@ -1646,7 +1646,7 @@
             <w:r/>
             <w:r>
               <w:rPr>
-                <w:rFonts w:ascii="Calibri" w:hAnsi="Calibri" w:eastAsia="Arial Unicode MS" w:cs="Arial Unicode MS"/>
+                <w:rFonts w:ascii="Arial Unicode MS" w:hAnsi="Arial Unicode MS" w:eastAsia="Arial Unicode MS" w:cs="Arial Unicode MS"/>
                 <w:b w:val="0"/>
                 <w:sz w:val="18"/>
               </w:rPr>
@@ -1672,7 +1672,7 @@
             <w:r/>
             <w:r>
               <w:rPr>
-                <w:rFonts w:ascii="Calibri" w:hAnsi="Calibri" w:eastAsia="Arial Unicode MS" w:cs="Arial Unicode MS"/>
+                <w:rFonts w:ascii="Arial Unicode MS" w:hAnsi="Arial Unicode MS" w:eastAsia="Arial Unicode MS" w:cs="Arial Unicode MS"/>
                 <w:b w:val="0"/>
                 <w:sz w:val="18"/>
               </w:rPr>
@@ -1698,7 +1698,7 @@
             <w:r/>
             <w:r>
               <w:rPr>
-                <w:rFonts w:ascii="Calibri" w:hAnsi="Calibri" w:eastAsia="Arial Unicode MS" w:cs="Arial Unicode MS"/>
+                <w:rFonts w:ascii="Arial Unicode MS" w:hAnsi="Arial Unicode MS" w:eastAsia="Arial Unicode MS" w:cs="Arial Unicode MS"/>
                 <w:b w:val="0"/>
                 <w:sz w:val="18"/>
               </w:rPr>
@@ -1729,7 +1729,7 @@
             <w:r/>
             <w:r>
               <w:rPr>
-                <w:rFonts w:ascii="Calibri" w:hAnsi="Calibri" w:eastAsia="Arial Unicode MS" w:cs="Arial Unicode MS"/>
+                <w:rFonts w:ascii="Arial Unicode MS" w:hAnsi="Arial Unicode MS" w:eastAsia="Arial Unicode MS" w:cs="Arial Unicode MS"/>
                 <w:b w:val="0"/>
                 <w:sz w:val="18"/>
               </w:rPr>
@@ -1755,7 +1755,7 @@
             <w:r/>
             <w:r>
               <w:rPr>
-                <w:rFonts w:ascii="Calibri" w:hAnsi="Calibri" w:eastAsia="Arial Unicode MS" w:cs="Arial Unicode MS"/>
+                <w:rFonts w:ascii="Arial Unicode MS" w:hAnsi="Arial Unicode MS" w:eastAsia="Arial Unicode MS" w:cs="Arial Unicode MS"/>
                 <w:b w:val="0"/>
                 <w:sz w:val="18"/>
               </w:rPr>
@@ -1781,7 +1781,7 @@
             <w:r/>
             <w:r>
               <w:rPr>
-                <w:rFonts w:ascii="Calibri" w:hAnsi="Calibri" w:eastAsia="Arial Unicode MS" w:cs="Arial Unicode MS"/>
+                <w:rFonts w:ascii="Arial Unicode MS" w:hAnsi="Arial Unicode MS" w:eastAsia="Arial Unicode MS" w:cs="Arial Unicode MS"/>
                 <w:b w:val="0"/>
                 <w:sz w:val="18"/>
               </w:rPr>
@@ -1812,7 +1812,7 @@
             <w:r/>
             <w:r>
               <w:rPr>
-                <w:rFonts w:ascii="Calibri" w:hAnsi="Calibri" w:eastAsia="Arial Unicode MS" w:cs="Arial Unicode MS"/>
+                <w:rFonts w:ascii="Arial Unicode MS" w:hAnsi="Arial Unicode MS" w:eastAsia="Arial Unicode MS" w:cs="Arial Unicode MS"/>
                 <w:b w:val="0"/>
                 <w:sz w:val="18"/>
               </w:rPr>
@@ -1838,7 +1838,7 @@
             <w:r/>
             <w:r>
               <w:rPr>
-                <w:rFonts w:ascii="Calibri" w:hAnsi="Calibri" w:eastAsia="Arial Unicode MS" w:cs="Arial Unicode MS"/>
+                <w:rFonts w:ascii="Arial Unicode MS" w:hAnsi="Arial Unicode MS" w:eastAsia="Arial Unicode MS" w:cs="Arial Unicode MS"/>
                 <w:b w:val="0"/>
                 <w:sz w:val="18"/>
               </w:rPr>
@@ -1864,7 +1864,7 @@
             <w:r/>
             <w:r>
               <w:rPr>
-                <w:rFonts w:ascii="Calibri" w:hAnsi="Calibri" w:eastAsia="Arial Unicode MS" w:cs="Arial Unicode MS"/>
+                <w:rFonts w:ascii="Arial Unicode MS" w:hAnsi="Arial Unicode MS" w:eastAsia="Arial Unicode MS" w:cs="Arial Unicode MS"/>
                 <w:b w:val="0"/>
                 <w:sz w:val="18"/>
               </w:rPr>
@@ -1895,7 +1895,7 @@
             <w:r/>
             <w:r>
               <w:rPr>
-                <w:rFonts w:ascii="Calibri" w:hAnsi="Calibri" w:eastAsia="Arial Unicode MS" w:cs="Arial Unicode MS"/>
+                <w:rFonts w:ascii="Arial Unicode MS" w:hAnsi="Arial Unicode MS" w:eastAsia="Arial Unicode MS" w:cs="Arial Unicode MS"/>
                 <w:b w:val="0"/>
                 <w:sz w:val="18"/>
               </w:rPr>
@@ -1921,7 +1921,7 @@
             <w:r/>
             <w:r>
               <w:rPr>
-                <w:rFonts w:ascii="Calibri" w:hAnsi="Calibri" w:eastAsia="Arial Unicode MS" w:cs="Arial Unicode MS"/>
+                <w:rFonts w:ascii="Arial Unicode MS" w:hAnsi="Arial Unicode MS" w:eastAsia="Arial Unicode MS" w:cs="Arial Unicode MS"/>
                 <w:b w:val="0"/>
                 <w:sz w:val="18"/>
               </w:rPr>
@@ -1947,7 +1947,7 @@
             <w:r/>
             <w:r>
               <w:rPr>
-                <w:rFonts w:ascii="Calibri" w:hAnsi="Calibri" w:eastAsia="Arial Unicode MS" w:cs="Arial Unicode MS"/>
+                <w:rFonts w:ascii="Arial Unicode MS" w:hAnsi="Arial Unicode MS" w:eastAsia="Arial Unicode MS" w:cs="Arial Unicode MS"/>
                 <w:b w:val="0"/>
                 <w:sz w:val="18"/>
               </w:rPr>
@@ -1978,7 +1978,7 @@
             <w:r/>
             <w:r>
               <w:rPr>
-                <w:rFonts w:ascii="Calibri" w:hAnsi="Calibri" w:eastAsia="Arial Unicode MS" w:cs="Arial Unicode MS"/>
+                <w:rFonts w:ascii="Arial Unicode MS" w:hAnsi="Arial Unicode MS" w:eastAsia="Arial Unicode MS" w:cs="Arial Unicode MS"/>
                 <w:b w:val="0"/>
                 <w:sz w:val="18"/>
               </w:rPr>
@@ -2004,7 +2004,7 @@
             <w:r/>
             <w:r>
               <w:rPr>
-                <w:rFonts w:ascii="Calibri" w:hAnsi="Calibri" w:eastAsia="Arial Unicode MS" w:cs="Arial Unicode MS"/>
+                <w:rFonts w:ascii="Arial Unicode MS" w:hAnsi="Arial Unicode MS" w:eastAsia="Arial Unicode MS" w:cs="Arial Unicode MS"/>
                 <w:b w:val="0"/>
                 <w:sz w:val="18"/>
               </w:rPr>
@@ -2030,7 +2030,7 @@
             <w:r/>
             <w:r>
               <w:rPr>
-                <w:rFonts w:ascii="Calibri" w:hAnsi="Calibri" w:eastAsia="Arial Unicode MS" w:cs="Arial Unicode MS"/>
+                <w:rFonts w:ascii="Arial Unicode MS" w:hAnsi="Arial Unicode MS" w:eastAsia="Arial Unicode MS" w:cs="Arial Unicode MS"/>
                 <w:b w:val="0"/>
                 <w:sz w:val="18"/>
               </w:rPr>
@@ -2051,7 +2051,7 @@
       </w:pPr>
       <w:r>
         <w:rPr>
-          <w:rFonts w:ascii="Calibri" w:hAnsi="Calibri" w:eastAsia="Arial Unicode MS" w:cs="Arial Unicode MS"/>
+          <w:rFonts w:ascii="Arial Unicode MS" w:hAnsi="Arial Unicode MS" w:eastAsia="Arial Unicode MS" w:cs="Arial Unicode MS"/>
           <w:color w:val="191F1D"/>
           <w:sz w:val="22"/>
         </w:rPr>
@@ -2065,7 +2065,7 @@
       </w:pPr>
       <w:r>
         <w:rPr>
-          <w:rFonts w:ascii="Calibri" w:hAnsi="Calibri" w:eastAsia="Arial Unicode MS" w:cs="Arial Unicode MS"/>
+          <w:rFonts w:ascii="Arial Unicode MS" w:hAnsi="Arial Unicode MS" w:eastAsia="Arial Unicode MS" w:cs="Arial Unicode MS"/>
           <w:b/>
           <w:color w:val="2E74B5"/>
           <w:sz w:val="32"/>
@@ -2110,7 +2110,7 @@
             <w:r/>
             <w:r>
               <w:rPr>
-                <w:rFonts w:ascii="Calibri" w:hAnsi="Calibri" w:eastAsia="Arial Unicode MS" w:cs="Arial Unicode MS"/>
+                <w:rFonts w:ascii="Arial Unicode MS" w:hAnsi="Arial Unicode MS" w:eastAsia="Arial Unicode MS" w:cs="Arial Unicode MS"/>
                 <w:b/>
                 <w:color w:val="1F4D78"/>
                 <w:sz w:val="18"/>
@@ -2138,7 +2138,7 @@
             <w:r/>
             <w:r>
               <w:rPr>
-                <w:rFonts w:ascii="Calibri" w:hAnsi="Calibri" w:eastAsia="Arial Unicode MS" w:cs="Arial Unicode MS"/>
+                <w:rFonts w:ascii="Arial Unicode MS" w:hAnsi="Arial Unicode MS" w:eastAsia="Arial Unicode MS" w:cs="Arial Unicode MS"/>
                 <w:b/>
                 <w:color w:val="1F4D78"/>
                 <w:sz w:val="18"/>
@@ -2166,7 +2166,7 @@
             <w:r/>
             <w:r>
               <w:rPr>
-                <w:rFonts w:ascii="Calibri" w:hAnsi="Calibri" w:eastAsia="Arial Unicode MS" w:cs="Arial Unicode MS"/>
+                <w:rFonts w:ascii="Arial Unicode MS" w:hAnsi="Arial Unicode MS" w:eastAsia="Arial Unicode MS" w:cs="Arial Unicode MS"/>
                 <w:b/>
                 <w:color w:val="1F4D78"/>
                 <w:sz w:val="18"/>
@@ -2198,7 +2198,7 @@
             <w:r/>
             <w:r>
               <w:rPr>
-                <w:rFonts w:ascii="Calibri" w:hAnsi="Calibri" w:eastAsia="Arial Unicode MS" w:cs="Arial Unicode MS"/>
+                <w:rFonts w:ascii="Arial Unicode MS" w:hAnsi="Arial Unicode MS" w:eastAsia="Arial Unicode MS" w:cs="Arial Unicode MS"/>
                 <w:b w:val="0"/>
                 <w:sz w:val="18"/>
               </w:rPr>
@@ -2224,11 +2224,11 @@
             <w:r/>
             <w:r>
               <w:rPr>
-                <w:rFonts w:ascii="Calibri" w:hAnsi="Calibri" w:eastAsia="Arial Unicode MS" w:cs="Arial Unicode MS"/>
+                <w:rFonts w:ascii="Arial Unicode MS" w:hAnsi="Arial Unicode MS" w:eastAsia="Arial Unicode MS" w:cs="Arial Unicode MS"/>
                 <w:b w:val="0"/>
                 <w:sz w:val="18"/>
               </w:rPr>
-              <w:t>new / validated / blocked / assessing</w:t>
+              <w:t>新增 / 已校验 / 阻断 / 评估中</w:t>
             </w:r>
           </w:p>
         </w:tc>
@@ -2250,7 +2250,7 @@
             <w:r/>
             <w:r>
               <w:rPr>
-                <w:rFonts w:ascii="Calibri" w:hAnsi="Calibri" w:eastAsia="Arial Unicode MS" w:cs="Arial Unicode MS"/>
+                <w:rFonts w:ascii="Arial Unicode MS" w:hAnsi="Arial Unicode MS" w:eastAsia="Arial Unicode MS" w:cs="Arial Unicode MS"/>
                 <w:b w:val="0"/>
                 <w:sz w:val="18"/>
               </w:rPr>
@@ -2281,7 +2281,7 @@
             <w:r/>
             <w:r>
               <w:rPr>
-                <w:rFonts w:ascii="Calibri" w:hAnsi="Calibri" w:eastAsia="Arial Unicode MS" w:cs="Arial Unicode MS"/>
+                <w:rFonts w:ascii="Arial Unicode MS" w:hAnsi="Arial Unicode MS" w:eastAsia="Arial Unicode MS" w:cs="Arial Unicode MS"/>
                 <w:b w:val="0"/>
                 <w:sz w:val="18"/>
               </w:rPr>
@@ -2307,11 +2307,11 @@
             <w:r/>
             <w:r>
               <w:rPr>
-                <w:rFonts w:ascii="Calibri" w:hAnsi="Calibri" w:eastAsia="Arial Unicode MS" w:cs="Arial Unicode MS"/>
+                <w:rFonts w:ascii="Arial Unicode MS" w:hAnsi="Arial Unicode MS" w:eastAsia="Arial Unicode MS" w:cs="Arial Unicode MS"/>
                 <w:b w:val="0"/>
                 <w:sz w:val="18"/>
               </w:rPr>
-              <w:t>versioned / locked / stale</w:t>
+              <w:t>版本化 / 已锁定 / 过期</w:t>
             </w:r>
           </w:p>
         </w:tc>
@@ -2333,7 +2333,7 @@
             <w:r/>
             <w:r>
               <w:rPr>
-                <w:rFonts w:ascii="Calibri" w:hAnsi="Calibri" w:eastAsia="Arial Unicode MS" w:cs="Arial Unicode MS"/>
+                <w:rFonts w:ascii="Arial Unicode MS" w:hAnsi="Arial Unicode MS" w:eastAsia="Arial Unicode MS" w:cs="Arial Unicode MS"/>
                 <w:b w:val="0"/>
                 <w:sz w:val="18"/>
               </w:rPr>
@@ -2364,7 +2364,7 @@
             <w:r/>
             <w:r>
               <w:rPr>
-                <w:rFonts w:ascii="Calibri" w:hAnsi="Calibri" w:eastAsia="Arial Unicode MS" w:cs="Arial Unicode MS"/>
+                <w:rFonts w:ascii="Arial Unicode MS" w:hAnsi="Arial Unicode MS" w:eastAsia="Arial Unicode MS" w:cs="Arial Unicode MS"/>
                 <w:b w:val="0"/>
                 <w:sz w:val="18"/>
               </w:rPr>
@@ -2390,11 +2390,11 @@
             <w:r/>
             <w:r>
               <w:rPr>
-                <w:rFonts w:ascii="Calibri" w:hAnsi="Calibri" w:eastAsia="Arial Unicode MS" w:cs="Arial Unicode MS"/>
+                <w:rFonts w:ascii="Arial Unicode MS" w:hAnsi="Arial Unicode MS" w:eastAsia="Arial Unicode MS" w:cs="Arial Unicode MS"/>
                 <w:b w:val="0"/>
                 <w:sz w:val="18"/>
               </w:rPr>
-              <w:t>feasible / reference-only / blocked</w:t>
+              <w:t>可行 / 仅参考 / 阻断</w:t>
             </w:r>
           </w:p>
         </w:tc>
@@ -2416,7 +2416,7 @@
             <w:r/>
             <w:r>
               <w:rPr>
-                <w:rFonts w:ascii="Calibri" w:hAnsi="Calibri" w:eastAsia="Arial Unicode MS" w:cs="Arial Unicode MS"/>
+                <w:rFonts w:ascii="Arial Unicode MS" w:hAnsi="Arial Unicode MS" w:eastAsia="Arial Unicode MS" w:cs="Arial Unicode MS"/>
                 <w:b w:val="0"/>
                 <w:sz w:val="18"/>
               </w:rPr>
@@ -2447,7 +2447,7 @@
             <w:r/>
             <w:r>
               <w:rPr>
-                <w:rFonts w:ascii="Calibri" w:hAnsi="Calibri" w:eastAsia="Arial Unicode MS" w:cs="Arial Unicode MS"/>
+                <w:rFonts w:ascii="Arial Unicode MS" w:hAnsi="Arial Unicode MS" w:eastAsia="Arial Unicode MS" w:cs="Arial Unicode MS"/>
                 <w:b w:val="0"/>
                 <w:sz w:val="18"/>
               </w:rPr>
@@ -2473,11 +2473,11 @@
             <w:r/>
             <w:r>
               <w:rPr>
-                <w:rFonts w:ascii="Calibri" w:hAnsi="Calibri" w:eastAsia="Arial Unicode MS" w:cs="Arial Unicode MS"/>
+                <w:rFonts w:ascii="Arial Unicode MS" w:hAnsi="Arial Unicode MS" w:eastAsia="Arial Unicode MS" w:cs="Arial Unicode MS"/>
                 <w:b w:val="0"/>
                 <w:sz w:val="18"/>
               </w:rPr>
-              <w:t>pass / warning / fail-closed</w:t>
+              <w:t>通过 / 警告 / 失败关闭</w:t>
             </w:r>
           </w:p>
         </w:tc>
@@ -2499,7 +2499,7 @@
             <w:r/>
             <w:r>
               <w:rPr>
-                <w:rFonts w:ascii="Calibri" w:hAnsi="Calibri" w:eastAsia="Arial Unicode MS" w:cs="Arial Unicode MS"/>
+                <w:rFonts w:ascii="Arial Unicode MS" w:hAnsi="Arial Unicode MS" w:eastAsia="Arial Unicode MS" w:cs="Arial Unicode MS"/>
                 <w:b w:val="0"/>
                 <w:sz w:val="18"/>
               </w:rPr>
@@ -2530,7 +2530,7 @@
             <w:r/>
             <w:r>
               <w:rPr>
-                <w:rFonts w:ascii="Calibri" w:hAnsi="Calibri" w:eastAsia="Arial Unicode MS" w:cs="Arial Unicode MS"/>
+                <w:rFonts w:ascii="Arial Unicode MS" w:hAnsi="Arial Unicode MS" w:eastAsia="Arial Unicode MS" w:cs="Arial Unicode MS"/>
                 <w:b w:val="0"/>
                 <w:sz w:val="18"/>
               </w:rPr>
@@ -2556,11 +2556,11 @@
             <w:r/>
             <w:r>
               <w:rPr>
-                <w:rFonts w:ascii="Calibri" w:hAnsi="Calibri" w:eastAsia="Arial Unicode MS" w:cs="Arial Unicode MS"/>
+                <w:rFonts w:ascii="Arial Unicode MS" w:hAnsi="Arial Unicode MS" w:eastAsia="Arial Unicode MS" w:cs="Arial Unicode MS"/>
                 <w:b w:val="0"/>
                 <w:sz w:val="18"/>
               </w:rPr>
-              <w:t>accepted / adjusted / rejected</w:t>
+              <w:t>采纳 / 调整 / 驳回</w:t>
             </w:r>
           </w:p>
         </w:tc>
@@ -2582,7 +2582,7 @@
             <w:r/>
             <w:r>
               <w:rPr>
-                <w:rFonts w:ascii="Calibri" w:hAnsi="Calibri" w:eastAsia="Arial Unicode MS" w:cs="Arial Unicode MS"/>
+                <w:rFonts w:ascii="Arial Unicode MS" w:hAnsi="Arial Unicode MS" w:eastAsia="Arial Unicode MS" w:cs="Arial Unicode MS"/>
                 <w:b w:val="0"/>
                 <w:sz w:val="18"/>
               </w:rPr>
@@ -2613,7 +2613,7 @@
             <w:r/>
             <w:r>
               <w:rPr>
-                <w:rFonts w:ascii="Calibri" w:hAnsi="Calibri" w:eastAsia="Arial Unicode MS" w:cs="Arial Unicode MS"/>
+                <w:rFonts w:ascii="Arial Unicode MS" w:hAnsi="Arial Unicode MS" w:eastAsia="Arial Unicode MS" w:cs="Arial Unicode MS"/>
                 <w:b w:val="0"/>
                 <w:sz w:val="18"/>
               </w:rPr>
@@ -2639,11 +2639,11 @@
             <w:r/>
             <w:r>
               <w:rPr>
-                <w:rFonts w:ascii="Calibri" w:hAnsi="Calibri" w:eastAsia="Arial Unicode MS" w:cs="Arial Unicode MS"/>
+                <w:rFonts w:ascii="Arial Unicode MS" w:hAnsi="Arial Unicode MS" w:eastAsia="Arial Unicode MS" w:cs="Arial Unicode MS"/>
                 <w:b w:val="0"/>
                 <w:sz w:val="18"/>
               </w:rPr>
-              <w:t>prediction / decision / outcome / failure</w:t>
+              <w:t>预测 / 决策 / 结果 / 失败</w:t>
             </w:r>
           </w:p>
         </w:tc>
@@ -2665,7 +2665,7 @@
             <w:r/>
             <w:r>
               <w:rPr>
-                <w:rFonts w:ascii="Calibri" w:hAnsi="Calibri" w:eastAsia="Arial Unicode MS" w:cs="Arial Unicode MS"/>
+                <w:rFonts w:ascii="Arial Unicode MS" w:hAnsi="Arial Unicode MS" w:eastAsia="Arial Unicode MS" w:cs="Arial Unicode MS"/>
                 <w:b w:val="0"/>
                 <w:sz w:val="18"/>
               </w:rPr>
@@ -2687,7 +2687,7 @@
       </w:pPr>
       <w:r>
         <w:rPr>
-          <w:rFonts w:ascii="Calibri" w:hAnsi="Calibri" w:eastAsia="Arial Unicode MS" w:cs="Arial Unicode MS"/>
+          <w:rFonts w:ascii="Arial Unicode MS" w:hAnsi="Arial Unicode MS" w:eastAsia="Arial Unicode MS" w:cs="Arial Unicode MS"/>
           <w:b/>
           <w:color w:val="176B4D"/>
           <w:sz w:val="21"/>
@@ -2696,7 +2696,7 @@
       </w:r>
       <w:r>
         <w:rPr>
-          <w:rFonts w:ascii="Calibri" w:hAnsi="Calibri" w:eastAsia="Arial Unicode MS" w:cs="Arial Unicode MS"/>
+          <w:rFonts w:ascii="Arial Unicode MS" w:hAnsi="Arial Unicode MS" w:eastAsia="Arial Unicode MS" w:cs="Arial Unicode MS"/>
           <w:color w:val="191F1D"/>
           <w:sz w:val="21"/>
         </w:rPr>
@@ -2710,7 +2710,7 @@
       </w:pPr>
       <w:r>
         <w:rPr>
-          <w:rFonts w:ascii="Calibri" w:hAnsi="Calibri" w:eastAsia="Arial Unicode MS" w:cs="Arial Unicode MS"/>
+          <w:rFonts w:ascii="Arial Unicode MS" w:hAnsi="Arial Unicode MS" w:eastAsia="Arial Unicode MS" w:cs="Arial Unicode MS"/>
           <w:b/>
           <w:color w:val="176B4D"/>
           <w:sz w:val="21"/>
@@ -2719,7 +2719,7 @@
       </w:r>
       <w:r>
         <w:rPr>
-          <w:rFonts w:ascii="Calibri" w:hAnsi="Calibri" w:eastAsia="Arial Unicode MS" w:cs="Arial Unicode MS"/>
+          <w:rFonts w:ascii="Arial Unicode MS" w:hAnsi="Arial Unicode MS" w:eastAsia="Arial Unicode MS" w:cs="Arial Unicode MS"/>
           <w:color w:val="191F1D"/>
           <w:sz w:val="21"/>
         </w:rPr>
@@ -2733,7 +2733,7 @@
       </w:pPr>
       <w:r>
         <w:rPr>
-          <w:rFonts w:ascii="Calibri" w:hAnsi="Calibri" w:eastAsia="Arial Unicode MS" w:cs="Arial Unicode MS"/>
+          <w:rFonts w:ascii="Arial Unicode MS" w:hAnsi="Arial Unicode MS" w:eastAsia="Arial Unicode MS" w:cs="Arial Unicode MS"/>
           <w:b/>
           <w:color w:val="176B4D"/>
           <w:sz w:val="21"/>
@@ -2742,7 +2742,7 @@
       </w:r>
       <w:r>
         <w:rPr>
-          <w:rFonts w:ascii="Calibri" w:hAnsi="Calibri" w:eastAsia="Arial Unicode MS" w:cs="Arial Unicode MS"/>
+          <w:rFonts w:ascii="Arial Unicode MS" w:hAnsi="Arial Unicode MS" w:eastAsia="Arial Unicode MS" w:cs="Arial Unicode MS"/>
           <w:color w:val="191F1D"/>
           <w:sz w:val="21"/>
         </w:rPr>
@@ -2756,7 +2756,7 @@
       </w:pPr>
       <w:r>
         <w:rPr>
-          <w:rFonts w:ascii="Calibri" w:hAnsi="Calibri" w:eastAsia="Arial Unicode MS" w:cs="Arial Unicode MS"/>
+          <w:rFonts w:ascii="Arial Unicode MS" w:hAnsi="Arial Unicode MS" w:eastAsia="Arial Unicode MS" w:cs="Arial Unicode MS"/>
           <w:b/>
           <w:color w:val="2E74B5"/>
           <w:sz w:val="32"/>
@@ -2801,7 +2801,7 @@
             <w:r/>
             <w:r>
               <w:rPr>
-                <w:rFonts w:ascii="Calibri" w:hAnsi="Calibri" w:eastAsia="Arial Unicode MS" w:cs="Arial Unicode MS"/>
+                <w:rFonts w:ascii="Arial Unicode MS" w:hAnsi="Arial Unicode MS" w:eastAsia="Arial Unicode MS" w:cs="Arial Unicode MS"/>
                 <w:b/>
                 <w:color w:val="1F4D78"/>
                 <w:sz w:val="18"/>
@@ -2829,7 +2829,7 @@
             <w:r/>
             <w:r>
               <w:rPr>
-                <w:rFonts w:ascii="Calibri" w:hAnsi="Calibri" w:eastAsia="Arial Unicode MS" w:cs="Arial Unicode MS"/>
+                <w:rFonts w:ascii="Arial Unicode MS" w:hAnsi="Arial Unicode MS" w:eastAsia="Arial Unicode MS" w:cs="Arial Unicode MS"/>
                 <w:b/>
                 <w:color w:val="1F4D78"/>
                 <w:sz w:val="18"/>
@@ -2857,7 +2857,7 @@
             <w:r/>
             <w:r>
               <w:rPr>
-                <w:rFonts w:ascii="Calibri" w:hAnsi="Calibri" w:eastAsia="Arial Unicode MS" w:cs="Arial Unicode MS"/>
+                <w:rFonts w:ascii="Arial Unicode MS" w:hAnsi="Arial Unicode MS" w:eastAsia="Arial Unicode MS" w:cs="Arial Unicode MS"/>
                 <w:b/>
                 <w:color w:val="1F4D78"/>
                 <w:sz w:val="18"/>
@@ -2889,7 +2889,7 @@
             <w:r/>
             <w:r>
               <w:rPr>
-                <w:rFonts w:ascii="Calibri" w:hAnsi="Calibri" w:eastAsia="Arial Unicode MS" w:cs="Arial Unicode MS"/>
+                <w:rFonts w:ascii="Arial Unicode MS" w:hAnsi="Arial Unicode MS" w:eastAsia="Arial Unicode MS" w:cs="Arial Unicode MS"/>
                 <w:b w:val="0"/>
                 <w:sz w:val="18"/>
               </w:rPr>
@@ -2915,7 +2915,7 @@
             <w:r/>
             <w:r>
               <w:rPr>
-                <w:rFonts w:ascii="Calibri" w:hAnsi="Calibri" w:eastAsia="Arial Unicode MS" w:cs="Arial Unicode MS"/>
+                <w:rFonts w:ascii="Arial Unicode MS" w:hAnsi="Arial Unicode MS" w:eastAsia="Arial Unicode MS" w:cs="Arial Unicode MS"/>
                 <w:b w:val="0"/>
                 <w:sz w:val="18"/>
               </w:rPr>
@@ -2941,7 +2941,7 @@
             <w:r/>
             <w:r>
               <w:rPr>
-                <w:rFonts w:ascii="Calibri" w:hAnsi="Calibri" w:eastAsia="Arial Unicode MS" w:cs="Arial Unicode MS"/>
+                <w:rFonts w:ascii="Arial Unicode MS" w:hAnsi="Arial Unicode MS" w:eastAsia="Arial Unicode MS" w:cs="Arial Unicode MS"/>
                 <w:b w:val="0"/>
                 <w:sz w:val="18"/>
               </w:rPr>
@@ -2972,7 +2972,7 @@
             <w:r/>
             <w:r>
               <w:rPr>
-                <w:rFonts w:ascii="Calibri" w:hAnsi="Calibri" w:eastAsia="Arial Unicode MS" w:cs="Arial Unicode MS"/>
+                <w:rFonts w:ascii="Arial Unicode MS" w:hAnsi="Arial Unicode MS" w:eastAsia="Arial Unicode MS" w:cs="Arial Unicode MS"/>
                 <w:b w:val="0"/>
                 <w:sz w:val="18"/>
               </w:rPr>
@@ -2998,7 +2998,7 @@
             <w:r/>
             <w:r>
               <w:rPr>
-                <w:rFonts w:ascii="Calibri" w:hAnsi="Calibri" w:eastAsia="Arial Unicode MS" w:cs="Arial Unicode MS"/>
+                <w:rFonts w:ascii="Arial Unicode MS" w:hAnsi="Arial Unicode MS" w:eastAsia="Arial Unicode MS" w:cs="Arial Unicode MS"/>
                 <w:b w:val="0"/>
                 <w:sz w:val="18"/>
               </w:rPr>
@@ -3024,7 +3024,7 @@
             <w:r/>
             <w:r>
               <w:rPr>
-                <w:rFonts w:ascii="Calibri" w:hAnsi="Calibri" w:eastAsia="Arial Unicode MS" w:cs="Arial Unicode MS"/>
+                <w:rFonts w:ascii="Arial Unicode MS" w:hAnsi="Arial Unicode MS" w:eastAsia="Arial Unicode MS" w:cs="Arial Unicode MS"/>
                 <w:b w:val="0"/>
                 <w:sz w:val="18"/>
               </w:rPr>
@@ -3055,7 +3055,7 @@
             <w:r/>
             <w:r>
               <w:rPr>
-                <w:rFonts w:ascii="Calibri" w:hAnsi="Calibri" w:eastAsia="Arial Unicode MS" w:cs="Arial Unicode MS"/>
+                <w:rFonts w:ascii="Arial Unicode MS" w:hAnsi="Arial Unicode MS" w:eastAsia="Arial Unicode MS" w:cs="Arial Unicode MS"/>
                 <w:b w:val="0"/>
                 <w:sz w:val="18"/>
               </w:rPr>
@@ -3081,7 +3081,7 @@
             <w:r/>
             <w:r>
               <w:rPr>
-                <w:rFonts w:ascii="Calibri" w:hAnsi="Calibri" w:eastAsia="Arial Unicode MS" w:cs="Arial Unicode MS"/>
+                <w:rFonts w:ascii="Arial Unicode MS" w:hAnsi="Arial Unicode MS" w:eastAsia="Arial Unicode MS" w:cs="Arial Unicode MS"/>
                 <w:b w:val="0"/>
                 <w:sz w:val="18"/>
               </w:rPr>
@@ -3107,7 +3107,7 @@
             <w:r/>
             <w:r>
               <w:rPr>
-                <w:rFonts w:ascii="Calibri" w:hAnsi="Calibri" w:eastAsia="Arial Unicode MS" w:cs="Arial Unicode MS"/>
+                <w:rFonts w:ascii="Arial Unicode MS" w:hAnsi="Arial Unicode MS" w:eastAsia="Arial Unicode MS" w:cs="Arial Unicode MS"/>
                 <w:b w:val="0"/>
                 <w:sz w:val="18"/>
               </w:rPr>
@@ -3138,7 +3138,7 @@
             <w:r/>
             <w:r>
               <w:rPr>
-                <w:rFonts w:ascii="Calibri" w:hAnsi="Calibri" w:eastAsia="Arial Unicode MS" w:cs="Arial Unicode MS"/>
+                <w:rFonts w:ascii="Arial Unicode MS" w:hAnsi="Arial Unicode MS" w:eastAsia="Arial Unicode MS" w:cs="Arial Unicode MS"/>
                 <w:b w:val="0"/>
                 <w:sz w:val="18"/>
               </w:rPr>
@@ -3164,7 +3164,7 @@
             <w:r/>
             <w:r>
               <w:rPr>
-                <w:rFonts w:ascii="Calibri" w:hAnsi="Calibri" w:eastAsia="Arial Unicode MS" w:cs="Arial Unicode MS"/>
+                <w:rFonts w:ascii="Arial Unicode MS" w:hAnsi="Arial Unicode MS" w:eastAsia="Arial Unicode MS" w:cs="Arial Unicode MS"/>
                 <w:b w:val="0"/>
                 <w:sz w:val="18"/>
               </w:rPr>
@@ -3190,7 +3190,7 @@
             <w:r/>
             <w:r>
               <w:rPr>
-                <w:rFonts w:ascii="Calibri" w:hAnsi="Calibri" w:eastAsia="Arial Unicode MS" w:cs="Arial Unicode MS"/>
+                <w:rFonts w:ascii="Arial Unicode MS" w:hAnsi="Arial Unicode MS" w:eastAsia="Arial Unicode MS" w:cs="Arial Unicode MS"/>
                 <w:b w:val="0"/>
                 <w:sz w:val="18"/>
               </w:rPr>
@@ -3221,7 +3221,7 @@
             <w:r/>
             <w:r>
               <w:rPr>
-                <w:rFonts w:ascii="Calibri" w:hAnsi="Calibri" w:eastAsia="Arial Unicode MS" w:cs="Arial Unicode MS"/>
+                <w:rFonts w:ascii="Arial Unicode MS" w:hAnsi="Arial Unicode MS" w:eastAsia="Arial Unicode MS" w:cs="Arial Unicode MS"/>
                 <w:b w:val="0"/>
                 <w:sz w:val="18"/>
               </w:rPr>
@@ -3247,7 +3247,7 @@
             <w:r/>
             <w:r>
               <w:rPr>
-                <w:rFonts w:ascii="Calibri" w:hAnsi="Calibri" w:eastAsia="Arial Unicode MS" w:cs="Arial Unicode MS"/>
+                <w:rFonts w:ascii="Arial Unicode MS" w:hAnsi="Arial Unicode MS" w:eastAsia="Arial Unicode MS" w:cs="Arial Unicode MS"/>
                 <w:b w:val="0"/>
                 <w:sz w:val="18"/>
               </w:rPr>
@@ -3273,7 +3273,7 @@
             <w:r/>
             <w:r>
               <w:rPr>
-                <w:rFonts w:ascii="Calibri" w:hAnsi="Calibri" w:eastAsia="Arial Unicode MS" w:cs="Arial Unicode MS"/>
+                <w:rFonts w:ascii="Arial Unicode MS" w:hAnsi="Arial Unicode MS" w:eastAsia="Arial Unicode MS" w:cs="Arial Unicode MS"/>
                 <w:b w:val="0"/>
                 <w:sz w:val="18"/>
               </w:rPr>
@@ -3304,7 +3304,7 @@
             <w:r/>
             <w:r>
               <w:rPr>
-                <w:rFonts w:ascii="Calibri" w:hAnsi="Calibri" w:eastAsia="Arial Unicode MS" w:cs="Arial Unicode MS"/>
+                <w:rFonts w:ascii="Arial Unicode MS" w:hAnsi="Arial Unicode MS" w:eastAsia="Arial Unicode MS" w:cs="Arial Unicode MS"/>
                 <w:b w:val="0"/>
                 <w:sz w:val="18"/>
               </w:rPr>
@@ -3330,7 +3330,7 @@
             <w:r/>
             <w:r>
               <w:rPr>
-                <w:rFonts w:ascii="Calibri" w:hAnsi="Calibri" w:eastAsia="Arial Unicode MS" w:cs="Arial Unicode MS"/>
+                <w:rFonts w:ascii="Arial Unicode MS" w:hAnsi="Arial Unicode MS" w:eastAsia="Arial Unicode MS" w:cs="Arial Unicode MS"/>
                 <w:b w:val="0"/>
                 <w:sz w:val="18"/>
               </w:rPr>
@@ -3356,7 +3356,7 @@
             <w:r/>
             <w:r>
               <w:rPr>
-                <w:rFonts w:ascii="Calibri" w:hAnsi="Calibri" w:eastAsia="Arial Unicode MS" w:cs="Arial Unicode MS"/>
+                <w:rFonts w:ascii="Arial Unicode MS" w:hAnsi="Arial Unicode MS" w:eastAsia="Arial Unicode MS" w:cs="Arial Unicode MS"/>
                 <w:b w:val="0"/>
                 <w:sz w:val="18"/>
               </w:rPr>
@@ -3377,7 +3377,7 @@
       </w:pPr>
       <w:r>
         <w:rPr>
-          <w:rFonts w:ascii="Calibri" w:hAnsi="Calibri" w:eastAsia="Arial Unicode MS" w:cs="Arial Unicode MS"/>
+          <w:rFonts w:ascii="Arial Unicode MS" w:hAnsi="Arial Unicode MS" w:eastAsia="Arial Unicode MS" w:cs="Arial Unicode MS"/>
           <w:color w:val="191F1D"/>
           <w:sz w:val="22"/>
         </w:rPr>
@@ -3391,7 +3391,7 @@
       </w:pPr>
       <w:r>
         <w:rPr>
-          <w:rFonts w:ascii="Calibri" w:hAnsi="Calibri" w:eastAsia="Arial Unicode MS" w:cs="Arial Unicode MS"/>
+          <w:rFonts w:ascii="Arial Unicode MS" w:hAnsi="Arial Unicode MS" w:eastAsia="Arial Unicode MS" w:cs="Arial Unicode MS"/>
           <w:b/>
           <w:color w:val="2E74B5"/>
           <w:sz w:val="32"/>
@@ -3436,7 +3436,7 @@
             <w:r/>
             <w:r>
               <w:rPr>
-                <w:rFonts w:ascii="Calibri" w:hAnsi="Calibri" w:eastAsia="Arial Unicode MS" w:cs="Arial Unicode MS"/>
+                <w:rFonts w:ascii="Arial Unicode MS" w:hAnsi="Arial Unicode MS" w:eastAsia="Arial Unicode MS" w:cs="Arial Unicode MS"/>
                 <w:b/>
                 <w:color w:val="1F4D78"/>
                 <w:sz w:val="18"/>
@@ -3464,7 +3464,7 @@
             <w:r/>
             <w:r>
               <w:rPr>
-                <w:rFonts w:ascii="Calibri" w:hAnsi="Calibri" w:eastAsia="Arial Unicode MS" w:cs="Arial Unicode MS"/>
+                <w:rFonts w:ascii="Arial Unicode MS" w:hAnsi="Arial Unicode MS" w:eastAsia="Arial Unicode MS" w:cs="Arial Unicode MS"/>
                 <w:b/>
                 <w:color w:val="1F4D78"/>
                 <w:sz w:val="18"/>
@@ -3492,7 +3492,7 @@
             <w:r/>
             <w:r>
               <w:rPr>
-                <w:rFonts w:ascii="Calibri" w:hAnsi="Calibri" w:eastAsia="Arial Unicode MS" w:cs="Arial Unicode MS"/>
+                <w:rFonts w:ascii="Arial Unicode MS" w:hAnsi="Arial Unicode MS" w:eastAsia="Arial Unicode MS" w:cs="Arial Unicode MS"/>
                 <w:b/>
                 <w:color w:val="1F4D78"/>
                 <w:sz w:val="18"/>
@@ -3524,7 +3524,7 @@
             <w:r/>
             <w:r>
               <w:rPr>
-                <w:rFonts w:ascii="Calibri" w:hAnsi="Calibri" w:eastAsia="Arial Unicode MS" w:cs="Arial Unicode MS"/>
+                <w:rFonts w:ascii="Arial Unicode MS" w:hAnsi="Arial Unicode MS" w:eastAsia="Arial Unicode MS" w:cs="Arial Unicode MS"/>
                 <w:b w:val="0"/>
                 <w:sz w:val="18"/>
               </w:rPr>
@@ -3550,7 +3550,7 @@
             <w:r/>
             <w:r>
               <w:rPr>
-                <w:rFonts w:ascii="Calibri" w:hAnsi="Calibri" w:eastAsia="Arial Unicode MS" w:cs="Arial Unicode MS"/>
+                <w:rFonts w:ascii="Arial Unicode MS" w:hAnsi="Arial Unicode MS" w:eastAsia="Arial Unicode MS" w:cs="Arial Unicode MS"/>
                 <w:b w:val="0"/>
                 <w:sz w:val="18"/>
               </w:rPr>
@@ -3576,7 +3576,7 @@
             <w:r/>
             <w:r>
               <w:rPr>
-                <w:rFonts w:ascii="Calibri" w:hAnsi="Calibri" w:eastAsia="Arial Unicode MS" w:cs="Arial Unicode MS"/>
+                <w:rFonts w:ascii="Arial Unicode MS" w:hAnsi="Arial Unicode MS" w:eastAsia="Arial Unicode MS" w:cs="Arial Unicode MS"/>
                 <w:b w:val="0"/>
                 <w:sz w:val="18"/>
               </w:rPr>
@@ -3607,7 +3607,7 @@
             <w:r/>
             <w:r>
               <w:rPr>
-                <w:rFonts w:ascii="Calibri" w:hAnsi="Calibri" w:eastAsia="Arial Unicode MS" w:cs="Arial Unicode MS"/>
+                <w:rFonts w:ascii="Arial Unicode MS" w:hAnsi="Arial Unicode MS" w:eastAsia="Arial Unicode MS" w:cs="Arial Unicode MS"/>
                 <w:b w:val="0"/>
                 <w:sz w:val="18"/>
               </w:rPr>
@@ -3633,7 +3633,7 @@
             <w:r/>
             <w:r>
               <w:rPr>
-                <w:rFonts w:ascii="Calibri" w:hAnsi="Calibri" w:eastAsia="Arial Unicode MS" w:cs="Arial Unicode MS"/>
+                <w:rFonts w:ascii="Arial Unicode MS" w:hAnsi="Arial Unicode MS" w:eastAsia="Arial Unicode MS" w:cs="Arial Unicode MS"/>
                 <w:b w:val="0"/>
                 <w:sz w:val="18"/>
               </w:rPr>
@@ -3659,7 +3659,7 @@
             <w:r/>
             <w:r>
               <w:rPr>
-                <w:rFonts w:ascii="Calibri" w:hAnsi="Calibri" w:eastAsia="Arial Unicode MS" w:cs="Arial Unicode MS"/>
+                <w:rFonts w:ascii="Arial Unicode MS" w:hAnsi="Arial Unicode MS" w:eastAsia="Arial Unicode MS" w:cs="Arial Unicode MS"/>
                 <w:b w:val="0"/>
                 <w:sz w:val="18"/>
               </w:rPr>
@@ -3690,7 +3690,7 @@
             <w:r/>
             <w:r>
               <w:rPr>
-                <w:rFonts w:ascii="Calibri" w:hAnsi="Calibri" w:eastAsia="Arial Unicode MS" w:cs="Arial Unicode MS"/>
+                <w:rFonts w:ascii="Arial Unicode MS" w:hAnsi="Arial Unicode MS" w:eastAsia="Arial Unicode MS" w:cs="Arial Unicode MS"/>
                 <w:b w:val="0"/>
                 <w:sz w:val="18"/>
               </w:rPr>
@@ -3716,7 +3716,7 @@
             <w:r/>
             <w:r>
               <w:rPr>
-                <w:rFonts w:ascii="Calibri" w:hAnsi="Calibri" w:eastAsia="Arial Unicode MS" w:cs="Arial Unicode MS"/>
+                <w:rFonts w:ascii="Arial Unicode MS" w:hAnsi="Arial Unicode MS" w:eastAsia="Arial Unicode MS" w:cs="Arial Unicode MS"/>
                 <w:b w:val="0"/>
                 <w:sz w:val="18"/>
               </w:rPr>
@@ -3742,7 +3742,7 @@
             <w:r/>
             <w:r>
               <w:rPr>
-                <w:rFonts w:ascii="Calibri" w:hAnsi="Calibri" w:eastAsia="Arial Unicode MS" w:cs="Arial Unicode MS"/>
+                <w:rFonts w:ascii="Arial Unicode MS" w:hAnsi="Arial Unicode MS" w:eastAsia="Arial Unicode MS" w:cs="Arial Unicode MS"/>
                 <w:b w:val="0"/>
                 <w:sz w:val="18"/>
               </w:rPr>
@@ -3773,7 +3773,7 @@
             <w:r/>
             <w:r>
               <w:rPr>
-                <w:rFonts w:ascii="Calibri" w:hAnsi="Calibri" w:eastAsia="Arial Unicode MS" w:cs="Arial Unicode MS"/>
+                <w:rFonts w:ascii="Arial Unicode MS" w:hAnsi="Arial Unicode MS" w:eastAsia="Arial Unicode MS" w:cs="Arial Unicode MS"/>
                 <w:b w:val="0"/>
                 <w:sz w:val="18"/>
               </w:rPr>
@@ -3799,7 +3799,7 @@
             <w:r/>
             <w:r>
               <w:rPr>
-                <w:rFonts w:ascii="Calibri" w:hAnsi="Calibri" w:eastAsia="Arial Unicode MS" w:cs="Arial Unicode MS"/>
+                <w:rFonts w:ascii="Arial Unicode MS" w:hAnsi="Arial Unicode MS" w:eastAsia="Arial Unicode MS" w:cs="Arial Unicode MS"/>
                 <w:b w:val="0"/>
                 <w:sz w:val="18"/>
               </w:rPr>
@@ -3825,7 +3825,7 @@
             <w:r/>
             <w:r>
               <w:rPr>
-                <w:rFonts w:ascii="Calibri" w:hAnsi="Calibri" w:eastAsia="Arial Unicode MS" w:cs="Arial Unicode MS"/>
+                <w:rFonts w:ascii="Arial Unicode MS" w:hAnsi="Arial Unicode MS" w:eastAsia="Arial Unicode MS" w:cs="Arial Unicode MS"/>
                 <w:b w:val="0"/>
                 <w:sz w:val="18"/>
               </w:rPr>
@@ -3856,7 +3856,7 @@
             <w:r/>
             <w:r>
               <w:rPr>
-                <w:rFonts w:ascii="Calibri" w:hAnsi="Calibri" w:eastAsia="Arial Unicode MS" w:cs="Arial Unicode MS"/>
+                <w:rFonts w:ascii="Arial Unicode MS" w:hAnsi="Arial Unicode MS" w:eastAsia="Arial Unicode MS" w:cs="Arial Unicode MS"/>
                 <w:b w:val="0"/>
                 <w:sz w:val="18"/>
               </w:rPr>
@@ -3882,7 +3882,7 @@
             <w:r/>
             <w:r>
               <w:rPr>
-                <w:rFonts w:ascii="Calibri" w:hAnsi="Calibri" w:eastAsia="Arial Unicode MS" w:cs="Arial Unicode MS"/>
+                <w:rFonts w:ascii="Arial Unicode MS" w:hAnsi="Arial Unicode MS" w:eastAsia="Arial Unicode MS" w:cs="Arial Unicode MS"/>
                 <w:b w:val="0"/>
                 <w:sz w:val="18"/>
               </w:rPr>
@@ -3908,7 +3908,7 @@
             <w:r/>
             <w:r>
               <w:rPr>
-                <w:rFonts w:ascii="Calibri" w:hAnsi="Calibri" w:eastAsia="Arial Unicode MS" w:cs="Arial Unicode MS"/>
+                <w:rFonts w:ascii="Arial Unicode MS" w:hAnsi="Arial Unicode MS" w:eastAsia="Arial Unicode MS" w:cs="Arial Unicode MS"/>
                 <w:b w:val="0"/>
                 <w:sz w:val="18"/>
               </w:rPr>
@@ -3929,7 +3929,7 @@
       </w:pPr>
       <w:r>
         <w:rPr>
-          <w:rFonts w:ascii="Calibri" w:hAnsi="Calibri" w:eastAsia="Arial Unicode MS" w:cs="Arial Unicode MS"/>
+          <w:rFonts w:ascii="Arial Unicode MS" w:hAnsi="Arial Unicode MS" w:eastAsia="Arial Unicode MS" w:cs="Arial Unicode MS"/>
           <w:color w:val="191F1D"/>
           <w:sz w:val="22"/>
         </w:rPr>
@@ -3943,7 +3943,7 @@
       </w:pPr>
       <w:r>
         <w:rPr>
-          <w:rFonts w:ascii="Calibri" w:hAnsi="Calibri" w:eastAsia="Arial Unicode MS" w:cs="Arial Unicode MS"/>
+          <w:rFonts w:ascii="Arial Unicode MS" w:hAnsi="Arial Unicode MS" w:eastAsia="Arial Unicode MS" w:cs="Arial Unicode MS"/>
           <w:b/>
           <w:color w:val="2E74B5"/>
           <w:sz w:val="32"/>
@@ -3988,7 +3988,7 @@
             <w:r/>
             <w:r>
               <w:rPr>
-                <w:rFonts w:ascii="Calibri" w:hAnsi="Calibri" w:eastAsia="Arial Unicode MS" w:cs="Arial Unicode MS"/>
+                <w:rFonts w:ascii="Arial Unicode MS" w:hAnsi="Arial Unicode MS" w:eastAsia="Arial Unicode MS" w:cs="Arial Unicode MS"/>
                 <w:b/>
                 <w:color w:val="1F4D78"/>
                 <w:sz w:val="18"/>
@@ -4016,7 +4016,7 @@
             <w:r/>
             <w:r>
               <w:rPr>
-                <w:rFonts w:ascii="Calibri" w:hAnsi="Calibri" w:eastAsia="Arial Unicode MS" w:cs="Arial Unicode MS"/>
+                <w:rFonts w:ascii="Arial Unicode MS" w:hAnsi="Arial Unicode MS" w:eastAsia="Arial Unicode MS" w:cs="Arial Unicode MS"/>
                 <w:b/>
                 <w:color w:val="1F4D78"/>
                 <w:sz w:val="18"/>
@@ -4044,7 +4044,7 @@
             <w:r/>
             <w:r>
               <w:rPr>
-                <w:rFonts w:ascii="Calibri" w:hAnsi="Calibri" w:eastAsia="Arial Unicode MS" w:cs="Arial Unicode MS"/>
+                <w:rFonts w:ascii="Arial Unicode MS" w:hAnsi="Arial Unicode MS" w:eastAsia="Arial Unicode MS" w:cs="Arial Unicode MS"/>
                 <w:b/>
                 <w:color w:val="1F4D78"/>
                 <w:sz w:val="18"/>
@@ -4076,7 +4076,7 @@
             <w:r/>
             <w:r>
               <w:rPr>
-                <w:rFonts w:ascii="Calibri" w:hAnsi="Calibri" w:eastAsia="Arial Unicode MS" w:cs="Arial Unicode MS"/>
+                <w:rFonts w:ascii="Arial Unicode MS" w:hAnsi="Arial Unicode MS" w:eastAsia="Arial Unicode MS" w:cs="Arial Unicode MS"/>
                 <w:b w:val="0"/>
                 <w:sz w:val="18"/>
               </w:rPr>
@@ -4102,7 +4102,7 @@
             <w:r/>
             <w:r>
               <w:rPr>
-                <w:rFonts w:ascii="Calibri" w:hAnsi="Calibri" w:eastAsia="Arial Unicode MS" w:cs="Arial Unicode MS"/>
+                <w:rFonts w:ascii="Arial Unicode MS" w:hAnsi="Arial Unicode MS" w:eastAsia="Arial Unicode MS" w:cs="Arial Unicode MS"/>
                 <w:b w:val="0"/>
                 <w:sz w:val="18"/>
               </w:rPr>
@@ -4128,7 +4128,7 @@
             <w:r/>
             <w:r>
               <w:rPr>
-                <w:rFonts w:ascii="Calibri" w:hAnsi="Calibri" w:eastAsia="Arial Unicode MS" w:cs="Arial Unicode MS"/>
+                <w:rFonts w:ascii="Arial Unicode MS" w:hAnsi="Arial Unicode MS" w:eastAsia="Arial Unicode MS" w:cs="Arial Unicode MS"/>
                 <w:b w:val="0"/>
                 <w:sz w:val="18"/>
               </w:rPr>
@@ -4159,7 +4159,7 @@
             <w:r/>
             <w:r>
               <w:rPr>
-                <w:rFonts w:ascii="Calibri" w:hAnsi="Calibri" w:eastAsia="Arial Unicode MS" w:cs="Arial Unicode MS"/>
+                <w:rFonts w:ascii="Arial Unicode MS" w:hAnsi="Arial Unicode MS" w:eastAsia="Arial Unicode MS" w:cs="Arial Unicode MS"/>
                 <w:b w:val="0"/>
                 <w:sz w:val="18"/>
               </w:rPr>
@@ -4185,7 +4185,7 @@
             <w:r/>
             <w:r>
               <w:rPr>
-                <w:rFonts w:ascii="Calibri" w:hAnsi="Calibri" w:eastAsia="Arial Unicode MS" w:cs="Arial Unicode MS"/>
+                <w:rFonts w:ascii="Arial Unicode MS" w:hAnsi="Arial Unicode MS" w:eastAsia="Arial Unicode MS" w:cs="Arial Unicode MS"/>
                 <w:b w:val="0"/>
                 <w:sz w:val="18"/>
               </w:rPr>
@@ -4211,7 +4211,7 @@
             <w:r/>
             <w:r>
               <w:rPr>
-                <w:rFonts w:ascii="Calibri" w:hAnsi="Calibri" w:eastAsia="Arial Unicode MS" w:cs="Arial Unicode MS"/>
+                <w:rFonts w:ascii="Arial Unicode MS" w:hAnsi="Arial Unicode MS" w:eastAsia="Arial Unicode MS" w:cs="Arial Unicode MS"/>
                 <w:b w:val="0"/>
                 <w:sz w:val="18"/>
               </w:rPr>
@@ -4242,7 +4242,7 @@
             <w:r/>
             <w:r>
               <w:rPr>
-                <w:rFonts w:ascii="Calibri" w:hAnsi="Calibri" w:eastAsia="Arial Unicode MS" w:cs="Arial Unicode MS"/>
+                <w:rFonts w:ascii="Arial Unicode MS" w:hAnsi="Arial Unicode MS" w:eastAsia="Arial Unicode MS" w:cs="Arial Unicode MS"/>
                 <w:b w:val="0"/>
                 <w:sz w:val="18"/>
               </w:rPr>
@@ -4268,7 +4268,7 @@
             <w:r/>
             <w:r>
               <w:rPr>
-                <w:rFonts w:ascii="Calibri" w:hAnsi="Calibri" w:eastAsia="Arial Unicode MS" w:cs="Arial Unicode MS"/>
+                <w:rFonts w:ascii="Arial Unicode MS" w:hAnsi="Arial Unicode MS" w:eastAsia="Arial Unicode MS" w:cs="Arial Unicode MS"/>
                 <w:b w:val="0"/>
                 <w:sz w:val="18"/>
               </w:rPr>
@@ -4294,7 +4294,7 @@
             <w:r/>
             <w:r>
               <w:rPr>
-                <w:rFonts w:ascii="Calibri" w:hAnsi="Calibri" w:eastAsia="Arial Unicode MS" w:cs="Arial Unicode MS"/>
+                <w:rFonts w:ascii="Arial Unicode MS" w:hAnsi="Arial Unicode MS" w:eastAsia="Arial Unicode MS" w:cs="Arial Unicode MS"/>
                 <w:b w:val="0"/>
                 <w:sz w:val="18"/>
               </w:rPr>
@@ -4325,7 +4325,7 @@
             <w:r/>
             <w:r>
               <w:rPr>
-                <w:rFonts w:ascii="Calibri" w:hAnsi="Calibri" w:eastAsia="Arial Unicode MS" w:cs="Arial Unicode MS"/>
+                <w:rFonts w:ascii="Arial Unicode MS" w:hAnsi="Arial Unicode MS" w:eastAsia="Arial Unicode MS" w:cs="Arial Unicode MS"/>
                 <w:b w:val="0"/>
                 <w:sz w:val="18"/>
               </w:rPr>
@@ -4351,7 +4351,7 @@
             <w:r/>
             <w:r>
               <w:rPr>
-                <w:rFonts w:ascii="Calibri" w:hAnsi="Calibri" w:eastAsia="Arial Unicode MS" w:cs="Arial Unicode MS"/>
+                <w:rFonts w:ascii="Arial Unicode MS" w:hAnsi="Arial Unicode MS" w:eastAsia="Arial Unicode MS" w:cs="Arial Unicode MS"/>
                 <w:b w:val="0"/>
                 <w:sz w:val="18"/>
               </w:rPr>
@@ -4377,7 +4377,7 @@
             <w:r/>
             <w:r>
               <w:rPr>
-                <w:rFonts w:ascii="Calibri" w:hAnsi="Calibri" w:eastAsia="Arial Unicode MS" w:cs="Arial Unicode MS"/>
+                <w:rFonts w:ascii="Arial Unicode MS" w:hAnsi="Arial Unicode MS" w:eastAsia="Arial Unicode MS" w:cs="Arial Unicode MS"/>
                 <w:b w:val="0"/>
                 <w:sz w:val="18"/>
               </w:rPr>
@@ -4408,7 +4408,7 @@
             <w:r/>
             <w:r>
               <w:rPr>
-                <w:rFonts w:ascii="Calibri" w:hAnsi="Calibri" w:eastAsia="Arial Unicode MS" w:cs="Arial Unicode MS"/>
+                <w:rFonts w:ascii="Arial Unicode MS" w:hAnsi="Arial Unicode MS" w:eastAsia="Arial Unicode MS" w:cs="Arial Unicode MS"/>
                 <w:b w:val="0"/>
                 <w:sz w:val="18"/>
               </w:rPr>
@@ -4434,7 +4434,7 @@
             <w:r/>
             <w:r>
               <w:rPr>
-                <w:rFonts w:ascii="Calibri" w:hAnsi="Calibri" w:eastAsia="Arial Unicode MS" w:cs="Arial Unicode MS"/>
+                <w:rFonts w:ascii="Arial Unicode MS" w:hAnsi="Arial Unicode MS" w:eastAsia="Arial Unicode MS" w:cs="Arial Unicode MS"/>
                 <w:b w:val="0"/>
                 <w:sz w:val="18"/>
               </w:rPr>
@@ -4460,7 +4460,7 @@
             <w:r/>
             <w:r>
               <w:rPr>
-                <w:rFonts w:ascii="Calibri" w:hAnsi="Calibri" w:eastAsia="Arial Unicode MS" w:cs="Arial Unicode MS"/>
+                <w:rFonts w:ascii="Arial Unicode MS" w:hAnsi="Arial Unicode MS" w:eastAsia="Arial Unicode MS" w:cs="Arial Unicode MS"/>
                 <w:b w:val="0"/>
                 <w:sz w:val="18"/>
               </w:rPr>
@@ -4491,7 +4491,7 @@
             <w:r/>
             <w:r>
               <w:rPr>
-                <w:rFonts w:ascii="Calibri" w:hAnsi="Calibri" w:eastAsia="Arial Unicode MS" w:cs="Arial Unicode MS"/>
+                <w:rFonts w:ascii="Arial Unicode MS" w:hAnsi="Arial Unicode MS" w:eastAsia="Arial Unicode MS" w:cs="Arial Unicode MS"/>
                 <w:b w:val="0"/>
                 <w:sz w:val="18"/>
               </w:rPr>
@@ -4517,7 +4517,7 @@
             <w:r/>
             <w:r>
               <w:rPr>
-                <w:rFonts w:ascii="Calibri" w:hAnsi="Calibri" w:eastAsia="Arial Unicode MS" w:cs="Arial Unicode MS"/>
+                <w:rFonts w:ascii="Arial Unicode MS" w:hAnsi="Arial Unicode MS" w:eastAsia="Arial Unicode MS" w:cs="Arial Unicode MS"/>
                 <w:b w:val="0"/>
                 <w:sz w:val="18"/>
               </w:rPr>
@@ -4543,7 +4543,7 @@
             <w:r/>
             <w:r>
               <w:rPr>
-                <w:rFonts w:ascii="Calibri" w:hAnsi="Calibri" w:eastAsia="Arial Unicode MS" w:cs="Arial Unicode MS"/>
+                <w:rFonts w:ascii="Arial Unicode MS" w:hAnsi="Arial Unicode MS" w:eastAsia="Arial Unicode MS" w:cs="Arial Unicode MS"/>
                 <w:b w:val="0"/>
                 <w:sz w:val="18"/>
               </w:rPr>
@@ -4564,7 +4564,7 @@
       </w:pPr>
       <w:r>
         <w:rPr>
-          <w:rFonts w:ascii="Calibri" w:hAnsi="Calibri" w:eastAsia="Arial Unicode MS" w:cs="Arial Unicode MS"/>
+          <w:rFonts w:ascii="Arial Unicode MS" w:hAnsi="Arial Unicode MS" w:eastAsia="Arial Unicode MS" w:cs="Arial Unicode MS"/>
           <w:color w:val="191F1D"/>
           <w:sz w:val="22"/>
         </w:rPr>
@@ -4577,7 +4577,7 @@
       </w:pPr>
       <w:r>
         <w:rPr>
-          <w:rFonts w:ascii="Calibri" w:hAnsi="Calibri" w:eastAsia="Arial Unicode MS" w:cs="Arial Unicode MS"/>
+          <w:rFonts w:ascii="Arial Unicode MS" w:hAnsi="Arial Unicode MS" w:eastAsia="Arial Unicode MS" w:cs="Arial Unicode MS"/>
           <w:color w:val="191F1D"/>
           <w:sz w:val="22"/>
         </w:rPr>
@@ -4590,7 +4590,7 @@
       </w:pPr>
       <w:r>
         <w:rPr>
-          <w:rFonts w:ascii="Calibri" w:hAnsi="Calibri" w:eastAsia="Arial Unicode MS" w:cs="Arial Unicode MS"/>
+          <w:rFonts w:ascii="Arial Unicode MS" w:hAnsi="Arial Unicode MS" w:eastAsia="Arial Unicode MS" w:cs="Arial Unicode MS"/>
           <w:color w:val="191F1D"/>
           <w:sz w:val="22"/>
         </w:rPr>
@@ -4604,7 +4604,7 @@
       </w:pPr>
       <w:r>
         <w:rPr>
-          <w:rFonts w:ascii="Calibri" w:hAnsi="Calibri" w:eastAsia="Arial Unicode MS" w:cs="Arial Unicode MS"/>
+          <w:rFonts w:ascii="Arial Unicode MS" w:hAnsi="Arial Unicode MS" w:eastAsia="Arial Unicode MS" w:cs="Arial Unicode MS"/>
           <w:b/>
           <w:color w:val="2E74B5"/>
           <w:sz w:val="32"/>
@@ -4619,7 +4619,7 @@
       </w:pPr>
       <w:r>
         <w:rPr>
-          <w:rFonts w:ascii="Calibri" w:hAnsi="Calibri" w:eastAsia="Arial Unicode MS" w:cs="Arial Unicode MS"/>
+          <w:rFonts w:ascii="Arial Unicode MS" w:hAnsi="Arial Unicode MS" w:eastAsia="Arial Unicode MS" w:cs="Arial Unicode MS"/>
           <w:b/>
           <w:color w:val="176B4D"/>
           <w:sz w:val="21"/>
@@ -4628,7 +4628,7 @@
       </w:r>
       <w:r>
         <w:rPr>
-          <w:rFonts w:ascii="Calibri" w:hAnsi="Calibri" w:eastAsia="Arial Unicode MS" w:cs="Arial Unicode MS"/>
+          <w:rFonts w:ascii="Arial Unicode MS" w:hAnsi="Arial Unicode MS" w:eastAsia="Arial Unicode MS" w:cs="Arial Unicode MS"/>
           <w:color w:val="191F1D"/>
           <w:sz w:val="21"/>
         </w:rPr>
@@ -4642,7 +4642,7 @@
       </w:pPr>
       <w:r>
         <w:rPr>
-          <w:rFonts w:ascii="Calibri" w:hAnsi="Calibri" w:eastAsia="Arial Unicode MS" w:cs="Arial Unicode MS"/>
+          <w:rFonts w:ascii="Arial Unicode MS" w:hAnsi="Arial Unicode MS" w:eastAsia="Arial Unicode MS" w:cs="Arial Unicode MS"/>
           <w:b/>
           <w:color w:val="176B4D"/>
           <w:sz w:val="21"/>
@@ -4651,7 +4651,7 @@
       </w:r>
       <w:r>
         <w:rPr>
-          <w:rFonts w:ascii="Calibri" w:hAnsi="Calibri" w:eastAsia="Arial Unicode MS" w:cs="Arial Unicode MS"/>
+          <w:rFonts w:ascii="Arial Unicode MS" w:hAnsi="Arial Unicode MS" w:eastAsia="Arial Unicode MS" w:cs="Arial Unicode MS"/>
           <w:color w:val="191F1D"/>
           <w:sz w:val="21"/>
         </w:rPr>
@@ -4665,7 +4665,7 @@
       </w:pPr>
       <w:r>
         <w:rPr>
-          <w:rFonts w:ascii="Calibri" w:hAnsi="Calibri" w:eastAsia="Arial Unicode MS" w:cs="Arial Unicode MS"/>
+          <w:rFonts w:ascii="Arial Unicode MS" w:hAnsi="Arial Unicode MS" w:eastAsia="Arial Unicode MS" w:cs="Arial Unicode MS"/>
           <w:b/>
           <w:color w:val="176B4D"/>
           <w:sz w:val="21"/>
@@ -4674,7 +4674,7 @@
       </w:r>
       <w:r>
         <w:rPr>
-          <w:rFonts w:ascii="Calibri" w:hAnsi="Calibri" w:eastAsia="Arial Unicode MS" w:cs="Arial Unicode MS"/>
+          <w:rFonts w:ascii="Arial Unicode MS" w:hAnsi="Arial Unicode MS" w:eastAsia="Arial Unicode MS" w:cs="Arial Unicode MS"/>
           <w:color w:val="191F1D"/>
           <w:sz w:val="21"/>
         </w:rPr>
@@ -4688,7 +4688,7 @@
       </w:pPr>
       <w:r>
         <w:rPr>
-          <w:rFonts w:ascii="Calibri" w:hAnsi="Calibri" w:eastAsia="Arial Unicode MS" w:cs="Arial Unicode MS"/>
+          <w:rFonts w:ascii="Arial Unicode MS" w:hAnsi="Arial Unicode MS" w:eastAsia="Arial Unicode MS" w:cs="Arial Unicode MS"/>
           <w:b/>
           <w:color w:val="176B4D"/>
           <w:sz w:val="21"/>
@@ -4697,7 +4697,7 @@
       </w:r>
       <w:r>
         <w:rPr>
-          <w:rFonts w:ascii="Calibri" w:hAnsi="Calibri" w:eastAsia="Arial Unicode MS" w:cs="Arial Unicode MS"/>
+          <w:rFonts w:ascii="Arial Unicode MS" w:hAnsi="Arial Unicode MS" w:eastAsia="Arial Unicode MS" w:cs="Arial Unicode MS"/>
           <w:color w:val="191F1D"/>
           <w:sz w:val="21"/>
         </w:rPr>
@@ -4741,7 +4741,7 @@
             <w:r/>
             <w:r>
               <w:rPr>
-                <w:rFonts w:ascii="Calibri" w:hAnsi="Calibri" w:eastAsia="Arial Unicode MS" w:cs="Arial Unicode MS"/>
+                <w:rFonts w:ascii="Arial Unicode MS" w:hAnsi="Arial Unicode MS" w:eastAsia="Arial Unicode MS" w:cs="Arial Unicode MS"/>
                 <w:b/>
                 <w:color w:val="1F4D78"/>
                 <w:sz w:val="18"/>
@@ -4769,7 +4769,7 @@
             <w:r/>
             <w:r>
               <w:rPr>
-                <w:rFonts w:ascii="Calibri" w:hAnsi="Calibri" w:eastAsia="Arial Unicode MS" w:cs="Arial Unicode MS"/>
+                <w:rFonts w:ascii="Arial Unicode MS" w:hAnsi="Arial Unicode MS" w:eastAsia="Arial Unicode MS" w:cs="Arial Unicode MS"/>
                 <w:b/>
                 <w:color w:val="1F4D78"/>
                 <w:sz w:val="18"/>
@@ -4797,7 +4797,7 @@
             <w:r/>
             <w:r>
               <w:rPr>
-                <w:rFonts w:ascii="Calibri" w:hAnsi="Calibri" w:eastAsia="Arial Unicode MS" w:cs="Arial Unicode MS"/>
+                <w:rFonts w:ascii="Arial Unicode MS" w:hAnsi="Arial Unicode MS" w:eastAsia="Arial Unicode MS" w:cs="Arial Unicode MS"/>
                 <w:b/>
                 <w:color w:val="1F4D78"/>
                 <w:sz w:val="18"/>
@@ -4829,7 +4829,7 @@
             <w:r/>
             <w:r>
               <w:rPr>
-                <w:rFonts w:ascii="Calibri" w:hAnsi="Calibri" w:eastAsia="Arial Unicode MS" w:cs="Arial Unicode MS"/>
+                <w:rFonts w:ascii="Arial Unicode MS" w:hAnsi="Arial Unicode MS" w:eastAsia="Arial Unicode MS" w:cs="Arial Unicode MS"/>
                 <w:b w:val="0"/>
                 <w:sz w:val="18"/>
               </w:rPr>
@@ -4855,7 +4855,7 @@
             <w:r/>
             <w:r>
               <w:rPr>
-                <w:rFonts w:ascii="Calibri" w:hAnsi="Calibri" w:eastAsia="Arial Unicode MS" w:cs="Arial Unicode MS"/>
+                <w:rFonts w:ascii="Arial Unicode MS" w:hAnsi="Arial Unicode MS" w:eastAsia="Arial Unicode MS" w:cs="Arial Unicode MS"/>
                 <w:b w:val="0"/>
                 <w:sz w:val="18"/>
               </w:rPr>
@@ -4881,7 +4881,7 @@
             <w:r/>
             <w:r>
               <w:rPr>
-                <w:rFonts w:ascii="Calibri" w:hAnsi="Calibri" w:eastAsia="Arial Unicode MS" w:cs="Arial Unicode MS"/>
+                <w:rFonts w:ascii="Arial Unicode MS" w:hAnsi="Arial Unicode MS" w:eastAsia="Arial Unicode MS" w:cs="Arial Unicode MS"/>
                 <w:b w:val="0"/>
                 <w:sz w:val="18"/>
               </w:rPr>
@@ -4912,7 +4912,7 @@
             <w:r/>
             <w:r>
               <w:rPr>
-                <w:rFonts w:ascii="Calibri" w:hAnsi="Calibri" w:eastAsia="Arial Unicode MS" w:cs="Arial Unicode MS"/>
+                <w:rFonts w:ascii="Arial Unicode MS" w:hAnsi="Arial Unicode MS" w:eastAsia="Arial Unicode MS" w:cs="Arial Unicode MS"/>
                 <w:b w:val="0"/>
                 <w:sz w:val="18"/>
               </w:rPr>
@@ -4938,7 +4938,7 @@
             <w:r/>
             <w:r>
               <w:rPr>
-                <w:rFonts w:ascii="Calibri" w:hAnsi="Calibri" w:eastAsia="Arial Unicode MS" w:cs="Arial Unicode MS"/>
+                <w:rFonts w:ascii="Arial Unicode MS" w:hAnsi="Arial Unicode MS" w:eastAsia="Arial Unicode MS" w:cs="Arial Unicode MS"/>
                 <w:b w:val="0"/>
                 <w:sz w:val="18"/>
               </w:rPr>
@@ -4964,7 +4964,7 @@
             <w:r/>
             <w:r>
               <w:rPr>
-                <w:rFonts w:ascii="Calibri" w:hAnsi="Calibri" w:eastAsia="Arial Unicode MS" w:cs="Arial Unicode MS"/>
+                <w:rFonts w:ascii="Arial Unicode MS" w:hAnsi="Arial Unicode MS" w:eastAsia="Arial Unicode MS" w:cs="Arial Unicode MS"/>
                 <w:b w:val="0"/>
                 <w:sz w:val="18"/>
               </w:rPr>
@@ -4995,7 +4995,7 @@
             <w:r/>
             <w:r>
               <w:rPr>
-                <w:rFonts w:ascii="Calibri" w:hAnsi="Calibri" w:eastAsia="Arial Unicode MS" w:cs="Arial Unicode MS"/>
+                <w:rFonts w:ascii="Arial Unicode MS" w:hAnsi="Arial Unicode MS" w:eastAsia="Arial Unicode MS" w:cs="Arial Unicode MS"/>
                 <w:b w:val="0"/>
                 <w:sz w:val="18"/>
               </w:rPr>
@@ -5021,7 +5021,7 @@
             <w:r/>
             <w:r>
               <w:rPr>
-                <w:rFonts w:ascii="Calibri" w:hAnsi="Calibri" w:eastAsia="Arial Unicode MS" w:cs="Arial Unicode MS"/>
+                <w:rFonts w:ascii="Arial Unicode MS" w:hAnsi="Arial Unicode MS" w:eastAsia="Arial Unicode MS" w:cs="Arial Unicode MS"/>
                 <w:b w:val="0"/>
                 <w:sz w:val="18"/>
               </w:rPr>
@@ -5047,7 +5047,7 @@
             <w:r/>
             <w:r>
               <w:rPr>
-                <w:rFonts w:ascii="Calibri" w:hAnsi="Calibri" w:eastAsia="Arial Unicode MS" w:cs="Arial Unicode MS"/>
+                <w:rFonts w:ascii="Arial Unicode MS" w:hAnsi="Arial Unicode MS" w:eastAsia="Arial Unicode MS" w:cs="Arial Unicode MS"/>
                 <w:b w:val="0"/>
                 <w:sz w:val="18"/>
               </w:rPr>
@@ -5078,7 +5078,7 @@
             <w:r/>
             <w:r>
               <w:rPr>
-                <w:rFonts w:ascii="Calibri" w:hAnsi="Calibri" w:eastAsia="Arial Unicode MS" w:cs="Arial Unicode MS"/>
+                <w:rFonts w:ascii="Arial Unicode MS" w:hAnsi="Arial Unicode MS" w:eastAsia="Arial Unicode MS" w:cs="Arial Unicode MS"/>
                 <w:b w:val="0"/>
                 <w:sz w:val="18"/>
               </w:rPr>
@@ -5104,7 +5104,7 @@
             <w:r/>
             <w:r>
               <w:rPr>
-                <w:rFonts w:ascii="Calibri" w:hAnsi="Calibri" w:eastAsia="Arial Unicode MS" w:cs="Arial Unicode MS"/>
+                <w:rFonts w:ascii="Arial Unicode MS" w:hAnsi="Arial Unicode MS" w:eastAsia="Arial Unicode MS" w:cs="Arial Unicode MS"/>
                 <w:b w:val="0"/>
                 <w:sz w:val="18"/>
               </w:rPr>
@@ -5130,7 +5130,7 @@
             <w:r/>
             <w:r>
               <w:rPr>
-                <w:rFonts w:ascii="Calibri" w:hAnsi="Calibri" w:eastAsia="Arial Unicode MS" w:cs="Arial Unicode MS"/>
+                <w:rFonts w:ascii="Arial Unicode MS" w:hAnsi="Arial Unicode MS" w:eastAsia="Arial Unicode MS" w:cs="Arial Unicode MS"/>
                 <w:b w:val="0"/>
                 <w:sz w:val="18"/>
               </w:rPr>
@@ -5152,7 +5152,7 @@
       </w:pPr>
       <w:r>
         <w:rPr>
-          <w:rFonts w:ascii="Calibri" w:hAnsi="Calibri" w:eastAsia="Arial Unicode MS" w:cs="Arial Unicode MS"/>
+          <w:rFonts w:ascii="Arial Unicode MS" w:hAnsi="Arial Unicode MS" w:eastAsia="Arial Unicode MS" w:cs="Arial Unicode MS"/>
           <w:b/>
           <w:color w:val="2E74B5"/>
           <w:sz w:val="32"/>
@@ -5167,7 +5167,7 @@
       </w:pPr>
       <w:r>
         <w:rPr>
-          <w:rFonts w:ascii="Calibri" w:hAnsi="Calibri" w:eastAsia="Arial Unicode MS" w:cs="Arial Unicode MS"/>
+          <w:rFonts w:ascii="Arial Unicode MS" w:hAnsi="Arial Unicode MS" w:eastAsia="Arial Unicode MS" w:cs="Arial Unicode MS"/>
           <w:b/>
           <w:color w:val="176B4D"/>
           <w:sz w:val="21"/>
@@ -5176,7 +5176,7 @@
       </w:r>
       <w:r>
         <w:rPr>
-          <w:rFonts w:ascii="Calibri" w:hAnsi="Calibri" w:eastAsia="Arial Unicode MS" w:cs="Arial Unicode MS"/>
+          <w:rFonts w:ascii="Arial Unicode MS" w:hAnsi="Arial Unicode MS" w:eastAsia="Arial Unicode MS" w:cs="Arial Unicode MS"/>
           <w:color w:val="191F1D"/>
           <w:sz w:val="21"/>
         </w:rPr>
@@ -5190,7 +5190,7 @@
       </w:pPr>
       <w:r>
         <w:rPr>
-          <w:rFonts w:ascii="Calibri" w:hAnsi="Calibri" w:eastAsia="Arial Unicode MS" w:cs="Arial Unicode MS"/>
+          <w:rFonts w:ascii="Arial Unicode MS" w:hAnsi="Arial Unicode MS" w:eastAsia="Arial Unicode MS" w:cs="Arial Unicode MS"/>
           <w:b/>
           <w:color w:val="176B4D"/>
           <w:sz w:val="21"/>
@@ -5199,7 +5199,7 @@
       </w:r>
       <w:r>
         <w:rPr>
-          <w:rFonts w:ascii="Calibri" w:hAnsi="Calibri" w:eastAsia="Arial Unicode MS" w:cs="Arial Unicode MS"/>
+          <w:rFonts w:ascii="Arial Unicode MS" w:hAnsi="Arial Unicode MS" w:eastAsia="Arial Unicode MS" w:cs="Arial Unicode MS"/>
           <w:color w:val="191F1D"/>
           <w:sz w:val="21"/>
         </w:rPr>
@@ -5213,7 +5213,7 @@
       </w:pPr>
       <w:r>
         <w:rPr>
-          <w:rFonts w:ascii="Calibri" w:hAnsi="Calibri" w:eastAsia="Arial Unicode MS" w:cs="Arial Unicode MS"/>
+          <w:rFonts w:ascii="Arial Unicode MS" w:hAnsi="Arial Unicode MS" w:eastAsia="Arial Unicode MS" w:cs="Arial Unicode MS"/>
           <w:b/>
           <w:color w:val="176B4D"/>
           <w:sz w:val="21"/>
@@ -5222,7 +5222,7 @@
       </w:r>
       <w:r>
         <w:rPr>
-          <w:rFonts w:ascii="Calibri" w:hAnsi="Calibri" w:eastAsia="Arial Unicode MS" w:cs="Arial Unicode MS"/>
+          <w:rFonts w:ascii="Arial Unicode MS" w:hAnsi="Arial Unicode MS" w:eastAsia="Arial Unicode MS" w:cs="Arial Unicode MS"/>
           <w:color w:val="191F1D"/>
           <w:sz w:val="21"/>
         </w:rPr>
@@ -5236,7 +5236,7 @@
       </w:pPr>
       <w:r>
         <w:rPr>
-          <w:rFonts w:ascii="Calibri" w:hAnsi="Calibri" w:eastAsia="Arial Unicode MS" w:cs="Arial Unicode MS"/>
+          <w:rFonts w:ascii="Arial Unicode MS" w:hAnsi="Arial Unicode MS" w:eastAsia="Arial Unicode MS" w:cs="Arial Unicode MS"/>
           <w:b/>
           <w:color w:val="176B4D"/>
           <w:sz w:val="21"/>
@@ -5245,7 +5245,7 @@
       </w:r>
       <w:r>
         <w:rPr>
-          <w:rFonts w:ascii="Calibri" w:hAnsi="Calibri" w:eastAsia="Arial Unicode MS" w:cs="Arial Unicode MS"/>
+          <w:rFonts w:ascii="Arial Unicode MS" w:hAnsi="Arial Unicode MS" w:eastAsia="Arial Unicode MS" w:cs="Arial Unicode MS"/>
           <w:color w:val="191F1D"/>
           <w:sz w:val="21"/>
         </w:rPr>
@@ -5259,7 +5259,7 @@
       </w:pPr>
       <w:r>
         <w:rPr>
-          <w:rFonts w:ascii="Calibri" w:hAnsi="Calibri" w:eastAsia="Arial Unicode MS" w:cs="Arial Unicode MS"/>
+          <w:rFonts w:ascii="Arial Unicode MS" w:hAnsi="Arial Unicode MS" w:eastAsia="Arial Unicode MS" w:cs="Arial Unicode MS"/>
           <w:b/>
           <w:color w:val="176B4D"/>
           <w:sz w:val="21"/>
@@ -5268,7 +5268,7 @@
       </w:r>
       <w:r>
         <w:rPr>
-          <w:rFonts w:ascii="Calibri" w:hAnsi="Calibri" w:eastAsia="Arial Unicode MS" w:cs="Arial Unicode MS"/>
+          <w:rFonts w:ascii="Arial Unicode MS" w:hAnsi="Arial Unicode MS" w:eastAsia="Arial Unicode MS" w:cs="Arial Unicode MS"/>
           <w:color w:val="191F1D"/>
           <w:sz w:val="21"/>
         </w:rPr>
@@ -5282,7 +5282,7 @@
       </w:pPr>
       <w:r>
         <w:rPr>
-          <w:rFonts w:ascii="Calibri" w:hAnsi="Calibri" w:eastAsia="Arial Unicode MS" w:cs="Arial Unicode MS"/>
+          <w:rFonts w:ascii="Arial Unicode MS" w:hAnsi="Arial Unicode MS" w:eastAsia="Arial Unicode MS" w:cs="Arial Unicode MS"/>
           <w:b/>
           <w:color w:val="176B4D"/>
           <w:sz w:val="21"/>
@@ -5291,7 +5291,7 @@
       </w:r>
       <w:r>
         <w:rPr>
-          <w:rFonts w:ascii="Calibri" w:hAnsi="Calibri" w:eastAsia="Arial Unicode MS" w:cs="Arial Unicode MS"/>
+          <w:rFonts w:ascii="Arial Unicode MS" w:hAnsi="Arial Unicode MS" w:eastAsia="Arial Unicode MS" w:cs="Arial Unicode MS"/>
           <w:color w:val="191F1D"/>
           <w:sz w:val="21"/>
         </w:rPr>
@@ -5305,7 +5305,7 @@
       </w:pPr>
       <w:r>
         <w:rPr>
-          <w:rFonts w:ascii="Calibri" w:hAnsi="Calibri" w:eastAsia="Arial Unicode MS" w:cs="Arial Unicode MS"/>
+          <w:rFonts w:ascii="Arial Unicode MS" w:hAnsi="Arial Unicode MS" w:eastAsia="Arial Unicode MS" w:cs="Arial Unicode MS"/>
           <w:b/>
           <w:color w:val="176B4D"/>
           <w:sz w:val="21"/>
@@ -5314,7 +5314,7 @@
       </w:r>
       <w:r>
         <w:rPr>
-          <w:rFonts w:ascii="Calibri" w:hAnsi="Calibri" w:eastAsia="Arial Unicode MS" w:cs="Arial Unicode MS"/>
+          <w:rFonts w:ascii="Arial Unicode MS" w:hAnsi="Arial Unicode MS" w:eastAsia="Arial Unicode MS" w:cs="Arial Unicode MS"/>
           <w:color w:val="191F1D"/>
           <w:sz w:val="21"/>
         </w:rPr>
@@ -5328,7 +5328,7 @@
       </w:pPr>
       <w:r>
         <w:rPr>
-          <w:rFonts w:ascii="Calibri" w:hAnsi="Calibri" w:eastAsia="Arial Unicode MS" w:cs="Arial Unicode MS"/>
+          <w:rFonts w:ascii="Arial Unicode MS" w:hAnsi="Arial Unicode MS" w:eastAsia="Arial Unicode MS" w:cs="Arial Unicode MS"/>
           <w:b/>
           <w:color w:val="176B4D"/>
           <w:sz w:val="21"/>
@@ -5337,7 +5337,7 @@
       </w:r>
       <w:r>
         <w:rPr>
-          <w:rFonts w:ascii="Calibri" w:hAnsi="Calibri" w:eastAsia="Arial Unicode MS" w:cs="Arial Unicode MS"/>
+          <w:rFonts w:ascii="Arial Unicode MS" w:hAnsi="Arial Unicode MS" w:eastAsia="Arial Unicode MS" w:cs="Arial Unicode MS"/>
           <w:color w:val="191F1D"/>
           <w:sz w:val="21"/>
         </w:rPr>
@@ -5360,17 +5360,14 @@
   <w:p>
     <w:pPr>
       <w:pStyle w:val="Footer"/>
-      <w:jc w:val="right"/>
+      <w:jc w:val="center"/>
     </w:pPr>
     <w:r>
       <w:rPr>
-        <w:rFonts w:ascii="Calibri" w:hAnsi="Calibri" w:eastAsia="Arial Unicode MS" w:cs="Arial Unicode MS"/>
+        <w:rFonts w:ascii="Arial Unicode MS" w:hAnsi="Arial Unicode MS" w:eastAsia="Arial Unicode MS" w:cs="Arial Unicode MS"/>
         <w:color w:val="5B6560"/>
         <w:sz w:val="17"/>
       </w:rPr>
-      <w:t xml:space="preserve">ReOrch 智策  |  Page </w:t>
-    </w:r>
-    <w:r>
       <w:fldChar w:fldCharType="begin"/>
       <w:instrText xml:space="preserve">PAGE</w:instrText>
       <w:fldChar w:fldCharType="separate"/>
@@ -5747,7 +5744,7 @@
       <w:spacing w:before="0" w:after="120" w:line="264" w:lineRule="auto"/>
     </w:pPr>
     <w:rPr>
-      <w:rFonts w:ascii="Calibri" w:hAnsi="Calibri" w:eastAsia="Arial Unicode MS"/>
+      <w:rFonts w:ascii="Arial Unicode MS" w:hAnsi="Arial Unicode MS" w:eastAsia="Arial Unicode MS"/>
       <w:sz w:val="22"/>
     </w:rPr>
   </w:style>

</xml_diff>

<commit_message>
fix: harden portfolio artifact delivery (#4)
</commit_message>
<xml_diff>
--- a/portfolio_artifacts/ReOrch_智策_AI产品作品集_20260727.docx
+++ b/portfolio_artifacts/ReOrch_智策_AI产品作品集_20260727.docx
@@ -13,7 +13,7 @@
       </w:pPr>
       <w:r>
         <w:rPr>
-          <w:rFonts w:ascii="Calibri" w:hAnsi="Calibri" w:eastAsia="Arial Unicode MS" w:cs="Arial Unicode MS"/>
+          <w:rFonts w:ascii="Arial Unicode MS" w:hAnsi="Arial Unicode MS" w:eastAsia="Arial Unicode MS" w:cs="Arial Unicode MS"/>
           <w:b/>
           <w:color w:val="191F1D"/>
           <w:sz w:val="54"/>
@@ -27,7 +27,7 @@
       </w:pPr>
       <w:r>
         <w:rPr>
-          <w:rFonts w:ascii="Calibri" w:hAnsi="Calibri" w:eastAsia="Arial Unicode MS" w:cs="Arial Unicode MS"/>
+          <w:rFonts w:ascii="Arial Unicode MS" w:hAnsi="Arial Unicode MS" w:eastAsia="Arial Unicode MS" w:cs="Arial Unicode MS"/>
           <w:color w:val="1F4D78"/>
           <w:sz w:val="30"/>
         </w:rPr>
@@ -40,7 +40,7 @@
       </w:pPr>
       <w:r>
         <w:rPr>
-          <w:rFonts w:ascii="Calibri" w:hAnsi="Calibri" w:eastAsia="Arial Unicode MS" w:cs="Arial Unicode MS"/>
+          <w:rFonts w:ascii="Arial Unicode MS" w:hAnsi="Arial Unicode MS" w:eastAsia="Arial Unicode MS" w:cs="Arial Unicode MS"/>
           <w:b/>
           <w:color w:val="191F1D"/>
           <w:sz w:val="21"/>
@@ -49,7 +49,7 @@
       </w:r>
       <w:r>
         <w:rPr>
-          <w:rFonts w:ascii="Calibri" w:hAnsi="Calibri" w:eastAsia="Arial Unicode MS" w:cs="Arial Unicode MS"/>
+          <w:rFonts w:ascii="Arial Unicode MS" w:hAnsi="Arial Unicode MS" w:eastAsia="Arial Unicode MS" w:cs="Arial Unicode MS"/>
           <w:color w:val="191F1D"/>
           <w:sz w:val="21"/>
         </w:rPr>
@@ -62,7 +62,7 @@
       </w:pPr>
       <w:r>
         <w:rPr>
-          <w:rFonts w:ascii="Calibri" w:hAnsi="Calibri" w:eastAsia="Arial Unicode MS" w:cs="Arial Unicode MS"/>
+          <w:rFonts w:ascii="Arial Unicode MS" w:hAnsi="Arial Unicode MS" w:eastAsia="Arial Unicode MS" w:cs="Arial Unicode MS"/>
           <w:b/>
           <w:color w:val="191F1D"/>
           <w:sz w:val="21"/>
@@ -71,7 +71,7 @@
       </w:r>
       <w:r>
         <w:rPr>
-          <w:rFonts w:ascii="Calibri" w:hAnsi="Calibri" w:eastAsia="Arial Unicode MS" w:cs="Arial Unicode MS"/>
+          <w:rFonts w:ascii="Arial Unicode MS" w:hAnsi="Arial Unicode MS" w:eastAsia="Arial Unicode MS" w:cs="Arial Unicode MS"/>
           <w:color w:val="191F1D"/>
           <w:sz w:val="21"/>
         </w:rPr>
@@ -84,7 +84,7 @@
       </w:pPr>
       <w:r>
         <w:rPr>
-          <w:rFonts w:ascii="Calibri" w:hAnsi="Calibri" w:eastAsia="Arial Unicode MS" w:cs="Arial Unicode MS"/>
+          <w:rFonts w:ascii="Arial Unicode MS" w:hAnsi="Arial Unicode MS" w:eastAsia="Arial Unicode MS" w:cs="Arial Unicode MS"/>
           <w:b/>
           <w:color w:val="191F1D"/>
           <w:sz w:val="21"/>
@@ -93,7 +93,7 @@
       </w:r>
       <w:r>
         <w:rPr>
-          <w:rFonts w:ascii="Calibri" w:hAnsi="Calibri" w:eastAsia="Arial Unicode MS" w:cs="Arial Unicode MS"/>
+          <w:rFonts w:ascii="Arial Unicode MS" w:hAnsi="Arial Unicode MS" w:eastAsia="Arial Unicode MS" w:cs="Arial Unicode MS"/>
           <w:color w:val="191F1D"/>
           <w:sz w:val="21"/>
         </w:rPr>
@@ -106,7 +106,7 @@
       </w:pPr>
       <w:r>
         <w:rPr>
-          <w:rFonts w:ascii="Calibri" w:hAnsi="Calibri" w:eastAsia="Arial Unicode MS" w:cs="Arial Unicode MS"/>
+          <w:rFonts w:ascii="Arial Unicode MS" w:hAnsi="Arial Unicode MS" w:eastAsia="Arial Unicode MS" w:cs="Arial Unicode MS"/>
           <w:b/>
           <w:color w:val="191F1D"/>
           <w:sz w:val="21"/>
@@ -115,7 +115,7 @@
       </w:r>
       <w:r>
         <w:rPr>
-          <w:rFonts w:ascii="Calibri" w:hAnsi="Calibri" w:eastAsia="Arial Unicode MS" w:cs="Arial Unicode MS"/>
+          <w:rFonts w:ascii="Arial Unicode MS" w:hAnsi="Arial Unicode MS" w:eastAsia="Arial Unicode MS" w:cs="Arial Unicode MS"/>
           <w:color w:val="191F1D"/>
           <w:sz w:val="21"/>
         </w:rPr>
@@ -128,7 +128,7 @@
       </w:pPr>
       <w:r>
         <w:rPr>
-          <w:rFonts w:ascii="Calibri" w:hAnsi="Calibri" w:eastAsia="Arial Unicode MS" w:cs="Arial Unicode MS"/>
+          <w:rFonts w:ascii="Arial Unicode MS" w:hAnsi="Arial Unicode MS" w:eastAsia="Arial Unicode MS" w:cs="Arial Unicode MS"/>
           <w:b/>
           <w:color w:val="191F1D"/>
           <w:sz w:val="21"/>
@@ -137,7 +137,7 @@
       </w:r>
       <w:r>
         <w:rPr>
-          <w:rFonts w:ascii="Calibri" w:hAnsi="Calibri" w:eastAsia="Arial Unicode MS" w:cs="Arial Unicode MS"/>
+          <w:rFonts w:ascii="Arial Unicode MS" w:hAnsi="Arial Unicode MS" w:eastAsia="Arial Unicode MS" w:cs="Arial Unicode MS"/>
           <w:color w:val="191F1D"/>
           <w:sz w:val="21"/>
         </w:rPr>
@@ -150,7 +150,7 @@
       </w:pPr>
       <w:r>
         <w:rPr>
-          <w:rFonts w:ascii="Calibri" w:hAnsi="Calibri" w:eastAsia="Arial Unicode MS" w:cs="Arial Unicode MS"/>
+          <w:rFonts w:ascii="Arial Unicode MS" w:hAnsi="Arial Unicode MS" w:eastAsia="Arial Unicode MS" w:cs="Arial Unicode MS"/>
           <w:b/>
           <w:color w:val="191F1D"/>
           <w:sz w:val="21"/>
@@ -159,7 +159,7 @@
       </w:r>
       <w:r>
         <w:rPr>
-          <w:rFonts w:ascii="Calibri" w:hAnsi="Calibri" w:eastAsia="Arial Unicode MS" w:cs="Arial Unicode MS"/>
+          <w:rFonts w:ascii="Arial Unicode MS" w:hAnsi="Arial Unicode MS" w:eastAsia="Arial Unicode MS" w:cs="Arial Unicode MS"/>
           <w:color w:val="191F1D"/>
           <w:sz w:val="21"/>
         </w:rPr>
@@ -203,7 +203,7 @@
             <w:r/>
             <w:r>
               <w:rPr>
-                <w:rFonts w:ascii="Calibri" w:hAnsi="Calibri" w:eastAsia="Arial Unicode MS" w:cs="Arial Unicode MS"/>
+                <w:rFonts w:ascii="Arial Unicode MS" w:hAnsi="Arial Unicode MS" w:eastAsia="Arial Unicode MS" w:cs="Arial Unicode MS"/>
                 <w:b/>
                 <w:color w:val="176B4D"/>
                 <w:sz w:val="18"/>
@@ -222,7 +222,7 @@
       </w:pPr>
       <w:r>
         <w:rPr>
-          <w:rFonts w:ascii="Calibri" w:hAnsi="Calibri" w:eastAsia="Arial Unicode MS" w:cs="Arial Unicode MS"/>
+          <w:rFonts w:ascii="Arial Unicode MS" w:hAnsi="Arial Unicode MS" w:eastAsia="Arial Unicode MS" w:cs="Arial Unicode MS"/>
           <w:b/>
           <w:color w:val="2E74B5"/>
           <w:sz w:val="32"/>
@@ -236,7 +236,7 @@
       </w:pPr>
       <w:r>
         <w:rPr>
-          <w:rFonts w:ascii="Calibri" w:hAnsi="Calibri" w:eastAsia="Arial Unicode MS" w:cs="Arial Unicode MS"/>
+          <w:rFonts w:ascii="Arial Unicode MS" w:hAnsi="Arial Unicode MS" w:eastAsia="Arial Unicode MS" w:cs="Arial Unicode MS"/>
           <w:color w:val="191F1D"/>
           <w:sz w:val="22"/>
         </w:rPr>
@@ -280,7 +280,7 @@
             <w:r/>
             <w:r>
               <w:rPr>
-                <w:rFonts w:ascii="Calibri" w:hAnsi="Calibri" w:eastAsia="Arial Unicode MS" w:cs="Arial Unicode MS"/>
+                <w:rFonts w:ascii="Arial Unicode MS" w:hAnsi="Arial Unicode MS" w:eastAsia="Arial Unicode MS" w:cs="Arial Unicode MS"/>
                 <w:b/>
                 <w:color w:val="1F4D78"/>
                 <w:sz w:val="18"/>
@@ -308,7 +308,7 @@
             <w:r/>
             <w:r>
               <w:rPr>
-                <w:rFonts w:ascii="Calibri" w:hAnsi="Calibri" w:eastAsia="Arial Unicode MS" w:cs="Arial Unicode MS"/>
+                <w:rFonts w:ascii="Arial Unicode MS" w:hAnsi="Arial Unicode MS" w:eastAsia="Arial Unicode MS" w:cs="Arial Unicode MS"/>
                 <w:b/>
                 <w:color w:val="1F4D78"/>
                 <w:sz w:val="18"/>
@@ -336,7 +336,7 @@
             <w:r/>
             <w:r>
               <w:rPr>
-                <w:rFonts w:ascii="Calibri" w:hAnsi="Calibri" w:eastAsia="Arial Unicode MS" w:cs="Arial Unicode MS"/>
+                <w:rFonts w:ascii="Arial Unicode MS" w:hAnsi="Arial Unicode MS" w:eastAsia="Arial Unicode MS" w:cs="Arial Unicode MS"/>
                 <w:b/>
                 <w:color w:val="1F4D78"/>
                 <w:sz w:val="18"/>
@@ -368,7 +368,7 @@
             <w:r/>
             <w:r>
               <w:rPr>
-                <w:rFonts w:ascii="Calibri" w:hAnsi="Calibri" w:eastAsia="Arial Unicode MS" w:cs="Arial Unicode MS"/>
+                <w:rFonts w:ascii="Arial Unicode MS" w:hAnsi="Arial Unicode MS" w:eastAsia="Arial Unicode MS" w:cs="Arial Unicode MS"/>
                 <w:b w:val="0"/>
                 <w:sz w:val="18"/>
               </w:rPr>
@@ -394,7 +394,7 @@
             <w:r/>
             <w:r>
               <w:rPr>
-                <w:rFonts w:ascii="Calibri" w:hAnsi="Calibri" w:eastAsia="Arial Unicode MS" w:cs="Arial Unicode MS"/>
+                <w:rFonts w:ascii="Arial Unicode MS" w:hAnsi="Arial Unicode MS" w:eastAsia="Arial Unicode MS" w:cs="Arial Unicode MS"/>
                 <w:b w:val="0"/>
                 <w:sz w:val="18"/>
               </w:rPr>
@@ -420,7 +420,7 @@
             <w:r/>
             <w:r>
               <w:rPr>
-                <w:rFonts w:ascii="Calibri" w:hAnsi="Calibri" w:eastAsia="Arial Unicode MS" w:cs="Arial Unicode MS"/>
+                <w:rFonts w:ascii="Arial Unicode MS" w:hAnsi="Arial Unicode MS" w:eastAsia="Arial Unicode MS" w:cs="Arial Unicode MS"/>
                 <w:b w:val="0"/>
                 <w:sz w:val="18"/>
               </w:rPr>
@@ -451,7 +451,7 @@
             <w:r/>
             <w:r>
               <w:rPr>
-                <w:rFonts w:ascii="Calibri" w:hAnsi="Calibri" w:eastAsia="Arial Unicode MS" w:cs="Arial Unicode MS"/>
+                <w:rFonts w:ascii="Arial Unicode MS" w:hAnsi="Arial Unicode MS" w:eastAsia="Arial Unicode MS" w:cs="Arial Unicode MS"/>
                 <w:b w:val="0"/>
                 <w:sz w:val="18"/>
               </w:rPr>
@@ -477,7 +477,7 @@
             <w:r/>
             <w:r>
               <w:rPr>
-                <w:rFonts w:ascii="Calibri" w:hAnsi="Calibri" w:eastAsia="Arial Unicode MS" w:cs="Arial Unicode MS"/>
+                <w:rFonts w:ascii="Arial Unicode MS" w:hAnsi="Arial Unicode MS" w:eastAsia="Arial Unicode MS" w:cs="Arial Unicode MS"/>
                 <w:b w:val="0"/>
                 <w:sz w:val="18"/>
               </w:rPr>
@@ -503,7 +503,7 @@
             <w:r/>
             <w:r>
               <w:rPr>
-                <w:rFonts w:ascii="Calibri" w:hAnsi="Calibri" w:eastAsia="Arial Unicode MS" w:cs="Arial Unicode MS"/>
+                <w:rFonts w:ascii="Arial Unicode MS" w:hAnsi="Arial Unicode MS" w:eastAsia="Arial Unicode MS" w:cs="Arial Unicode MS"/>
                 <w:b w:val="0"/>
                 <w:sz w:val="18"/>
               </w:rPr>
@@ -534,7 +534,7 @@
             <w:r/>
             <w:r>
               <w:rPr>
-                <w:rFonts w:ascii="Calibri" w:hAnsi="Calibri" w:eastAsia="Arial Unicode MS" w:cs="Arial Unicode MS"/>
+                <w:rFonts w:ascii="Arial Unicode MS" w:hAnsi="Arial Unicode MS" w:eastAsia="Arial Unicode MS" w:cs="Arial Unicode MS"/>
                 <w:b w:val="0"/>
                 <w:sz w:val="18"/>
               </w:rPr>
@@ -560,7 +560,7 @@
             <w:r/>
             <w:r>
               <w:rPr>
-                <w:rFonts w:ascii="Calibri" w:hAnsi="Calibri" w:eastAsia="Arial Unicode MS" w:cs="Arial Unicode MS"/>
+                <w:rFonts w:ascii="Arial Unicode MS" w:hAnsi="Arial Unicode MS" w:eastAsia="Arial Unicode MS" w:cs="Arial Unicode MS"/>
                 <w:b w:val="0"/>
                 <w:sz w:val="18"/>
               </w:rPr>
@@ -586,7 +586,7 @@
             <w:r/>
             <w:r>
               <w:rPr>
-                <w:rFonts w:ascii="Calibri" w:hAnsi="Calibri" w:eastAsia="Arial Unicode MS" w:cs="Arial Unicode MS"/>
+                <w:rFonts w:ascii="Arial Unicode MS" w:hAnsi="Arial Unicode MS" w:eastAsia="Arial Unicode MS" w:cs="Arial Unicode MS"/>
                 <w:b w:val="0"/>
                 <w:sz w:val="18"/>
               </w:rPr>
@@ -617,7 +617,7 @@
             <w:r/>
             <w:r>
               <w:rPr>
-                <w:rFonts w:ascii="Calibri" w:hAnsi="Calibri" w:eastAsia="Arial Unicode MS" w:cs="Arial Unicode MS"/>
+                <w:rFonts w:ascii="Arial Unicode MS" w:hAnsi="Arial Unicode MS" w:eastAsia="Arial Unicode MS" w:cs="Arial Unicode MS"/>
                 <w:b w:val="0"/>
                 <w:sz w:val="18"/>
               </w:rPr>
@@ -643,7 +643,7 @@
             <w:r/>
             <w:r>
               <w:rPr>
-                <w:rFonts w:ascii="Calibri" w:hAnsi="Calibri" w:eastAsia="Arial Unicode MS" w:cs="Arial Unicode MS"/>
+                <w:rFonts w:ascii="Arial Unicode MS" w:hAnsi="Arial Unicode MS" w:eastAsia="Arial Unicode MS" w:cs="Arial Unicode MS"/>
                 <w:b w:val="0"/>
                 <w:sz w:val="18"/>
               </w:rPr>
@@ -669,7 +669,7 @@
             <w:r/>
             <w:r>
               <w:rPr>
-                <w:rFonts w:ascii="Calibri" w:hAnsi="Calibri" w:eastAsia="Arial Unicode MS" w:cs="Arial Unicode MS"/>
+                <w:rFonts w:ascii="Arial Unicode MS" w:hAnsi="Arial Unicode MS" w:eastAsia="Arial Unicode MS" w:cs="Arial Unicode MS"/>
                 <w:b w:val="0"/>
                 <w:sz w:val="18"/>
               </w:rPr>
@@ -731,7 +731,7 @@
       </w:pPr>
       <w:r>
         <w:rPr>
-          <w:rFonts w:ascii="Calibri" w:hAnsi="Calibri" w:eastAsia="Arial Unicode MS" w:cs="Arial Unicode MS"/>
+          <w:rFonts w:ascii="Arial Unicode MS" w:hAnsi="Arial Unicode MS" w:eastAsia="Arial Unicode MS" w:cs="Arial Unicode MS"/>
           <w:color w:val="5B6560"/>
           <w:sz w:val="17"/>
         </w:rPr>
@@ -745,7 +745,7 @@
       </w:pPr>
       <w:r>
         <w:rPr>
-          <w:rFonts w:ascii="Calibri" w:hAnsi="Calibri" w:eastAsia="Arial Unicode MS" w:cs="Arial Unicode MS"/>
+          <w:rFonts w:ascii="Arial Unicode MS" w:hAnsi="Arial Unicode MS" w:eastAsia="Arial Unicode MS" w:cs="Arial Unicode MS"/>
           <w:b/>
           <w:color w:val="2E74B5"/>
           <w:sz w:val="32"/>
@@ -759,7 +759,7 @@
       </w:pPr>
       <w:r>
         <w:rPr>
-          <w:rFonts w:ascii="Calibri" w:hAnsi="Calibri" w:eastAsia="Arial Unicode MS" w:cs="Arial Unicode MS"/>
+          <w:rFonts w:ascii="Arial Unicode MS" w:hAnsi="Arial Unicode MS" w:eastAsia="Arial Unicode MS" w:cs="Arial Unicode MS"/>
           <w:color w:val="191F1D"/>
           <w:sz w:val="22"/>
         </w:rPr>
@@ -772,7 +772,7 @@
       </w:pPr>
       <w:r>
         <w:rPr>
-          <w:rFonts w:ascii="Calibri" w:hAnsi="Calibri" w:eastAsia="Arial Unicode MS" w:cs="Arial Unicode MS"/>
+          <w:rFonts w:ascii="Arial Unicode MS" w:hAnsi="Arial Unicode MS" w:eastAsia="Arial Unicode MS" w:cs="Arial Unicode MS"/>
           <w:color w:val="191F1D"/>
           <w:sz w:val="22"/>
         </w:rPr>
@@ -786,7 +786,7 @@
       </w:pPr>
       <w:r>
         <w:rPr>
-          <w:rFonts w:ascii="Calibri" w:hAnsi="Calibri" w:eastAsia="Arial Unicode MS" w:cs="Arial Unicode MS"/>
+          <w:rFonts w:ascii="Arial Unicode MS" w:hAnsi="Arial Unicode MS" w:eastAsia="Arial Unicode MS" w:cs="Arial Unicode MS"/>
           <w:b/>
           <w:color w:val="176B4D"/>
           <w:sz w:val="21"/>
@@ -795,7 +795,7 @@
       </w:r>
       <w:r>
         <w:rPr>
-          <w:rFonts w:ascii="Calibri" w:hAnsi="Calibri" w:eastAsia="Arial Unicode MS" w:cs="Arial Unicode MS"/>
+          <w:rFonts w:ascii="Arial Unicode MS" w:hAnsi="Arial Unicode MS" w:eastAsia="Arial Unicode MS" w:cs="Arial Unicode MS"/>
           <w:color w:val="191F1D"/>
           <w:sz w:val="21"/>
         </w:rPr>
@@ -809,7 +809,7 @@
       </w:pPr>
       <w:r>
         <w:rPr>
-          <w:rFonts w:ascii="Calibri" w:hAnsi="Calibri" w:eastAsia="Arial Unicode MS" w:cs="Arial Unicode MS"/>
+          <w:rFonts w:ascii="Arial Unicode MS" w:hAnsi="Arial Unicode MS" w:eastAsia="Arial Unicode MS" w:cs="Arial Unicode MS"/>
           <w:b/>
           <w:color w:val="176B4D"/>
           <w:sz w:val="21"/>
@@ -818,7 +818,7 @@
       </w:r>
       <w:r>
         <w:rPr>
-          <w:rFonts w:ascii="Calibri" w:hAnsi="Calibri" w:eastAsia="Arial Unicode MS" w:cs="Arial Unicode MS"/>
+          <w:rFonts w:ascii="Arial Unicode MS" w:hAnsi="Arial Unicode MS" w:eastAsia="Arial Unicode MS" w:cs="Arial Unicode MS"/>
           <w:color w:val="191F1D"/>
           <w:sz w:val="21"/>
         </w:rPr>
@@ -832,7 +832,7 @@
       </w:pPr>
       <w:r>
         <w:rPr>
-          <w:rFonts w:ascii="Calibri" w:hAnsi="Calibri" w:eastAsia="Arial Unicode MS" w:cs="Arial Unicode MS"/>
+          <w:rFonts w:ascii="Arial Unicode MS" w:hAnsi="Arial Unicode MS" w:eastAsia="Arial Unicode MS" w:cs="Arial Unicode MS"/>
           <w:b/>
           <w:color w:val="176B4D"/>
           <w:sz w:val="21"/>
@@ -841,7 +841,7 @@
       </w:r>
       <w:r>
         <w:rPr>
-          <w:rFonts w:ascii="Calibri" w:hAnsi="Calibri" w:eastAsia="Arial Unicode MS" w:cs="Arial Unicode MS"/>
+          <w:rFonts w:ascii="Arial Unicode MS" w:hAnsi="Arial Unicode MS" w:eastAsia="Arial Unicode MS" w:cs="Arial Unicode MS"/>
           <w:color w:val="191F1D"/>
           <w:sz w:val="21"/>
         </w:rPr>
@@ -855,7 +855,7 @@
       </w:pPr>
       <w:r>
         <w:rPr>
-          <w:rFonts w:ascii="Calibri" w:hAnsi="Calibri" w:eastAsia="Arial Unicode MS" w:cs="Arial Unicode MS"/>
+          <w:rFonts w:ascii="Arial Unicode MS" w:hAnsi="Arial Unicode MS" w:eastAsia="Arial Unicode MS" w:cs="Arial Unicode MS"/>
           <w:b/>
           <w:color w:val="176B4D"/>
           <w:sz w:val="21"/>
@@ -864,7 +864,7 @@
       </w:r>
       <w:r>
         <w:rPr>
-          <w:rFonts w:ascii="Calibri" w:hAnsi="Calibri" w:eastAsia="Arial Unicode MS" w:cs="Arial Unicode MS"/>
+          <w:rFonts w:ascii="Arial Unicode MS" w:hAnsi="Arial Unicode MS" w:eastAsia="Arial Unicode MS" w:cs="Arial Unicode MS"/>
           <w:color w:val="191F1D"/>
           <w:sz w:val="21"/>
         </w:rPr>
@@ -878,7 +878,7 @@
       </w:pPr>
       <w:r>
         <w:rPr>
-          <w:rFonts w:ascii="Calibri" w:hAnsi="Calibri" w:eastAsia="Arial Unicode MS" w:cs="Arial Unicode MS"/>
+          <w:rFonts w:ascii="Arial Unicode MS" w:hAnsi="Arial Unicode MS" w:eastAsia="Arial Unicode MS" w:cs="Arial Unicode MS"/>
           <w:b/>
           <w:color w:val="2E74B5"/>
           <w:sz w:val="32"/>
@@ -923,7 +923,7 @@
             <w:r/>
             <w:r>
               <w:rPr>
-                <w:rFonts w:ascii="Calibri" w:hAnsi="Calibri" w:eastAsia="Arial Unicode MS" w:cs="Arial Unicode MS"/>
+                <w:rFonts w:ascii="Arial Unicode MS" w:hAnsi="Arial Unicode MS" w:eastAsia="Arial Unicode MS" w:cs="Arial Unicode MS"/>
                 <w:b/>
                 <w:color w:val="1F4D78"/>
                 <w:sz w:val="18"/>
@@ -951,7 +951,7 @@
             <w:r/>
             <w:r>
               <w:rPr>
-                <w:rFonts w:ascii="Calibri" w:hAnsi="Calibri" w:eastAsia="Arial Unicode MS" w:cs="Arial Unicode MS"/>
+                <w:rFonts w:ascii="Arial Unicode MS" w:hAnsi="Arial Unicode MS" w:eastAsia="Arial Unicode MS" w:cs="Arial Unicode MS"/>
                 <w:b/>
                 <w:color w:val="1F4D78"/>
                 <w:sz w:val="18"/>
@@ -979,7 +979,7 @@
             <w:r/>
             <w:r>
               <w:rPr>
-                <w:rFonts w:ascii="Calibri" w:hAnsi="Calibri" w:eastAsia="Arial Unicode MS" w:cs="Arial Unicode MS"/>
+                <w:rFonts w:ascii="Arial Unicode MS" w:hAnsi="Arial Unicode MS" w:eastAsia="Arial Unicode MS" w:cs="Arial Unicode MS"/>
                 <w:b/>
                 <w:color w:val="1F4D78"/>
                 <w:sz w:val="18"/>
@@ -1011,7 +1011,7 @@
             <w:r/>
             <w:r>
               <w:rPr>
-                <w:rFonts w:ascii="Calibri" w:hAnsi="Calibri" w:eastAsia="Arial Unicode MS" w:cs="Arial Unicode MS"/>
+                <w:rFonts w:ascii="Arial Unicode MS" w:hAnsi="Arial Unicode MS" w:eastAsia="Arial Unicode MS" w:cs="Arial Unicode MS"/>
                 <w:b w:val="0"/>
                 <w:sz w:val="18"/>
               </w:rPr>
@@ -1037,7 +1037,7 @@
             <w:r/>
             <w:r>
               <w:rPr>
-                <w:rFonts w:ascii="Calibri" w:hAnsi="Calibri" w:eastAsia="Arial Unicode MS" w:cs="Arial Unicode MS"/>
+                <w:rFonts w:ascii="Arial Unicode MS" w:hAnsi="Arial Unicode MS" w:eastAsia="Arial Unicode MS" w:cs="Arial Unicode MS"/>
                 <w:b w:val="0"/>
                 <w:sz w:val="18"/>
               </w:rPr>
@@ -1063,7 +1063,7 @@
             <w:r/>
             <w:r>
               <w:rPr>
-                <w:rFonts w:ascii="Calibri" w:hAnsi="Calibri" w:eastAsia="Arial Unicode MS" w:cs="Arial Unicode MS"/>
+                <w:rFonts w:ascii="Arial Unicode MS" w:hAnsi="Arial Unicode MS" w:eastAsia="Arial Unicode MS" w:cs="Arial Unicode MS"/>
                 <w:b w:val="0"/>
                 <w:sz w:val="18"/>
               </w:rPr>
@@ -1094,7 +1094,7 @@
             <w:r/>
             <w:r>
               <w:rPr>
-                <w:rFonts w:ascii="Calibri" w:hAnsi="Calibri" w:eastAsia="Arial Unicode MS" w:cs="Arial Unicode MS"/>
+                <w:rFonts w:ascii="Arial Unicode MS" w:hAnsi="Arial Unicode MS" w:eastAsia="Arial Unicode MS" w:cs="Arial Unicode MS"/>
                 <w:b w:val="0"/>
                 <w:sz w:val="18"/>
               </w:rPr>
@@ -1120,7 +1120,7 @@
             <w:r/>
             <w:r>
               <w:rPr>
-                <w:rFonts w:ascii="Calibri" w:hAnsi="Calibri" w:eastAsia="Arial Unicode MS" w:cs="Arial Unicode MS"/>
+                <w:rFonts w:ascii="Arial Unicode MS" w:hAnsi="Arial Unicode MS" w:eastAsia="Arial Unicode MS" w:cs="Arial Unicode MS"/>
                 <w:b w:val="0"/>
                 <w:sz w:val="18"/>
               </w:rPr>
@@ -1146,7 +1146,7 @@
             <w:r/>
             <w:r>
               <w:rPr>
-                <w:rFonts w:ascii="Calibri" w:hAnsi="Calibri" w:eastAsia="Arial Unicode MS" w:cs="Arial Unicode MS"/>
+                <w:rFonts w:ascii="Arial Unicode MS" w:hAnsi="Arial Unicode MS" w:eastAsia="Arial Unicode MS" w:cs="Arial Unicode MS"/>
                 <w:b w:val="0"/>
                 <w:sz w:val="18"/>
               </w:rPr>
@@ -1177,7 +1177,7 @@
             <w:r/>
             <w:r>
               <w:rPr>
-                <w:rFonts w:ascii="Calibri" w:hAnsi="Calibri" w:eastAsia="Arial Unicode MS" w:cs="Arial Unicode MS"/>
+                <w:rFonts w:ascii="Arial Unicode MS" w:hAnsi="Arial Unicode MS" w:eastAsia="Arial Unicode MS" w:cs="Arial Unicode MS"/>
                 <w:b w:val="0"/>
                 <w:sz w:val="18"/>
               </w:rPr>
@@ -1203,7 +1203,7 @@
             <w:r/>
             <w:r>
               <w:rPr>
-                <w:rFonts w:ascii="Calibri" w:hAnsi="Calibri" w:eastAsia="Arial Unicode MS" w:cs="Arial Unicode MS"/>
+                <w:rFonts w:ascii="Arial Unicode MS" w:hAnsi="Arial Unicode MS" w:eastAsia="Arial Unicode MS" w:cs="Arial Unicode MS"/>
                 <w:b w:val="0"/>
                 <w:sz w:val="18"/>
               </w:rPr>
@@ -1229,7 +1229,7 @@
             <w:r/>
             <w:r>
               <w:rPr>
-                <w:rFonts w:ascii="Calibri" w:hAnsi="Calibri" w:eastAsia="Arial Unicode MS" w:cs="Arial Unicode MS"/>
+                <w:rFonts w:ascii="Arial Unicode MS" w:hAnsi="Arial Unicode MS" w:eastAsia="Arial Unicode MS" w:cs="Arial Unicode MS"/>
                 <w:b w:val="0"/>
                 <w:sz w:val="18"/>
               </w:rPr>
@@ -1260,7 +1260,7 @@
             <w:r/>
             <w:r>
               <w:rPr>
-                <w:rFonts w:ascii="Calibri" w:hAnsi="Calibri" w:eastAsia="Arial Unicode MS" w:cs="Arial Unicode MS"/>
+                <w:rFonts w:ascii="Arial Unicode MS" w:hAnsi="Arial Unicode MS" w:eastAsia="Arial Unicode MS" w:cs="Arial Unicode MS"/>
                 <w:b w:val="0"/>
                 <w:sz w:val="18"/>
               </w:rPr>
@@ -1286,7 +1286,7 @@
             <w:r/>
             <w:r>
               <w:rPr>
-                <w:rFonts w:ascii="Calibri" w:hAnsi="Calibri" w:eastAsia="Arial Unicode MS" w:cs="Arial Unicode MS"/>
+                <w:rFonts w:ascii="Arial Unicode MS" w:hAnsi="Arial Unicode MS" w:eastAsia="Arial Unicode MS" w:cs="Arial Unicode MS"/>
                 <w:b w:val="0"/>
                 <w:sz w:val="18"/>
               </w:rPr>
@@ -1312,7 +1312,7 @@
             <w:r/>
             <w:r>
               <w:rPr>
-                <w:rFonts w:ascii="Calibri" w:hAnsi="Calibri" w:eastAsia="Arial Unicode MS" w:cs="Arial Unicode MS"/>
+                <w:rFonts w:ascii="Arial Unicode MS" w:hAnsi="Arial Unicode MS" w:eastAsia="Arial Unicode MS" w:cs="Arial Unicode MS"/>
                 <w:b w:val="0"/>
                 <w:sz w:val="18"/>
               </w:rPr>
@@ -1343,7 +1343,7 @@
             <w:r/>
             <w:r>
               <w:rPr>
-                <w:rFonts w:ascii="Calibri" w:hAnsi="Calibri" w:eastAsia="Arial Unicode MS" w:cs="Arial Unicode MS"/>
+                <w:rFonts w:ascii="Arial Unicode MS" w:hAnsi="Arial Unicode MS" w:eastAsia="Arial Unicode MS" w:cs="Arial Unicode MS"/>
                 <w:b w:val="0"/>
                 <w:sz w:val="18"/>
               </w:rPr>
@@ -1369,7 +1369,7 @@
             <w:r/>
             <w:r>
               <w:rPr>
-                <w:rFonts w:ascii="Calibri" w:hAnsi="Calibri" w:eastAsia="Arial Unicode MS" w:cs="Arial Unicode MS"/>
+                <w:rFonts w:ascii="Arial Unicode MS" w:hAnsi="Arial Unicode MS" w:eastAsia="Arial Unicode MS" w:cs="Arial Unicode MS"/>
                 <w:b w:val="0"/>
                 <w:sz w:val="18"/>
               </w:rPr>
@@ -1395,7 +1395,7 @@
             <w:r/>
             <w:r>
               <w:rPr>
-                <w:rFonts w:ascii="Calibri" w:hAnsi="Calibri" w:eastAsia="Arial Unicode MS" w:cs="Arial Unicode MS"/>
+                <w:rFonts w:ascii="Arial Unicode MS" w:hAnsi="Arial Unicode MS" w:eastAsia="Arial Unicode MS" w:cs="Arial Unicode MS"/>
                 <w:b w:val="0"/>
                 <w:sz w:val="18"/>
               </w:rPr>
@@ -1417,7 +1417,7 @@
       </w:pPr>
       <w:r>
         <w:rPr>
-          <w:rFonts w:ascii="Calibri" w:hAnsi="Calibri" w:eastAsia="Arial Unicode MS" w:cs="Arial Unicode MS"/>
+          <w:rFonts w:ascii="Arial Unicode MS" w:hAnsi="Arial Unicode MS" w:eastAsia="Arial Unicode MS" w:cs="Arial Unicode MS"/>
           <w:b/>
           <w:color w:val="2E74B5"/>
           <w:sz w:val="32"/>
@@ -1431,7 +1431,7 @@
       </w:pPr>
       <w:r>
         <w:rPr>
-          <w:rFonts w:ascii="Calibri" w:hAnsi="Calibri" w:eastAsia="Arial Unicode MS" w:cs="Arial Unicode MS"/>
+          <w:rFonts w:ascii="Arial Unicode MS" w:hAnsi="Arial Unicode MS" w:eastAsia="Arial Unicode MS" w:cs="Arial Unicode MS"/>
           <w:color w:val="191F1D"/>
           <w:sz w:val="22"/>
         </w:rPr>
@@ -1475,7 +1475,7 @@
             <w:r/>
             <w:r>
               <w:rPr>
-                <w:rFonts w:ascii="Calibri" w:hAnsi="Calibri" w:eastAsia="Arial Unicode MS" w:cs="Arial Unicode MS"/>
+                <w:rFonts w:ascii="Arial Unicode MS" w:hAnsi="Arial Unicode MS" w:eastAsia="Arial Unicode MS" w:cs="Arial Unicode MS"/>
                 <w:b/>
                 <w:color w:val="1F4D78"/>
                 <w:sz w:val="18"/>
@@ -1503,7 +1503,7 @@
             <w:r/>
             <w:r>
               <w:rPr>
-                <w:rFonts w:ascii="Calibri" w:hAnsi="Calibri" w:eastAsia="Arial Unicode MS" w:cs="Arial Unicode MS"/>
+                <w:rFonts w:ascii="Arial Unicode MS" w:hAnsi="Arial Unicode MS" w:eastAsia="Arial Unicode MS" w:cs="Arial Unicode MS"/>
                 <w:b/>
                 <w:color w:val="1F4D78"/>
                 <w:sz w:val="18"/>
@@ -1531,7 +1531,7 @@
             <w:r/>
             <w:r>
               <w:rPr>
-                <w:rFonts w:ascii="Calibri" w:hAnsi="Calibri" w:eastAsia="Arial Unicode MS" w:cs="Arial Unicode MS"/>
+                <w:rFonts w:ascii="Arial Unicode MS" w:hAnsi="Arial Unicode MS" w:eastAsia="Arial Unicode MS" w:cs="Arial Unicode MS"/>
                 <w:b/>
                 <w:color w:val="1F4D78"/>
                 <w:sz w:val="18"/>
@@ -1563,7 +1563,7 @@
             <w:r/>
             <w:r>
               <w:rPr>
-                <w:rFonts w:ascii="Calibri" w:hAnsi="Calibri" w:eastAsia="Arial Unicode MS" w:cs="Arial Unicode MS"/>
+                <w:rFonts w:ascii="Arial Unicode MS" w:hAnsi="Arial Unicode MS" w:eastAsia="Arial Unicode MS" w:cs="Arial Unicode MS"/>
                 <w:b w:val="0"/>
                 <w:sz w:val="18"/>
               </w:rPr>
@@ -1589,7 +1589,7 @@
             <w:r/>
             <w:r>
               <w:rPr>
-                <w:rFonts w:ascii="Calibri" w:hAnsi="Calibri" w:eastAsia="Arial Unicode MS" w:cs="Arial Unicode MS"/>
+                <w:rFonts w:ascii="Arial Unicode MS" w:hAnsi="Arial Unicode MS" w:eastAsia="Arial Unicode MS" w:cs="Arial Unicode MS"/>
                 <w:b w:val="0"/>
                 <w:sz w:val="18"/>
               </w:rPr>
@@ -1615,7 +1615,7 @@
             <w:r/>
             <w:r>
               <w:rPr>
-                <w:rFonts w:ascii="Calibri" w:hAnsi="Calibri" w:eastAsia="Arial Unicode MS" w:cs="Arial Unicode MS"/>
+                <w:rFonts w:ascii="Arial Unicode MS" w:hAnsi="Arial Unicode MS" w:eastAsia="Arial Unicode MS" w:cs="Arial Unicode MS"/>
                 <w:b w:val="0"/>
                 <w:sz w:val="18"/>
               </w:rPr>
@@ -1646,7 +1646,7 @@
             <w:r/>
             <w:r>
               <w:rPr>
-                <w:rFonts w:ascii="Calibri" w:hAnsi="Calibri" w:eastAsia="Arial Unicode MS" w:cs="Arial Unicode MS"/>
+                <w:rFonts w:ascii="Arial Unicode MS" w:hAnsi="Arial Unicode MS" w:eastAsia="Arial Unicode MS" w:cs="Arial Unicode MS"/>
                 <w:b w:val="0"/>
                 <w:sz w:val="18"/>
               </w:rPr>
@@ -1672,7 +1672,7 @@
             <w:r/>
             <w:r>
               <w:rPr>
-                <w:rFonts w:ascii="Calibri" w:hAnsi="Calibri" w:eastAsia="Arial Unicode MS" w:cs="Arial Unicode MS"/>
+                <w:rFonts w:ascii="Arial Unicode MS" w:hAnsi="Arial Unicode MS" w:eastAsia="Arial Unicode MS" w:cs="Arial Unicode MS"/>
                 <w:b w:val="0"/>
                 <w:sz w:val="18"/>
               </w:rPr>
@@ -1698,7 +1698,7 @@
             <w:r/>
             <w:r>
               <w:rPr>
-                <w:rFonts w:ascii="Calibri" w:hAnsi="Calibri" w:eastAsia="Arial Unicode MS" w:cs="Arial Unicode MS"/>
+                <w:rFonts w:ascii="Arial Unicode MS" w:hAnsi="Arial Unicode MS" w:eastAsia="Arial Unicode MS" w:cs="Arial Unicode MS"/>
                 <w:b w:val="0"/>
                 <w:sz w:val="18"/>
               </w:rPr>
@@ -1729,7 +1729,7 @@
             <w:r/>
             <w:r>
               <w:rPr>
-                <w:rFonts w:ascii="Calibri" w:hAnsi="Calibri" w:eastAsia="Arial Unicode MS" w:cs="Arial Unicode MS"/>
+                <w:rFonts w:ascii="Arial Unicode MS" w:hAnsi="Arial Unicode MS" w:eastAsia="Arial Unicode MS" w:cs="Arial Unicode MS"/>
                 <w:b w:val="0"/>
                 <w:sz w:val="18"/>
               </w:rPr>
@@ -1755,7 +1755,7 @@
             <w:r/>
             <w:r>
               <w:rPr>
-                <w:rFonts w:ascii="Calibri" w:hAnsi="Calibri" w:eastAsia="Arial Unicode MS" w:cs="Arial Unicode MS"/>
+                <w:rFonts w:ascii="Arial Unicode MS" w:hAnsi="Arial Unicode MS" w:eastAsia="Arial Unicode MS" w:cs="Arial Unicode MS"/>
                 <w:b w:val="0"/>
                 <w:sz w:val="18"/>
               </w:rPr>
@@ -1781,7 +1781,7 @@
             <w:r/>
             <w:r>
               <w:rPr>
-                <w:rFonts w:ascii="Calibri" w:hAnsi="Calibri" w:eastAsia="Arial Unicode MS" w:cs="Arial Unicode MS"/>
+                <w:rFonts w:ascii="Arial Unicode MS" w:hAnsi="Arial Unicode MS" w:eastAsia="Arial Unicode MS" w:cs="Arial Unicode MS"/>
                 <w:b w:val="0"/>
                 <w:sz w:val="18"/>
               </w:rPr>
@@ -1812,7 +1812,7 @@
             <w:r/>
             <w:r>
               <w:rPr>
-                <w:rFonts w:ascii="Calibri" w:hAnsi="Calibri" w:eastAsia="Arial Unicode MS" w:cs="Arial Unicode MS"/>
+                <w:rFonts w:ascii="Arial Unicode MS" w:hAnsi="Arial Unicode MS" w:eastAsia="Arial Unicode MS" w:cs="Arial Unicode MS"/>
                 <w:b w:val="0"/>
                 <w:sz w:val="18"/>
               </w:rPr>
@@ -1838,7 +1838,7 @@
             <w:r/>
             <w:r>
               <w:rPr>
-                <w:rFonts w:ascii="Calibri" w:hAnsi="Calibri" w:eastAsia="Arial Unicode MS" w:cs="Arial Unicode MS"/>
+                <w:rFonts w:ascii="Arial Unicode MS" w:hAnsi="Arial Unicode MS" w:eastAsia="Arial Unicode MS" w:cs="Arial Unicode MS"/>
                 <w:b w:val="0"/>
                 <w:sz w:val="18"/>
               </w:rPr>
@@ -1864,7 +1864,7 @@
             <w:r/>
             <w:r>
               <w:rPr>
-                <w:rFonts w:ascii="Calibri" w:hAnsi="Calibri" w:eastAsia="Arial Unicode MS" w:cs="Arial Unicode MS"/>
+                <w:rFonts w:ascii="Arial Unicode MS" w:hAnsi="Arial Unicode MS" w:eastAsia="Arial Unicode MS" w:cs="Arial Unicode MS"/>
                 <w:b w:val="0"/>
                 <w:sz w:val="18"/>
               </w:rPr>
@@ -1895,7 +1895,7 @@
             <w:r/>
             <w:r>
               <w:rPr>
-                <w:rFonts w:ascii="Calibri" w:hAnsi="Calibri" w:eastAsia="Arial Unicode MS" w:cs="Arial Unicode MS"/>
+                <w:rFonts w:ascii="Arial Unicode MS" w:hAnsi="Arial Unicode MS" w:eastAsia="Arial Unicode MS" w:cs="Arial Unicode MS"/>
                 <w:b w:val="0"/>
                 <w:sz w:val="18"/>
               </w:rPr>
@@ -1921,7 +1921,7 @@
             <w:r/>
             <w:r>
               <w:rPr>
-                <w:rFonts w:ascii="Calibri" w:hAnsi="Calibri" w:eastAsia="Arial Unicode MS" w:cs="Arial Unicode MS"/>
+                <w:rFonts w:ascii="Arial Unicode MS" w:hAnsi="Arial Unicode MS" w:eastAsia="Arial Unicode MS" w:cs="Arial Unicode MS"/>
                 <w:b w:val="0"/>
                 <w:sz w:val="18"/>
               </w:rPr>
@@ -1947,7 +1947,7 @@
             <w:r/>
             <w:r>
               <w:rPr>
-                <w:rFonts w:ascii="Calibri" w:hAnsi="Calibri" w:eastAsia="Arial Unicode MS" w:cs="Arial Unicode MS"/>
+                <w:rFonts w:ascii="Arial Unicode MS" w:hAnsi="Arial Unicode MS" w:eastAsia="Arial Unicode MS" w:cs="Arial Unicode MS"/>
                 <w:b w:val="0"/>
                 <w:sz w:val="18"/>
               </w:rPr>
@@ -1978,7 +1978,7 @@
             <w:r/>
             <w:r>
               <w:rPr>
-                <w:rFonts w:ascii="Calibri" w:hAnsi="Calibri" w:eastAsia="Arial Unicode MS" w:cs="Arial Unicode MS"/>
+                <w:rFonts w:ascii="Arial Unicode MS" w:hAnsi="Arial Unicode MS" w:eastAsia="Arial Unicode MS" w:cs="Arial Unicode MS"/>
                 <w:b w:val="0"/>
                 <w:sz w:val="18"/>
               </w:rPr>
@@ -2004,7 +2004,7 @@
             <w:r/>
             <w:r>
               <w:rPr>
-                <w:rFonts w:ascii="Calibri" w:hAnsi="Calibri" w:eastAsia="Arial Unicode MS" w:cs="Arial Unicode MS"/>
+                <w:rFonts w:ascii="Arial Unicode MS" w:hAnsi="Arial Unicode MS" w:eastAsia="Arial Unicode MS" w:cs="Arial Unicode MS"/>
                 <w:b w:val="0"/>
                 <w:sz w:val="18"/>
               </w:rPr>
@@ -2030,7 +2030,7 @@
             <w:r/>
             <w:r>
               <w:rPr>
-                <w:rFonts w:ascii="Calibri" w:hAnsi="Calibri" w:eastAsia="Arial Unicode MS" w:cs="Arial Unicode MS"/>
+                <w:rFonts w:ascii="Arial Unicode MS" w:hAnsi="Arial Unicode MS" w:eastAsia="Arial Unicode MS" w:cs="Arial Unicode MS"/>
                 <w:b w:val="0"/>
                 <w:sz w:val="18"/>
               </w:rPr>
@@ -2051,7 +2051,7 @@
       </w:pPr>
       <w:r>
         <w:rPr>
-          <w:rFonts w:ascii="Calibri" w:hAnsi="Calibri" w:eastAsia="Arial Unicode MS" w:cs="Arial Unicode MS"/>
+          <w:rFonts w:ascii="Arial Unicode MS" w:hAnsi="Arial Unicode MS" w:eastAsia="Arial Unicode MS" w:cs="Arial Unicode MS"/>
           <w:color w:val="191F1D"/>
           <w:sz w:val="22"/>
         </w:rPr>
@@ -2065,7 +2065,7 @@
       </w:pPr>
       <w:r>
         <w:rPr>
-          <w:rFonts w:ascii="Calibri" w:hAnsi="Calibri" w:eastAsia="Arial Unicode MS" w:cs="Arial Unicode MS"/>
+          <w:rFonts w:ascii="Arial Unicode MS" w:hAnsi="Arial Unicode MS" w:eastAsia="Arial Unicode MS" w:cs="Arial Unicode MS"/>
           <w:b/>
           <w:color w:val="2E74B5"/>
           <w:sz w:val="32"/>
@@ -2110,7 +2110,7 @@
             <w:r/>
             <w:r>
               <w:rPr>
-                <w:rFonts w:ascii="Calibri" w:hAnsi="Calibri" w:eastAsia="Arial Unicode MS" w:cs="Arial Unicode MS"/>
+                <w:rFonts w:ascii="Arial Unicode MS" w:hAnsi="Arial Unicode MS" w:eastAsia="Arial Unicode MS" w:cs="Arial Unicode MS"/>
                 <w:b/>
                 <w:color w:val="1F4D78"/>
                 <w:sz w:val="18"/>
@@ -2138,7 +2138,7 @@
             <w:r/>
             <w:r>
               <w:rPr>
-                <w:rFonts w:ascii="Calibri" w:hAnsi="Calibri" w:eastAsia="Arial Unicode MS" w:cs="Arial Unicode MS"/>
+                <w:rFonts w:ascii="Arial Unicode MS" w:hAnsi="Arial Unicode MS" w:eastAsia="Arial Unicode MS" w:cs="Arial Unicode MS"/>
                 <w:b/>
                 <w:color w:val="1F4D78"/>
                 <w:sz w:val="18"/>
@@ -2166,7 +2166,7 @@
             <w:r/>
             <w:r>
               <w:rPr>
-                <w:rFonts w:ascii="Calibri" w:hAnsi="Calibri" w:eastAsia="Arial Unicode MS" w:cs="Arial Unicode MS"/>
+                <w:rFonts w:ascii="Arial Unicode MS" w:hAnsi="Arial Unicode MS" w:eastAsia="Arial Unicode MS" w:cs="Arial Unicode MS"/>
                 <w:b/>
                 <w:color w:val="1F4D78"/>
                 <w:sz w:val="18"/>
@@ -2198,7 +2198,7 @@
             <w:r/>
             <w:r>
               <w:rPr>
-                <w:rFonts w:ascii="Calibri" w:hAnsi="Calibri" w:eastAsia="Arial Unicode MS" w:cs="Arial Unicode MS"/>
+                <w:rFonts w:ascii="Arial Unicode MS" w:hAnsi="Arial Unicode MS" w:eastAsia="Arial Unicode MS" w:cs="Arial Unicode MS"/>
                 <w:b w:val="0"/>
                 <w:sz w:val="18"/>
               </w:rPr>
@@ -2224,11 +2224,11 @@
             <w:r/>
             <w:r>
               <w:rPr>
-                <w:rFonts w:ascii="Calibri" w:hAnsi="Calibri" w:eastAsia="Arial Unicode MS" w:cs="Arial Unicode MS"/>
+                <w:rFonts w:ascii="Arial Unicode MS" w:hAnsi="Arial Unicode MS" w:eastAsia="Arial Unicode MS" w:cs="Arial Unicode MS"/>
                 <w:b w:val="0"/>
                 <w:sz w:val="18"/>
               </w:rPr>
-              <w:t>new / validated / blocked / assessing</w:t>
+              <w:t>新增 / 已校验 / 阻断 / 评估中</w:t>
             </w:r>
           </w:p>
         </w:tc>
@@ -2250,7 +2250,7 @@
             <w:r/>
             <w:r>
               <w:rPr>
-                <w:rFonts w:ascii="Calibri" w:hAnsi="Calibri" w:eastAsia="Arial Unicode MS" w:cs="Arial Unicode MS"/>
+                <w:rFonts w:ascii="Arial Unicode MS" w:hAnsi="Arial Unicode MS" w:eastAsia="Arial Unicode MS" w:cs="Arial Unicode MS"/>
                 <w:b w:val="0"/>
                 <w:sz w:val="18"/>
               </w:rPr>
@@ -2281,7 +2281,7 @@
             <w:r/>
             <w:r>
               <w:rPr>
-                <w:rFonts w:ascii="Calibri" w:hAnsi="Calibri" w:eastAsia="Arial Unicode MS" w:cs="Arial Unicode MS"/>
+                <w:rFonts w:ascii="Arial Unicode MS" w:hAnsi="Arial Unicode MS" w:eastAsia="Arial Unicode MS" w:cs="Arial Unicode MS"/>
                 <w:b w:val="0"/>
                 <w:sz w:val="18"/>
               </w:rPr>
@@ -2307,11 +2307,11 @@
             <w:r/>
             <w:r>
               <w:rPr>
-                <w:rFonts w:ascii="Calibri" w:hAnsi="Calibri" w:eastAsia="Arial Unicode MS" w:cs="Arial Unicode MS"/>
+                <w:rFonts w:ascii="Arial Unicode MS" w:hAnsi="Arial Unicode MS" w:eastAsia="Arial Unicode MS" w:cs="Arial Unicode MS"/>
                 <w:b w:val="0"/>
                 <w:sz w:val="18"/>
               </w:rPr>
-              <w:t>versioned / locked / stale</w:t>
+              <w:t>版本化 / 已锁定 / 过期</w:t>
             </w:r>
           </w:p>
         </w:tc>
@@ -2333,7 +2333,7 @@
             <w:r/>
             <w:r>
               <w:rPr>
-                <w:rFonts w:ascii="Calibri" w:hAnsi="Calibri" w:eastAsia="Arial Unicode MS" w:cs="Arial Unicode MS"/>
+                <w:rFonts w:ascii="Arial Unicode MS" w:hAnsi="Arial Unicode MS" w:eastAsia="Arial Unicode MS" w:cs="Arial Unicode MS"/>
                 <w:b w:val="0"/>
                 <w:sz w:val="18"/>
               </w:rPr>
@@ -2364,7 +2364,7 @@
             <w:r/>
             <w:r>
               <w:rPr>
-                <w:rFonts w:ascii="Calibri" w:hAnsi="Calibri" w:eastAsia="Arial Unicode MS" w:cs="Arial Unicode MS"/>
+                <w:rFonts w:ascii="Arial Unicode MS" w:hAnsi="Arial Unicode MS" w:eastAsia="Arial Unicode MS" w:cs="Arial Unicode MS"/>
                 <w:b w:val="0"/>
                 <w:sz w:val="18"/>
               </w:rPr>
@@ -2390,11 +2390,11 @@
             <w:r/>
             <w:r>
               <w:rPr>
-                <w:rFonts w:ascii="Calibri" w:hAnsi="Calibri" w:eastAsia="Arial Unicode MS" w:cs="Arial Unicode MS"/>
+                <w:rFonts w:ascii="Arial Unicode MS" w:hAnsi="Arial Unicode MS" w:eastAsia="Arial Unicode MS" w:cs="Arial Unicode MS"/>
                 <w:b w:val="0"/>
                 <w:sz w:val="18"/>
               </w:rPr>
-              <w:t>feasible / reference-only / blocked</w:t>
+              <w:t>可行 / 仅参考 / 阻断</w:t>
             </w:r>
           </w:p>
         </w:tc>
@@ -2416,7 +2416,7 @@
             <w:r/>
             <w:r>
               <w:rPr>
-                <w:rFonts w:ascii="Calibri" w:hAnsi="Calibri" w:eastAsia="Arial Unicode MS" w:cs="Arial Unicode MS"/>
+                <w:rFonts w:ascii="Arial Unicode MS" w:hAnsi="Arial Unicode MS" w:eastAsia="Arial Unicode MS" w:cs="Arial Unicode MS"/>
                 <w:b w:val="0"/>
                 <w:sz w:val="18"/>
               </w:rPr>
@@ -2447,7 +2447,7 @@
             <w:r/>
             <w:r>
               <w:rPr>
-                <w:rFonts w:ascii="Calibri" w:hAnsi="Calibri" w:eastAsia="Arial Unicode MS" w:cs="Arial Unicode MS"/>
+                <w:rFonts w:ascii="Arial Unicode MS" w:hAnsi="Arial Unicode MS" w:eastAsia="Arial Unicode MS" w:cs="Arial Unicode MS"/>
                 <w:b w:val="0"/>
                 <w:sz w:val="18"/>
               </w:rPr>
@@ -2473,11 +2473,11 @@
             <w:r/>
             <w:r>
               <w:rPr>
-                <w:rFonts w:ascii="Calibri" w:hAnsi="Calibri" w:eastAsia="Arial Unicode MS" w:cs="Arial Unicode MS"/>
+                <w:rFonts w:ascii="Arial Unicode MS" w:hAnsi="Arial Unicode MS" w:eastAsia="Arial Unicode MS" w:cs="Arial Unicode MS"/>
                 <w:b w:val="0"/>
                 <w:sz w:val="18"/>
               </w:rPr>
-              <w:t>pass / warning / fail-closed</w:t>
+              <w:t>通过 / 警告 / 失败关闭</w:t>
             </w:r>
           </w:p>
         </w:tc>
@@ -2499,7 +2499,7 @@
             <w:r/>
             <w:r>
               <w:rPr>
-                <w:rFonts w:ascii="Calibri" w:hAnsi="Calibri" w:eastAsia="Arial Unicode MS" w:cs="Arial Unicode MS"/>
+                <w:rFonts w:ascii="Arial Unicode MS" w:hAnsi="Arial Unicode MS" w:eastAsia="Arial Unicode MS" w:cs="Arial Unicode MS"/>
                 <w:b w:val="0"/>
                 <w:sz w:val="18"/>
               </w:rPr>
@@ -2530,7 +2530,7 @@
             <w:r/>
             <w:r>
               <w:rPr>
-                <w:rFonts w:ascii="Calibri" w:hAnsi="Calibri" w:eastAsia="Arial Unicode MS" w:cs="Arial Unicode MS"/>
+                <w:rFonts w:ascii="Arial Unicode MS" w:hAnsi="Arial Unicode MS" w:eastAsia="Arial Unicode MS" w:cs="Arial Unicode MS"/>
                 <w:b w:val="0"/>
                 <w:sz w:val="18"/>
               </w:rPr>
@@ -2556,11 +2556,11 @@
             <w:r/>
             <w:r>
               <w:rPr>
-                <w:rFonts w:ascii="Calibri" w:hAnsi="Calibri" w:eastAsia="Arial Unicode MS" w:cs="Arial Unicode MS"/>
+                <w:rFonts w:ascii="Arial Unicode MS" w:hAnsi="Arial Unicode MS" w:eastAsia="Arial Unicode MS" w:cs="Arial Unicode MS"/>
                 <w:b w:val="0"/>
                 <w:sz w:val="18"/>
               </w:rPr>
-              <w:t>accepted / adjusted / rejected</w:t>
+              <w:t>采纳 / 调整 / 驳回</w:t>
             </w:r>
           </w:p>
         </w:tc>
@@ -2582,7 +2582,7 @@
             <w:r/>
             <w:r>
               <w:rPr>
-                <w:rFonts w:ascii="Calibri" w:hAnsi="Calibri" w:eastAsia="Arial Unicode MS" w:cs="Arial Unicode MS"/>
+                <w:rFonts w:ascii="Arial Unicode MS" w:hAnsi="Arial Unicode MS" w:eastAsia="Arial Unicode MS" w:cs="Arial Unicode MS"/>
                 <w:b w:val="0"/>
                 <w:sz w:val="18"/>
               </w:rPr>
@@ -2613,7 +2613,7 @@
             <w:r/>
             <w:r>
               <w:rPr>
-                <w:rFonts w:ascii="Calibri" w:hAnsi="Calibri" w:eastAsia="Arial Unicode MS" w:cs="Arial Unicode MS"/>
+                <w:rFonts w:ascii="Arial Unicode MS" w:hAnsi="Arial Unicode MS" w:eastAsia="Arial Unicode MS" w:cs="Arial Unicode MS"/>
                 <w:b w:val="0"/>
                 <w:sz w:val="18"/>
               </w:rPr>
@@ -2639,11 +2639,11 @@
             <w:r/>
             <w:r>
               <w:rPr>
-                <w:rFonts w:ascii="Calibri" w:hAnsi="Calibri" w:eastAsia="Arial Unicode MS" w:cs="Arial Unicode MS"/>
+                <w:rFonts w:ascii="Arial Unicode MS" w:hAnsi="Arial Unicode MS" w:eastAsia="Arial Unicode MS" w:cs="Arial Unicode MS"/>
                 <w:b w:val="0"/>
                 <w:sz w:val="18"/>
               </w:rPr>
-              <w:t>prediction / decision / outcome / failure</w:t>
+              <w:t>预测 / 决策 / 结果 / 失败</w:t>
             </w:r>
           </w:p>
         </w:tc>
@@ -2665,7 +2665,7 @@
             <w:r/>
             <w:r>
               <w:rPr>
-                <w:rFonts w:ascii="Calibri" w:hAnsi="Calibri" w:eastAsia="Arial Unicode MS" w:cs="Arial Unicode MS"/>
+                <w:rFonts w:ascii="Arial Unicode MS" w:hAnsi="Arial Unicode MS" w:eastAsia="Arial Unicode MS" w:cs="Arial Unicode MS"/>
                 <w:b w:val="0"/>
                 <w:sz w:val="18"/>
               </w:rPr>
@@ -2687,7 +2687,7 @@
       </w:pPr>
       <w:r>
         <w:rPr>
-          <w:rFonts w:ascii="Calibri" w:hAnsi="Calibri" w:eastAsia="Arial Unicode MS" w:cs="Arial Unicode MS"/>
+          <w:rFonts w:ascii="Arial Unicode MS" w:hAnsi="Arial Unicode MS" w:eastAsia="Arial Unicode MS" w:cs="Arial Unicode MS"/>
           <w:b/>
           <w:color w:val="176B4D"/>
           <w:sz w:val="21"/>
@@ -2696,7 +2696,7 @@
       </w:r>
       <w:r>
         <w:rPr>
-          <w:rFonts w:ascii="Calibri" w:hAnsi="Calibri" w:eastAsia="Arial Unicode MS" w:cs="Arial Unicode MS"/>
+          <w:rFonts w:ascii="Arial Unicode MS" w:hAnsi="Arial Unicode MS" w:eastAsia="Arial Unicode MS" w:cs="Arial Unicode MS"/>
           <w:color w:val="191F1D"/>
           <w:sz w:val="21"/>
         </w:rPr>
@@ -2710,7 +2710,7 @@
       </w:pPr>
       <w:r>
         <w:rPr>
-          <w:rFonts w:ascii="Calibri" w:hAnsi="Calibri" w:eastAsia="Arial Unicode MS" w:cs="Arial Unicode MS"/>
+          <w:rFonts w:ascii="Arial Unicode MS" w:hAnsi="Arial Unicode MS" w:eastAsia="Arial Unicode MS" w:cs="Arial Unicode MS"/>
           <w:b/>
           <w:color w:val="176B4D"/>
           <w:sz w:val="21"/>
@@ -2719,7 +2719,7 @@
       </w:r>
       <w:r>
         <w:rPr>
-          <w:rFonts w:ascii="Calibri" w:hAnsi="Calibri" w:eastAsia="Arial Unicode MS" w:cs="Arial Unicode MS"/>
+          <w:rFonts w:ascii="Arial Unicode MS" w:hAnsi="Arial Unicode MS" w:eastAsia="Arial Unicode MS" w:cs="Arial Unicode MS"/>
           <w:color w:val="191F1D"/>
           <w:sz w:val="21"/>
         </w:rPr>
@@ -2733,7 +2733,7 @@
       </w:pPr>
       <w:r>
         <w:rPr>
-          <w:rFonts w:ascii="Calibri" w:hAnsi="Calibri" w:eastAsia="Arial Unicode MS" w:cs="Arial Unicode MS"/>
+          <w:rFonts w:ascii="Arial Unicode MS" w:hAnsi="Arial Unicode MS" w:eastAsia="Arial Unicode MS" w:cs="Arial Unicode MS"/>
           <w:b/>
           <w:color w:val="176B4D"/>
           <w:sz w:val="21"/>
@@ -2742,7 +2742,7 @@
       </w:r>
       <w:r>
         <w:rPr>
-          <w:rFonts w:ascii="Calibri" w:hAnsi="Calibri" w:eastAsia="Arial Unicode MS" w:cs="Arial Unicode MS"/>
+          <w:rFonts w:ascii="Arial Unicode MS" w:hAnsi="Arial Unicode MS" w:eastAsia="Arial Unicode MS" w:cs="Arial Unicode MS"/>
           <w:color w:val="191F1D"/>
           <w:sz w:val="21"/>
         </w:rPr>
@@ -2756,7 +2756,7 @@
       </w:pPr>
       <w:r>
         <w:rPr>
-          <w:rFonts w:ascii="Calibri" w:hAnsi="Calibri" w:eastAsia="Arial Unicode MS" w:cs="Arial Unicode MS"/>
+          <w:rFonts w:ascii="Arial Unicode MS" w:hAnsi="Arial Unicode MS" w:eastAsia="Arial Unicode MS" w:cs="Arial Unicode MS"/>
           <w:b/>
           <w:color w:val="2E74B5"/>
           <w:sz w:val="32"/>
@@ -2801,7 +2801,7 @@
             <w:r/>
             <w:r>
               <w:rPr>
-                <w:rFonts w:ascii="Calibri" w:hAnsi="Calibri" w:eastAsia="Arial Unicode MS" w:cs="Arial Unicode MS"/>
+                <w:rFonts w:ascii="Arial Unicode MS" w:hAnsi="Arial Unicode MS" w:eastAsia="Arial Unicode MS" w:cs="Arial Unicode MS"/>
                 <w:b/>
                 <w:color w:val="1F4D78"/>
                 <w:sz w:val="18"/>
@@ -2829,7 +2829,7 @@
             <w:r/>
             <w:r>
               <w:rPr>
-                <w:rFonts w:ascii="Calibri" w:hAnsi="Calibri" w:eastAsia="Arial Unicode MS" w:cs="Arial Unicode MS"/>
+                <w:rFonts w:ascii="Arial Unicode MS" w:hAnsi="Arial Unicode MS" w:eastAsia="Arial Unicode MS" w:cs="Arial Unicode MS"/>
                 <w:b/>
                 <w:color w:val="1F4D78"/>
                 <w:sz w:val="18"/>
@@ -2857,7 +2857,7 @@
             <w:r/>
             <w:r>
               <w:rPr>
-                <w:rFonts w:ascii="Calibri" w:hAnsi="Calibri" w:eastAsia="Arial Unicode MS" w:cs="Arial Unicode MS"/>
+                <w:rFonts w:ascii="Arial Unicode MS" w:hAnsi="Arial Unicode MS" w:eastAsia="Arial Unicode MS" w:cs="Arial Unicode MS"/>
                 <w:b/>
                 <w:color w:val="1F4D78"/>
                 <w:sz w:val="18"/>
@@ -2889,7 +2889,7 @@
             <w:r/>
             <w:r>
               <w:rPr>
-                <w:rFonts w:ascii="Calibri" w:hAnsi="Calibri" w:eastAsia="Arial Unicode MS" w:cs="Arial Unicode MS"/>
+                <w:rFonts w:ascii="Arial Unicode MS" w:hAnsi="Arial Unicode MS" w:eastAsia="Arial Unicode MS" w:cs="Arial Unicode MS"/>
                 <w:b w:val="0"/>
                 <w:sz w:val="18"/>
               </w:rPr>
@@ -2915,7 +2915,7 @@
             <w:r/>
             <w:r>
               <w:rPr>
-                <w:rFonts w:ascii="Calibri" w:hAnsi="Calibri" w:eastAsia="Arial Unicode MS" w:cs="Arial Unicode MS"/>
+                <w:rFonts w:ascii="Arial Unicode MS" w:hAnsi="Arial Unicode MS" w:eastAsia="Arial Unicode MS" w:cs="Arial Unicode MS"/>
                 <w:b w:val="0"/>
                 <w:sz w:val="18"/>
               </w:rPr>
@@ -2941,7 +2941,7 @@
             <w:r/>
             <w:r>
               <w:rPr>
-                <w:rFonts w:ascii="Calibri" w:hAnsi="Calibri" w:eastAsia="Arial Unicode MS" w:cs="Arial Unicode MS"/>
+                <w:rFonts w:ascii="Arial Unicode MS" w:hAnsi="Arial Unicode MS" w:eastAsia="Arial Unicode MS" w:cs="Arial Unicode MS"/>
                 <w:b w:val="0"/>
                 <w:sz w:val="18"/>
               </w:rPr>
@@ -2972,7 +2972,7 @@
             <w:r/>
             <w:r>
               <w:rPr>
-                <w:rFonts w:ascii="Calibri" w:hAnsi="Calibri" w:eastAsia="Arial Unicode MS" w:cs="Arial Unicode MS"/>
+                <w:rFonts w:ascii="Arial Unicode MS" w:hAnsi="Arial Unicode MS" w:eastAsia="Arial Unicode MS" w:cs="Arial Unicode MS"/>
                 <w:b w:val="0"/>
                 <w:sz w:val="18"/>
               </w:rPr>
@@ -2998,7 +2998,7 @@
             <w:r/>
             <w:r>
               <w:rPr>
-                <w:rFonts w:ascii="Calibri" w:hAnsi="Calibri" w:eastAsia="Arial Unicode MS" w:cs="Arial Unicode MS"/>
+                <w:rFonts w:ascii="Arial Unicode MS" w:hAnsi="Arial Unicode MS" w:eastAsia="Arial Unicode MS" w:cs="Arial Unicode MS"/>
                 <w:b w:val="0"/>
                 <w:sz w:val="18"/>
               </w:rPr>
@@ -3024,7 +3024,7 @@
             <w:r/>
             <w:r>
               <w:rPr>
-                <w:rFonts w:ascii="Calibri" w:hAnsi="Calibri" w:eastAsia="Arial Unicode MS" w:cs="Arial Unicode MS"/>
+                <w:rFonts w:ascii="Arial Unicode MS" w:hAnsi="Arial Unicode MS" w:eastAsia="Arial Unicode MS" w:cs="Arial Unicode MS"/>
                 <w:b w:val="0"/>
                 <w:sz w:val="18"/>
               </w:rPr>
@@ -3055,7 +3055,7 @@
             <w:r/>
             <w:r>
               <w:rPr>
-                <w:rFonts w:ascii="Calibri" w:hAnsi="Calibri" w:eastAsia="Arial Unicode MS" w:cs="Arial Unicode MS"/>
+                <w:rFonts w:ascii="Arial Unicode MS" w:hAnsi="Arial Unicode MS" w:eastAsia="Arial Unicode MS" w:cs="Arial Unicode MS"/>
                 <w:b w:val="0"/>
                 <w:sz w:val="18"/>
               </w:rPr>
@@ -3081,7 +3081,7 @@
             <w:r/>
             <w:r>
               <w:rPr>
-                <w:rFonts w:ascii="Calibri" w:hAnsi="Calibri" w:eastAsia="Arial Unicode MS" w:cs="Arial Unicode MS"/>
+                <w:rFonts w:ascii="Arial Unicode MS" w:hAnsi="Arial Unicode MS" w:eastAsia="Arial Unicode MS" w:cs="Arial Unicode MS"/>
                 <w:b w:val="0"/>
                 <w:sz w:val="18"/>
               </w:rPr>
@@ -3107,7 +3107,7 @@
             <w:r/>
             <w:r>
               <w:rPr>
-                <w:rFonts w:ascii="Calibri" w:hAnsi="Calibri" w:eastAsia="Arial Unicode MS" w:cs="Arial Unicode MS"/>
+                <w:rFonts w:ascii="Arial Unicode MS" w:hAnsi="Arial Unicode MS" w:eastAsia="Arial Unicode MS" w:cs="Arial Unicode MS"/>
                 <w:b w:val="0"/>
                 <w:sz w:val="18"/>
               </w:rPr>
@@ -3138,7 +3138,7 @@
             <w:r/>
             <w:r>
               <w:rPr>
-                <w:rFonts w:ascii="Calibri" w:hAnsi="Calibri" w:eastAsia="Arial Unicode MS" w:cs="Arial Unicode MS"/>
+                <w:rFonts w:ascii="Arial Unicode MS" w:hAnsi="Arial Unicode MS" w:eastAsia="Arial Unicode MS" w:cs="Arial Unicode MS"/>
                 <w:b w:val="0"/>
                 <w:sz w:val="18"/>
               </w:rPr>
@@ -3164,7 +3164,7 @@
             <w:r/>
             <w:r>
               <w:rPr>
-                <w:rFonts w:ascii="Calibri" w:hAnsi="Calibri" w:eastAsia="Arial Unicode MS" w:cs="Arial Unicode MS"/>
+                <w:rFonts w:ascii="Arial Unicode MS" w:hAnsi="Arial Unicode MS" w:eastAsia="Arial Unicode MS" w:cs="Arial Unicode MS"/>
                 <w:b w:val="0"/>
                 <w:sz w:val="18"/>
               </w:rPr>
@@ -3190,7 +3190,7 @@
             <w:r/>
             <w:r>
               <w:rPr>
-                <w:rFonts w:ascii="Calibri" w:hAnsi="Calibri" w:eastAsia="Arial Unicode MS" w:cs="Arial Unicode MS"/>
+                <w:rFonts w:ascii="Arial Unicode MS" w:hAnsi="Arial Unicode MS" w:eastAsia="Arial Unicode MS" w:cs="Arial Unicode MS"/>
                 <w:b w:val="0"/>
                 <w:sz w:val="18"/>
               </w:rPr>
@@ -3221,7 +3221,7 @@
             <w:r/>
             <w:r>
               <w:rPr>
-                <w:rFonts w:ascii="Calibri" w:hAnsi="Calibri" w:eastAsia="Arial Unicode MS" w:cs="Arial Unicode MS"/>
+                <w:rFonts w:ascii="Arial Unicode MS" w:hAnsi="Arial Unicode MS" w:eastAsia="Arial Unicode MS" w:cs="Arial Unicode MS"/>
                 <w:b w:val="0"/>
                 <w:sz w:val="18"/>
               </w:rPr>
@@ -3247,7 +3247,7 @@
             <w:r/>
             <w:r>
               <w:rPr>
-                <w:rFonts w:ascii="Calibri" w:hAnsi="Calibri" w:eastAsia="Arial Unicode MS" w:cs="Arial Unicode MS"/>
+                <w:rFonts w:ascii="Arial Unicode MS" w:hAnsi="Arial Unicode MS" w:eastAsia="Arial Unicode MS" w:cs="Arial Unicode MS"/>
                 <w:b w:val="0"/>
                 <w:sz w:val="18"/>
               </w:rPr>
@@ -3273,7 +3273,7 @@
             <w:r/>
             <w:r>
               <w:rPr>
-                <w:rFonts w:ascii="Calibri" w:hAnsi="Calibri" w:eastAsia="Arial Unicode MS" w:cs="Arial Unicode MS"/>
+                <w:rFonts w:ascii="Arial Unicode MS" w:hAnsi="Arial Unicode MS" w:eastAsia="Arial Unicode MS" w:cs="Arial Unicode MS"/>
                 <w:b w:val="0"/>
                 <w:sz w:val="18"/>
               </w:rPr>
@@ -3304,7 +3304,7 @@
             <w:r/>
             <w:r>
               <w:rPr>
-                <w:rFonts w:ascii="Calibri" w:hAnsi="Calibri" w:eastAsia="Arial Unicode MS" w:cs="Arial Unicode MS"/>
+                <w:rFonts w:ascii="Arial Unicode MS" w:hAnsi="Arial Unicode MS" w:eastAsia="Arial Unicode MS" w:cs="Arial Unicode MS"/>
                 <w:b w:val="0"/>
                 <w:sz w:val="18"/>
               </w:rPr>
@@ -3330,7 +3330,7 @@
             <w:r/>
             <w:r>
               <w:rPr>
-                <w:rFonts w:ascii="Calibri" w:hAnsi="Calibri" w:eastAsia="Arial Unicode MS" w:cs="Arial Unicode MS"/>
+                <w:rFonts w:ascii="Arial Unicode MS" w:hAnsi="Arial Unicode MS" w:eastAsia="Arial Unicode MS" w:cs="Arial Unicode MS"/>
                 <w:b w:val="0"/>
                 <w:sz w:val="18"/>
               </w:rPr>
@@ -3356,7 +3356,7 @@
             <w:r/>
             <w:r>
               <w:rPr>
-                <w:rFonts w:ascii="Calibri" w:hAnsi="Calibri" w:eastAsia="Arial Unicode MS" w:cs="Arial Unicode MS"/>
+                <w:rFonts w:ascii="Arial Unicode MS" w:hAnsi="Arial Unicode MS" w:eastAsia="Arial Unicode MS" w:cs="Arial Unicode MS"/>
                 <w:b w:val="0"/>
                 <w:sz w:val="18"/>
               </w:rPr>
@@ -3377,7 +3377,7 @@
       </w:pPr>
       <w:r>
         <w:rPr>
-          <w:rFonts w:ascii="Calibri" w:hAnsi="Calibri" w:eastAsia="Arial Unicode MS" w:cs="Arial Unicode MS"/>
+          <w:rFonts w:ascii="Arial Unicode MS" w:hAnsi="Arial Unicode MS" w:eastAsia="Arial Unicode MS" w:cs="Arial Unicode MS"/>
           <w:color w:val="191F1D"/>
           <w:sz w:val="22"/>
         </w:rPr>
@@ -3391,7 +3391,7 @@
       </w:pPr>
       <w:r>
         <w:rPr>
-          <w:rFonts w:ascii="Calibri" w:hAnsi="Calibri" w:eastAsia="Arial Unicode MS" w:cs="Arial Unicode MS"/>
+          <w:rFonts w:ascii="Arial Unicode MS" w:hAnsi="Arial Unicode MS" w:eastAsia="Arial Unicode MS" w:cs="Arial Unicode MS"/>
           <w:b/>
           <w:color w:val="2E74B5"/>
           <w:sz w:val="32"/>
@@ -3436,7 +3436,7 @@
             <w:r/>
             <w:r>
               <w:rPr>
-                <w:rFonts w:ascii="Calibri" w:hAnsi="Calibri" w:eastAsia="Arial Unicode MS" w:cs="Arial Unicode MS"/>
+                <w:rFonts w:ascii="Arial Unicode MS" w:hAnsi="Arial Unicode MS" w:eastAsia="Arial Unicode MS" w:cs="Arial Unicode MS"/>
                 <w:b/>
                 <w:color w:val="1F4D78"/>
                 <w:sz w:val="18"/>
@@ -3464,7 +3464,7 @@
             <w:r/>
             <w:r>
               <w:rPr>
-                <w:rFonts w:ascii="Calibri" w:hAnsi="Calibri" w:eastAsia="Arial Unicode MS" w:cs="Arial Unicode MS"/>
+                <w:rFonts w:ascii="Arial Unicode MS" w:hAnsi="Arial Unicode MS" w:eastAsia="Arial Unicode MS" w:cs="Arial Unicode MS"/>
                 <w:b/>
                 <w:color w:val="1F4D78"/>
                 <w:sz w:val="18"/>
@@ -3492,7 +3492,7 @@
             <w:r/>
             <w:r>
               <w:rPr>
-                <w:rFonts w:ascii="Calibri" w:hAnsi="Calibri" w:eastAsia="Arial Unicode MS" w:cs="Arial Unicode MS"/>
+                <w:rFonts w:ascii="Arial Unicode MS" w:hAnsi="Arial Unicode MS" w:eastAsia="Arial Unicode MS" w:cs="Arial Unicode MS"/>
                 <w:b/>
                 <w:color w:val="1F4D78"/>
                 <w:sz w:val="18"/>
@@ -3524,7 +3524,7 @@
             <w:r/>
             <w:r>
               <w:rPr>
-                <w:rFonts w:ascii="Calibri" w:hAnsi="Calibri" w:eastAsia="Arial Unicode MS" w:cs="Arial Unicode MS"/>
+                <w:rFonts w:ascii="Arial Unicode MS" w:hAnsi="Arial Unicode MS" w:eastAsia="Arial Unicode MS" w:cs="Arial Unicode MS"/>
                 <w:b w:val="0"/>
                 <w:sz w:val="18"/>
               </w:rPr>
@@ -3550,7 +3550,7 @@
             <w:r/>
             <w:r>
               <w:rPr>
-                <w:rFonts w:ascii="Calibri" w:hAnsi="Calibri" w:eastAsia="Arial Unicode MS" w:cs="Arial Unicode MS"/>
+                <w:rFonts w:ascii="Arial Unicode MS" w:hAnsi="Arial Unicode MS" w:eastAsia="Arial Unicode MS" w:cs="Arial Unicode MS"/>
                 <w:b w:val="0"/>
                 <w:sz w:val="18"/>
               </w:rPr>
@@ -3576,7 +3576,7 @@
             <w:r/>
             <w:r>
               <w:rPr>
-                <w:rFonts w:ascii="Calibri" w:hAnsi="Calibri" w:eastAsia="Arial Unicode MS" w:cs="Arial Unicode MS"/>
+                <w:rFonts w:ascii="Arial Unicode MS" w:hAnsi="Arial Unicode MS" w:eastAsia="Arial Unicode MS" w:cs="Arial Unicode MS"/>
                 <w:b w:val="0"/>
                 <w:sz w:val="18"/>
               </w:rPr>
@@ -3607,7 +3607,7 @@
             <w:r/>
             <w:r>
               <w:rPr>
-                <w:rFonts w:ascii="Calibri" w:hAnsi="Calibri" w:eastAsia="Arial Unicode MS" w:cs="Arial Unicode MS"/>
+                <w:rFonts w:ascii="Arial Unicode MS" w:hAnsi="Arial Unicode MS" w:eastAsia="Arial Unicode MS" w:cs="Arial Unicode MS"/>
                 <w:b w:val="0"/>
                 <w:sz w:val="18"/>
               </w:rPr>
@@ -3633,7 +3633,7 @@
             <w:r/>
             <w:r>
               <w:rPr>
-                <w:rFonts w:ascii="Calibri" w:hAnsi="Calibri" w:eastAsia="Arial Unicode MS" w:cs="Arial Unicode MS"/>
+                <w:rFonts w:ascii="Arial Unicode MS" w:hAnsi="Arial Unicode MS" w:eastAsia="Arial Unicode MS" w:cs="Arial Unicode MS"/>
                 <w:b w:val="0"/>
                 <w:sz w:val="18"/>
               </w:rPr>
@@ -3659,7 +3659,7 @@
             <w:r/>
             <w:r>
               <w:rPr>
-                <w:rFonts w:ascii="Calibri" w:hAnsi="Calibri" w:eastAsia="Arial Unicode MS" w:cs="Arial Unicode MS"/>
+                <w:rFonts w:ascii="Arial Unicode MS" w:hAnsi="Arial Unicode MS" w:eastAsia="Arial Unicode MS" w:cs="Arial Unicode MS"/>
                 <w:b w:val="0"/>
                 <w:sz w:val="18"/>
               </w:rPr>
@@ -3690,7 +3690,7 @@
             <w:r/>
             <w:r>
               <w:rPr>
-                <w:rFonts w:ascii="Calibri" w:hAnsi="Calibri" w:eastAsia="Arial Unicode MS" w:cs="Arial Unicode MS"/>
+                <w:rFonts w:ascii="Arial Unicode MS" w:hAnsi="Arial Unicode MS" w:eastAsia="Arial Unicode MS" w:cs="Arial Unicode MS"/>
                 <w:b w:val="0"/>
                 <w:sz w:val="18"/>
               </w:rPr>
@@ -3716,7 +3716,7 @@
             <w:r/>
             <w:r>
               <w:rPr>
-                <w:rFonts w:ascii="Calibri" w:hAnsi="Calibri" w:eastAsia="Arial Unicode MS" w:cs="Arial Unicode MS"/>
+                <w:rFonts w:ascii="Arial Unicode MS" w:hAnsi="Arial Unicode MS" w:eastAsia="Arial Unicode MS" w:cs="Arial Unicode MS"/>
                 <w:b w:val="0"/>
                 <w:sz w:val="18"/>
               </w:rPr>
@@ -3742,7 +3742,7 @@
             <w:r/>
             <w:r>
               <w:rPr>
-                <w:rFonts w:ascii="Calibri" w:hAnsi="Calibri" w:eastAsia="Arial Unicode MS" w:cs="Arial Unicode MS"/>
+                <w:rFonts w:ascii="Arial Unicode MS" w:hAnsi="Arial Unicode MS" w:eastAsia="Arial Unicode MS" w:cs="Arial Unicode MS"/>
                 <w:b w:val="0"/>
                 <w:sz w:val="18"/>
               </w:rPr>
@@ -3773,7 +3773,7 @@
             <w:r/>
             <w:r>
               <w:rPr>
-                <w:rFonts w:ascii="Calibri" w:hAnsi="Calibri" w:eastAsia="Arial Unicode MS" w:cs="Arial Unicode MS"/>
+                <w:rFonts w:ascii="Arial Unicode MS" w:hAnsi="Arial Unicode MS" w:eastAsia="Arial Unicode MS" w:cs="Arial Unicode MS"/>
                 <w:b w:val="0"/>
                 <w:sz w:val="18"/>
               </w:rPr>
@@ -3799,7 +3799,7 @@
             <w:r/>
             <w:r>
               <w:rPr>
-                <w:rFonts w:ascii="Calibri" w:hAnsi="Calibri" w:eastAsia="Arial Unicode MS" w:cs="Arial Unicode MS"/>
+                <w:rFonts w:ascii="Arial Unicode MS" w:hAnsi="Arial Unicode MS" w:eastAsia="Arial Unicode MS" w:cs="Arial Unicode MS"/>
                 <w:b w:val="0"/>
                 <w:sz w:val="18"/>
               </w:rPr>
@@ -3825,7 +3825,7 @@
             <w:r/>
             <w:r>
               <w:rPr>
-                <w:rFonts w:ascii="Calibri" w:hAnsi="Calibri" w:eastAsia="Arial Unicode MS" w:cs="Arial Unicode MS"/>
+                <w:rFonts w:ascii="Arial Unicode MS" w:hAnsi="Arial Unicode MS" w:eastAsia="Arial Unicode MS" w:cs="Arial Unicode MS"/>
                 <w:b w:val="0"/>
                 <w:sz w:val="18"/>
               </w:rPr>
@@ -3856,7 +3856,7 @@
             <w:r/>
             <w:r>
               <w:rPr>
-                <w:rFonts w:ascii="Calibri" w:hAnsi="Calibri" w:eastAsia="Arial Unicode MS" w:cs="Arial Unicode MS"/>
+                <w:rFonts w:ascii="Arial Unicode MS" w:hAnsi="Arial Unicode MS" w:eastAsia="Arial Unicode MS" w:cs="Arial Unicode MS"/>
                 <w:b w:val="0"/>
                 <w:sz w:val="18"/>
               </w:rPr>
@@ -3882,7 +3882,7 @@
             <w:r/>
             <w:r>
               <w:rPr>
-                <w:rFonts w:ascii="Calibri" w:hAnsi="Calibri" w:eastAsia="Arial Unicode MS" w:cs="Arial Unicode MS"/>
+                <w:rFonts w:ascii="Arial Unicode MS" w:hAnsi="Arial Unicode MS" w:eastAsia="Arial Unicode MS" w:cs="Arial Unicode MS"/>
                 <w:b w:val="0"/>
                 <w:sz w:val="18"/>
               </w:rPr>
@@ -3908,7 +3908,7 @@
             <w:r/>
             <w:r>
               <w:rPr>
-                <w:rFonts w:ascii="Calibri" w:hAnsi="Calibri" w:eastAsia="Arial Unicode MS" w:cs="Arial Unicode MS"/>
+                <w:rFonts w:ascii="Arial Unicode MS" w:hAnsi="Arial Unicode MS" w:eastAsia="Arial Unicode MS" w:cs="Arial Unicode MS"/>
                 <w:b w:val="0"/>
                 <w:sz w:val="18"/>
               </w:rPr>
@@ -3929,7 +3929,7 @@
       </w:pPr>
       <w:r>
         <w:rPr>
-          <w:rFonts w:ascii="Calibri" w:hAnsi="Calibri" w:eastAsia="Arial Unicode MS" w:cs="Arial Unicode MS"/>
+          <w:rFonts w:ascii="Arial Unicode MS" w:hAnsi="Arial Unicode MS" w:eastAsia="Arial Unicode MS" w:cs="Arial Unicode MS"/>
           <w:color w:val="191F1D"/>
           <w:sz w:val="22"/>
         </w:rPr>
@@ -3943,7 +3943,7 @@
       </w:pPr>
       <w:r>
         <w:rPr>
-          <w:rFonts w:ascii="Calibri" w:hAnsi="Calibri" w:eastAsia="Arial Unicode MS" w:cs="Arial Unicode MS"/>
+          <w:rFonts w:ascii="Arial Unicode MS" w:hAnsi="Arial Unicode MS" w:eastAsia="Arial Unicode MS" w:cs="Arial Unicode MS"/>
           <w:b/>
           <w:color w:val="2E74B5"/>
           <w:sz w:val="32"/>
@@ -3988,7 +3988,7 @@
             <w:r/>
             <w:r>
               <w:rPr>
-                <w:rFonts w:ascii="Calibri" w:hAnsi="Calibri" w:eastAsia="Arial Unicode MS" w:cs="Arial Unicode MS"/>
+                <w:rFonts w:ascii="Arial Unicode MS" w:hAnsi="Arial Unicode MS" w:eastAsia="Arial Unicode MS" w:cs="Arial Unicode MS"/>
                 <w:b/>
                 <w:color w:val="1F4D78"/>
                 <w:sz w:val="18"/>
@@ -4016,7 +4016,7 @@
             <w:r/>
             <w:r>
               <w:rPr>
-                <w:rFonts w:ascii="Calibri" w:hAnsi="Calibri" w:eastAsia="Arial Unicode MS" w:cs="Arial Unicode MS"/>
+                <w:rFonts w:ascii="Arial Unicode MS" w:hAnsi="Arial Unicode MS" w:eastAsia="Arial Unicode MS" w:cs="Arial Unicode MS"/>
                 <w:b/>
                 <w:color w:val="1F4D78"/>
                 <w:sz w:val="18"/>
@@ -4044,7 +4044,7 @@
             <w:r/>
             <w:r>
               <w:rPr>
-                <w:rFonts w:ascii="Calibri" w:hAnsi="Calibri" w:eastAsia="Arial Unicode MS" w:cs="Arial Unicode MS"/>
+                <w:rFonts w:ascii="Arial Unicode MS" w:hAnsi="Arial Unicode MS" w:eastAsia="Arial Unicode MS" w:cs="Arial Unicode MS"/>
                 <w:b/>
                 <w:color w:val="1F4D78"/>
                 <w:sz w:val="18"/>
@@ -4076,7 +4076,7 @@
             <w:r/>
             <w:r>
               <w:rPr>
-                <w:rFonts w:ascii="Calibri" w:hAnsi="Calibri" w:eastAsia="Arial Unicode MS" w:cs="Arial Unicode MS"/>
+                <w:rFonts w:ascii="Arial Unicode MS" w:hAnsi="Arial Unicode MS" w:eastAsia="Arial Unicode MS" w:cs="Arial Unicode MS"/>
                 <w:b w:val="0"/>
                 <w:sz w:val="18"/>
               </w:rPr>
@@ -4102,7 +4102,7 @@
             <w:r/>
             <w:r>
               <w:rPr>
-                <w:rFonts w:ascii="Calibri" w:hAnsi="Calibri" w:eastAsia="Arial Unicode MS" w:cs="Arial Unicode MS"/>
+                <w:rFonts w:ascii="Arial Unicode MS" w:hAnsi="Arial Unicode MS" w:eastAsia="Arial Unicode MS" w:cs="Arial Unicode MS"/>
                 <w:b w:val="0"/>
                 <w:sz w:val="18"/>
               </w:rPr>
@@ -4128,7 +4128,7 @@
             <w:r/>
             <w:r>
               <w:rPr>
-                <w:rFonts w:ascii="Calibri" w:hAnsi="Calibri" w:eastAsia="Arial Unicode MS" w:cs="Arial Unicode MS"/>
+                <w:rFonts w:ascii="Arial Unicode MS" w:hAnsi="Arial Unicode MS" w:eastAsia="Arial Unicode MS" w:cs="Arial Unicode MS"/>
                 <w:b w:val="0"/>
                 <w:sz w:val="18"/>
               </w:rPr>
@@ -4159,7 +4159,7 @@
             <w:r/>
             <w:r>
               <w:rPr>
-                <w:rFonts w:ascii="Calibri" w:hAnsi="Calibri" w:eastAsia="Arial Unicode MS" w:cs="Arial Unicode MS"/>
+                <w:rFonts w:ascii="Arial Unicode MS" w:hAnsi="Arial Unicode MS" w:eastAsia="Arial Unicode MS" w:cs="Arial Unicode MS"/>
                 <w:b w:val="0"/>
                 <w:sz w:val="18"/>
               </w:rPr>
@@ -4185,7 +4185,7 @@
             <w:r/>
             <w:r>
               <w:rPr>
-                <w:rFonts w:ascii="Calibri" w:hAnsi="Calibri" w:eastAsia="Arial Unicode MS" w:cs="Arial Unicode MS"/>
+                <w:rFonts w:ascii="Arial Unicode MS" w:hAnsi="Arial Unicode MS" w:eastAsia="Arial Unicode MS" w:cs="Arial Unicode MS"/>
                 <w:b w:val="0"/>
                 <w:sz w:val="18"/>
               </w:rPr>
@@ -4211,7 +4211,7 @@
             <w:r/>
             <w:r>
               <w:rPr>
-                <w:rFonts w:ascii="Calibri" w:hAnsi="Calibri" w:eastAsia="Arial Unicode MS" w:cs="Arial Unicode MS"/>
+                <w:rFonts w:ascii="Arial Unicode MS" w:hAnsi="Arial Unicode MS" w:eastAsia="Arial Unicode MS" w:cs="Arial Unicode MS"/>
                 <w:b w:val="0"/>
                 <w:sz w:val="18"/>
               </w:rPr>
@@ -4242,7 +4242,7 @@
             <w:r/>
             <w:r>
               <w:rPr>
-                <w:rFonts w:ascii="Calibri" w:hAnsi="Calibri" w:eastAsia="Arial Unicode MS" w:cs="Arial Unicode MS"/>
+                <w:rFonts w:ascii="Arial Unicode MS" w:hAnsi="Arial Unicode MS" w:eastAsia="Arial Unicode MS" w:cs="Arial Unicode MS"/>
                 <w:b w:val="0"/>
                 <w:sz w:val="18"/>
               </w:rPr>
@@ -4268,7 +4268,7 @@
             <w:r/>
             <w:r>
               <w:rPr>
-                <w:rFonts w:ascii="Calibri" w:hAnsi="Calibri" w:eastAsia="Arial Unicode MS" w:cs="Arial Unicode MS"/>
+                <w:rFonts w:ascii="Arial Unicode MS" w:hAnsi="Arial Unicode MS" w:eastAsia="Arial Unicode MS" w:cs="Arial Unicode MS"/>
                 <w:b w:val="0"/>
                 <w:sz w:val="18"/>
               </w:rPr>
@@ -4294,7 +4294,7 @@
             <w:r/>
             <w:r>
               <w:rPr>
-                <w:rFonts w:ascii="Calibri" w:hAnsi="Calibri" w:eastAsia="Arial Unicode MS" w:cs="Arial Unicode MS"/>
+                <w:rFonts w:ascii="Arial Unicode MS" w:hAnsi="Arial Unicode MS" w:eastAsia="Arial Unicode MS" w:cs="Arial Unicode MS"/>
                 <w:b w:val="0"/>
                 <w:sz w:val="18"/>
               </w:rPr>
@@ -4325,7 +4325,7 @@
             <w:r/>
             <w:r>
               <w:rPr>
-                <w:rFonts w:ascii="Calibri" w:hAnsi="Calibri" w:eastAsia="Arial Unicode MS" w:cs="Arial Unicode MS"/>
+                <w:rFonts w:ascii="Arial Unicode MS" w:hAnsi="Arial Unicode MS" w:eastAsia="Arial Unicode MS" w:cs="Arial Unicode MS"/>
                 <w:b w:val="0"/>
                 <w:sz w:val="18"/>
               </w:rPr>
@@ -4351,7 +4351,7 @@
             <w:r/>
             <w:r>
               <w:rPr>
-                <w:rFonts w:ascii="Calibri" w:hAnsi="Calibri" w:eastAsia="Arial Unicode MS" w:cs="Arial Unicode MS"/>
+                <w:rFonts w:ascii="Arial Unicode MS" w:hAnsi="Arial Unicode MS" w:eastAsia="Arial Unicode MS" w:cs="Arial Unicode MS"/>
                 <w:b w:val="0"/>
                 <w:sz w:val="18"/>
               </w:rPr>
@@ -4377,7 +4377,7 @@
             <w:r/>
             <w:r>
               <w:rPr>
-                <w:rFonts w:ascii="Calibri" w:hAnsi="Calibri" w:eastAsia="Arial Unicode MS" w:cs="Arial Unicode MS"/>
+                <w:rFonts w:ascii="Arial Unicode MS" w:hAnsi="Arial Unicode MS" w:eastAsia="Arial Unicode MS" w:cs="Arial Unicode MS"/>
                 <w:b w:val="0"/>
                 <w:sz w:val="18"/>
               </w:rPr>
@@ -4408,7 +4408,7 @@
             <w:r/>
             <w:r>
               <w:rPr>
-                <w:rFonts w:ascii="Calibri" w:hAnsi="Calibri" w:eastAsia="Arial Unicode MS" w:cs="Arial Unicode MS"/>
+                <w:rFonts w:ascii="Arial Unicode MS" w:hAnsi="Arial Unicode MS" w:eastAsia="Arial Unicode MS" w:cs="Arial Unicode MS"/>
                 <w:b w:val="0"/>
                 <w:sz w:val="18"/>
               </w:rPr>
@@ -4434,7 +4434,7 @@
             <w:r/>
             <w:r>
               <w:rPr>
-                <w:rFonts w:ascii="Calibri" w:hAnsi="Calibri" w:eastAsia="Arial Unicode MS" w:cs="Arial Unicode MS"/>
+                <w:rFonts w:ascii="Arial Unicode MS" w:hAnsi="Arial Unicode MS" w:eastAsia="Arial Unicode MS" w:cs="Arial Unicode MS"/>
                 <w:b w:val="0"/>
                 <w:sz w:val="18"/>
               </w:rPr>
@@ -4460,7 +4460,7 @@
             <w:r/>
             <w:r>
               <w:rPr>
-                <w:rFonts w:ascii="Calibri" w:hAnsi="Calibri" w:eastAsia="Arial Unicode MS" w:cs="Arial Unicode MS"/>
+                <w:rFonts w:ascii="Arial Unicode MS" w:hAnsi="Arial Unicode MS" w:eastAsia="Arial Unicode MS" w:cs="Arial Unicode MS"/>
                 <w:b w:val="0"/>
                 <w:sz w:val="18"/>
               </w:rPr>
@@ -4491,7 +4491,7 @@
             <w:r/>
             <w:r>
               <w:rPr>
-                <w:rFonts w:ascii="Calibri" w:hAnsi="Calibri" w:eastAsia="Arial Unicode MS" w:cs="Arial Unicode MS"/>
+                <w:rFonts w:ascii="Arial Unicode MS" w:hAnsi="Arial Unicode MS" w:eastAsia="Arial Unicode MS" w:cs="Arial Unicode MS"/>
                 <w:b w:val="0"/>
                 <w:sz w:val="18"/>
               </w:rPr>
@@ -4517,7 +4517,7 @@
             <w:r/>
             <w:r>
               <w:rPr>
-                <w:rFonts w:ascii="Calibri" w:hAnsi="Calibri" w:eastAsia="Arial Unicode MS" w:cs="Arial Unicode MS"/>
+                <w:rFonts w:ascii="Arial Unicode MS" w:hAnsi="Arial Unicode MS" w:eastAsia="Arial Unicode MS" w:cs="Arial Unicode MS"/>
                 <w:b w:val="0"/>
                 <w:sz w:val="18"/>
               </w:rPr>
@@ -4543,7 +4543,7 @@
             <w:r/>
             <w:r>
               <w:rPr>
-                <w:rFonts w:ascii="Calibri" w:hAnsi="Calibri" w:eastAsia="Arial Unicode MS" w:cs="Arial Unicode MS"/>
+                <w:rFonts w:ascii="Arial Unicode MS" w:hAnsi="Arial Unicode MS" w:eastAsia="Arial Unicode MS" w:cs="Arial Unicode MS"/>
                 <w:b w:val="0"/>
                 <w:sz w:val="18"/>
               </w:rPr>
@@ -4564,7 +4564,7 @@
       </w:pPr>
       <w:r>
         <w:rPr>
-          <w:rFonts w:ascii="Calibri" w:hAnsi="Calibri" w:eastAsia="Arial Unicode MS" w:cs="Arial Unicode MS"/>
+          <w:rFonts w:ascii="Arial Unicode MS" w:hAnsi="Arial Unicode MS" w:eastAsia="Arial Unicode MS" w:cs="Arial Unicode MS"/>
           <w:color w:val="191F1D"/>
           <w:sz w:val="22"/>
         </w:rPr>
@@ -4577,7 +4577,7 @@
       </w:pPr>
       <w:r>
         <w:rPr>
-          <w:rFonts w:ascii="Calibri" w:hAnsi="Calibri" w:eastAsia="Arial Unicode MS" w:cs="Arial Unicode MS"/>
+          <w:rFonts w:ascii="Arial Unicode MS" w:hAnsi="Arial Unicode MS" w:eastAsia="Arial Unicode MS" w:cs="Arial Unicode MS"/>
           <w:color w:val="191F1D"/>
           <w:sz w:val="22"/>
         </w:rPr>
@@ -4590,7 +4590,7 @@
       </w:pPr>
       <w:r>
         <w:rPr>
-          <w:rFonts w:ascii="Calibri" w:hAnsi="Calibri" w:eastAsia="Arial Unicode MS" w:cs="Arial Unicode MS"/>
+          <w:rFonts w:ascii="Arial Unicode MS" w:hAnsi="Arial Unicode MS" w:eastAsia="Arial Unicode MS" w:cs="Arial Unicode MS"/>
           <w:color w:val="191F1D"/>
           <w:sz w:val="22"/>
         </w:rPr>
@@ -4604,7 +4604,7 @@
       </w:pPr>
       <w:r>
         <w:rPr>
-          <w:rFonts w:ascii="Calibri" w:hAnsi="Calibri" w:eastAsia="Arial Unicode MS" w:cs="Arial Unicode MS"/>
+          <w:rFonts w:ascii="Arial Unicode MS" w:hAnsi="Arial Unicode MS" w:eastAsia="Arial Unicode MS" w:cs="Arial Unicode MS"/>
           <w:b/>
           <w:color w:val="2E74B5"/>
           <w:sz w:val="32"/>
@@ -4619,7 +4619,7 @@
       </w:pPr>
       <w:r>
         <w:rPr>
-          <w:rFonts w:ascii="Calibri" w:hAnsi="Calibri" w:eastAsia="Arial Unicode MS" w:cs="Arial Unicode MS"/>
+          <w:rFonts w:ascii="Arial Unicode MS" w:hAnsi="Arial Unicode MS" w:eastAsia="Arial Unicode MS" w:cs="Arial Unicode MS"/>
           <w:b/>
           <w:color w:val="176B4D"/>
           <w:sz w:val="21"/>
@@ -4628,7 +4628,7 @@
       </w:r>
       <w:r>
         <w:rPr>
-          <w:rFonts w:ascii="Calibri" w:hAnsi="Calibri" w:eastAsia="Arial Unicode MS" w:cs="Arial Unicode MS"/>
+          <w:rFonts w:ascii="Arial Unicode MS" w:hAnsi="Arial Unicode MS" w:eastAsia="Arial Unicode MS" w:cs="Arial Unicode MS"/>
           <w:color w:val="191F1D"/>
           <w:sz w:val="21"/>
         </w:rPr>
@@ -4642,7 +4642,7 @@
       </w:pPr>
       <w:r>
         <w:rPr>
-          <w:rFonts w:ascii="Calibri" w:hAnsi="Calibri" w:eastAsia="Arial Unicode MS" w:cs="Arial Unicode MS"/>
+          <w:rFonts w:ascii="Arial Unicode MS" w:hAnsi="Arial Unicode MS" w:eastAsia="Arial Unicode MS" w:cs="Arial Unicode MS"/>
           <w:b/>
           <w:color w:val="176B4D"/>
           <w:sz w:val="21"/>
@@ -4651,7 +4651,7 @@
       </w:r>
       <w:r>
         <w:rPr>
-          <w:rFonts w:ascii="Calibri" w:hAnsi="Calibri" w:eastAsia="Arial Unicode MS" w:cs="Arial Unicode MS"/>
+          <w:rFonts w:ascii="Arial Unicode MS" w:hAnsi="Arial Unicode MS" w:eastAsia="Arial Unicode MS" w:cs="Arial Unicode MS"/>
           <w:color w:val="191F1D"/>
           <w:sz w:val="21"/>
         </w:rPr>
@@ -4665,7 +4665,7 @@
       </w:pPr>
       <w:r>
         <w:rPr>
-          <w:rFonts w:ascii="Calibri" w:hAnsi="Calibri" w:eastAsia="Arial Unicode MS" w:cs="Arial Unicode MS"/>
+          <w:rFonts w:ascii="Arial Unicode MS" w:hAnsi="Arial Unicode MS" w:eastAsia="Arial Unicode MS" w:cs="Arial Unicode MS"/>
           <w:b/>
           <w:color w:val="176B4D"/>
           <w:sz w:val="21"/>
@@ -4674,7 +4674,7 @@
       </w:r>
       <w:r>
         <w:rPr>
-          <w:rFonts w:ascii="Calibri" w:hAnsi="Calibri" w:eastAsia="Arial Unicode MS" w:cs="Arial Unicode MS"/>
+          <w:rFonts w:ascii="Arial Unicode MS" w:hAnsi="Arial Unicode MS" w:eastAsia="Arial Unicode MS" w:cs="Arial Unicode MS"/>
           <w:color w:val="191F1D"/>
           <w:sz w:val="21"/>
         </w:rPr>
@@ -4688,7 +4688,7 @@
       </w:pPr>
       <w:r>
         <w:rPr>
-          <w:rFonts w:ascii="Calibri" w:hAnsi="Calibri" w:eastAsia="Arial Unicode MS" w:cs="Arial Unicode MS"/>
+          <w:rFonts w:ascii="Arial Unicode MS" w:hAnsi="Arial Unicode MS" w:eastAsia="Arial Unicode MS" w:cs="Arial Unicode MS"/>
           <w:b/>
           <w:color w:val="176B4D"/>
           <w:sz w:val="21"/>
@@ -4697,7 +4697,7 @@
       </w:r>
       <w:r>
         <w:rPr>
-          <w:rFonts w:ascii="Calibri" w:hAnsi="Calibri" w:eastAsia="Arial Unicode MS" w:cs="Arial Unicode MS"/>
+          <w:rFonts w:ascii="Arial Unicode MS" w:hAnsi="Arial Unicode MS" w:eastAsia="Arial Unicode MS" w:cs="Arial Unicode MS"/>
           <w:color w:val="191F1D"/>
           <w:sz w:val="21"/>
         </w:rPr>
@@ -4741,7 +4741,7 @@
             <w:r/>
             <w:r>
               <w:rPr>
-                <w:rFonts w:ascii="Calibri" w:hAnsi="Calibri" w:eastAsia="Arial Unicode MS" w:cs="Arial Unicode MS"/>
+                <w:rFonts w:ascii="Arial Unicode MS" w:hAnsi="Arial Unicode MS" w:eastAsia="Arial Unicode MS" w:cs="Arial Unicode MS"/>
                 <w:b/>
                 <w:color w:val="1F4D78"/>
                 <w:sz w:val="18"/>
@@ -4769,7 +4769,7 @@
             <w:r/>
             <w:r>
               <w:rPr>
-                <w:rFonts w:ascii="Calibri" w:hAnsi="Calibri" w:eastAsia="Arial Unicode MS" w:cs="Arial Unicode MS"/>
+                <w:rFonts w:ascii="Arial Unicode MS" w:hAnsi="Arial Unicode MS" w:eastAsia="Arial Unicode MS" w:cs="Arial Unicode MS"/>
                 <w:b/>
                 <w:color w:val="1F4D78"/>
                 <w:sz w:val="18"/>
@@ -4797,7 +4797,7 @@
             <w:r/>
             <w:r>
               <w:rPr>
-                <w:rFonts w:ascii="Calibri" w:hAnsi="Calibri" w:eastAsia="Arial Unicode MS" w:cs="Arial Unicode MS"/>
+                <w:rFonts w:ascii="Arial Unicode MS" w:hAnsi="Arial Unicode MS" w:eastAsia="Arial Unicode MS" w:cs="Arial Unicode MS"/>
                 <w:b/>
                 <w:color w:val="1F4D78"/>
                 <w:sz w:val="18"/>
@@ -4829,7 +4829,7 @@
             <w:r/>
             <w:r>
               <w:rPr>
-                <w:rFonts w:ascii="Calibri" w:hAnsi="Calibri" w:eastAsia="Arial Unicode MS" w:cs="Arial Unicode MS"/>
+                <w:rFonts w:ascii="Arial Unicode MS" w:hAnsi="Arial Unicode MS" w:eastAsia="Arial Unicode MS" w:cs="Arial Unicode MS"/>
                 <w:b w:val="0"/>
                 <w:sz w:val="18"/>
               </w:rPr>
@@ -4855,7 +4855,7 @@
             <w:r/>
             <w:r>
               <w:rPr>
-                <w:rFonts w:ascii="Calibri" w:hAnsi="Calibri" w:eastAsia="Arial Unicode MS" w:cs="Arial Unicode MS"/>
+                <w:rFonts w:ascii="Arial Unicode MS" w:hAnsi="Arial Unicode MS" w:eastAsia="Arial Unicode MS" w:cs="Arial Unicode MS"/>
                 <w:b w:val="0"/>
                 <w:sz w:val="18"/>
               </w:rPr>
@@ -4881,7 +4881,7 @@
             <w:r/>
             <w:r>
               <w:rPr>
-                <w:rFonts w:ascii="Calibri" w:hAnsi="Calibri" w:eastAsia="Arial Unicode MS" w:cs="Arial Unicode MS"/>
+                <w:rFonts w:ascii="Arial Unicode MS" w:hAnsi="Arial Unicode MS" w:eastAsia="Arial Unicode MS" w:cs="Arial Unicode MS"/>
                 <w:b w:val="0"/>
                 <w:sz w:val="18"/>
               </w:rPr>
@@ -4912,7 +4912,7 @@
             <w:r/>
             <w:r>
               <w:rPr>
-                <w:rFonts w:ascii="Calibri" w:hAnsi="Calibri" w:eastAsia="Arial Unicode MS" w:cs="Arial Unicode MS"/>
+                <w:rFonts w:ascii="Arial Unicode MS" w:hAnsi="Arial Unicode MS" w:eastAsia="Arial Unicode MS" w:cs="Arial Unicode MS"/>
                 <w:b w:val="0"/>
                 <w:sz w:val="18"/>
               </w:rPr>
@@ -4938,7 +4938,7 @@
             <w:r/>
             <w:r>
               <w:rPr>
-                <w:rFonts w:ascii="Calibri" w:hAnsi="Calibri" w:eastAsia="Arial Unicode MS" w:cs="Arial Unicode MS"/>
+                <w:rFonts w:ascii="Arial Unicode MS" w:hAnsi="Arial Unicode MS" w:eastAsia="Arial Unicode MS" w:cs="Arial Unicode MS"/>
                 <w:b w:val="0"/>
                 <w:sz w:val="18"/>
               </w:rPr>
@@ -4964,7 +4964,7 @@
             <w:r/>
             <w:r>
               <w:rPr>
-                <w:rFonts w:ascii="Calibri" w:hAnsi="Calibri" w:eastAsia="Arial Unicode MS" w:cs="Arial Unicode MS"/>
+                <w:rFonts w:ascii="Arial Unicode MS" w:hAnsi="Arial Unicode MS" w:eastAsia="Arial Unicode MS" w:cs="Arial Unicode MS"/>
                 <w:b w:val="0"/>
                 <w:sz w:val="18"/>
               </w:rPr>
@@ -4995,7 +4995,7 @@
             <w:r/>
             <w:r>
               <w:rPr>
-                <w:rFonts w:ascii="Calibri" w:hAnsi="Calibri" w:eastAsia="Arial Unicode MS" w:cs="Arial Unicode MS"/>
+                <w:rFonts w:ascii="Arial Unicode MS" w:hAnsi="Arial Unicode MS" w:eastAsia="Arial Unicode MS" w:cs="Arial Unicode MS"/>
                 <w:b w:val="0"/>
                 <w:sz w:val="18"/>
               </w:rPr>
@@ -5021,7 +5021,7 @@
             <w:r/>
             <w:r>
               <w:rPr>
-                <w:rFonts w:ascii="Calibri" w:hAnsi="Calibri" w:eastAsia="Arial Unicode MS" w:cs="Arial Unicode MS"/>
+                <w:rFonts w:ascii="Arial Unicode MS" w:hAnsi="Arial Unicode MS" w:eastAsia="Arial Unicode MS" w:cs="Arial Unicode MS"/>
                 <w:b w:val="0"/>
                 <w:sz w:val="18"/>
               </w:rPr>
@@ -5047,7 +5047,7 @@
             <w:r/>
             <w:r>
               <w:rPr>
-                <w:rFonts w:ascii="Calibri" w:hAnsi="Calibri" w:eastAsia="Arial Unicode MS" w:cs="Arial Unicode MS"/>
+                <w:rFonts w:ascii="Arial Unicode MS" w:hAnsi="Arial Unicode MS" w:eastAsia="Arial Unicode MS" w:cs="Arial Unicode MS"/>
                 <w:b w:val="0"/>
                 <w:sz w:val="18"/>
               </w:rPr>
@@ -5078,7 +5078,7 @@
             <w:r/>
             <w:r>
               <w:rPr>
-                <w:rFonts w:ascii="Calibri" w:hAnsi="Calibri" w:eastAsia="Arial Unicode MS" w:cs="Arial Unicode MS"/>
+                <w:rFonts w:ascii="Arial Unicode MS" w:hAnsi="Arial Unicode MS" w:eastAsia="Arial Unicode MS" w:cs="Arial Unicode MS"/>
                 <w:b w:val="0"/>
                 <w:sz w:val="18"/>
               </w:rPr>
@@ -5104,7 +5104,7 @@
             <w:r/>
             <w:r>
               <w:rPr>
-                <w:rFonts w:ascii="Calibri" w:hAnsi="Calibri" w:eastAsia="Arial Unicode MS" w:cs="Arial Unicode MS"/>
+                <w:rFonts w:ascii="Arial Unicode MS" w:hAnsi="Arial Unicode MS" w:eastAsia="Arial Unicode MS" w:cs="Arial Unicode MS"/>
                 <w:b w:val="0"/>
                 <w:sz w:val="18"/>
               </w:rPr>
@@ -5130,7 +5130,7 @@
             <w:r/>
             <w:r>
               <w:rPr>
-                <w:rFonts w:ascii="Calibri" w:hAnsi="Calibri" w:eastAsia="Arial Unicode MS" w:cs="Arial Unicode MS"/>
+                <w:rFonts w:ascii="Arial Unicode MS" w:hAnsi="Arial Unicode MS" w:eastAsia="Arial Unicode MS" w:cs="Arial Unicode MS"/>
                 <w:b w:val="0"/>
                 <w:sz w:val="18"/>
               </w:rPr>
@@ -5152,7 +5152,7 @@
       </w:pPr>
       <w:r>
         <w:rPr>
-          <w:rFonts w:ascii="Calibri" w:hAnsi="Calibri" w:eastAsia="Arial Unicode MS" w:cs="Arial Unicode MS"/>
+          <w:rFonts w:ascii="Arial Unicode MS" w:hAnsi="Arial Unicode MS" w:eastAsia="Arial Unicode MS" w:cs="Arial Unicode MS"/>
           <w:b/>
           <w:color w:val="2E74B5"/>
           <w:sz w:val="32"/>
@@ -5167,7 +5167,7 @@
       </w:pPr>
       <w:r>
         <w:rPr>
-          <w:rFonts w:ascii="Calibri" w:hAnsi="Calibri" w:eastAsia="Arial Unicode MS" w:cs="Arial Unicode MS"/>
+          <w:rFonts w:ascii="Arial Unicode MS" w:hAnsi="Arial Unicode MS" w:eastAsia="Arial Unicode MS" w:cs="Arial Unicode MS"/>
           <w:b/>
           <w:color w:val="176B4D"/>
           <w:sz w:val="21"/>
@@ -5176,7 +5176,7 @@
       </w:r>
       <w:r>
         <w:rPr>
-          <w:rFonts w:ascii="Calibri" w:hAnsi="Calibri" w:eastAsia="Arial Unicode MS" w:cs="Arial Unicode MS"/>
+          <w:rFonts w:ascii="Arial Unicode MS" w:hAnsi="Arial Unicode MS" w:eastAsia="Arial Unicode MS" w:cs="Arial Unicode MS"/>
           <w:color w:val="191F1D"/>
           <w:sz w:val="21"/>
         </w:rPr>
@@ -5190,7 +5190,7 @@
       </w:pPr>
       <w:r>
         <w:rPr>
-          <w:rFonts w:ascii="Calibri" w:hAnsi="Calibri" w:eastAsia="Arial Unicode MS" w:cs="Arial Unicode MS"/>
+          <w:rFonts w:ascii="Arial Unicode MS" w:hAnsi="Arial Unicode MS" w:eastAsia="Arial Unicode MS" w:cs="Arial Unicode MS"/>
           <w:b/>
           <w:color w:val="176B4D"/>
           <w:sz w:val="21"/>
@@ -5199,7 +5199,7 @@
       </w:r>
       <w:r>
         <w:rPr>
-          <w:rFonts w:ascii="Calibri" w:hAnsi="Calibri" w:eastAsia="Arial Unicode MS" w:cs="Arial Unicode MS"/>
+          <w:rFonts w:ascii="Arial Unicode MS" w:hAnsi="Arial Unicode MS" w:eastAsia="Arial Unicode MS" w:cs="Arial Unicode MS"/>
           <w:color w:val="191F1D"/>
           <w:sz w:val="21"/>
         </w:rPr>
@@ -5213,7 +5213,7 @@
       </w:pPr>
       <w:r>
         <w:rPr>
-          <w:rFonts w:ascii="Calibri" w:hAnsi="Calibri" w:eastAsia="Arial Unicode MS" w:cs="Arial Unicode MS"/>
+          <w:rFonts w:ascii="Arial Unicode MS" w:hAnsi="Arial Unicode MS" w:eastAsia="Arial Unicode MS" w:cs="Arial Unicode MS"/>
           <w:b/>
           <w:color w:val="176B4D"/>
           <w:sz w:val="21"/>
@@ -5222,7 +5222,7 @@
       </w:r>
       <w:r>
         <w:rPr>
-          <w:rFonts w:ascii="Calibri" w:hAnsi="Calibri" w:eastAsia="Arial Unicode MS" w:cs="Arial Unicode MS"/>
+          <w:rFonts w:ascii="Arial Unicode MS" w:hAnsi="Arial Unicode MS" w:eastAsia="Arial Unicode MS" w:cs="Arial Unicode MS"/>
           <w:color w:val="191F1D"/>
           <w:sz w:val="21"/>
         </w:rPr>
@@ -5236,7 +5236,7 @@
       </w:pPr>
       <w:r>
         <w:rPr>
-          <w:rFonts w:ascii="Calibri" w:hAnsi="Calibri" w:eastAsia="Arial Unicode MS" w:cs="Arial Unicode MS"/>
+          <w:rFonts w:ascii="Arial Unicode MS" w:hAnsi="Arial Unicode MS" w:eastAsia="Arial Unicode MS" w:cs="Arial Unicode MS"/>
           <w:b/>
           <w:color w:val="176B4D"/>
           <w:sz w:val="21"/>
@@ -5245,7 +5245,7 @@
       </w:r>
       <w:r>
         <w:rPr>
-          <w:rFonts w:ascii="Calibri" w:hAnsi="Calibri" w:eastAsia="Arial Unicode MS" w:cs="Arial Unicode MS"/>
+          <w:rFonts w:ascii="Arial Unicode MS" w:hAnsi="Arial Unicode MS" w:eastAsia="Arial Unicode MS" w:cs="Arial Unicode MS"/>
           <w:color w:val="191F1D"/>
           <w:sz w:val="21"/>
         </w:rPr>
@@ -5259,7 +5259,7 @@
       </w:pPr>
       <w:r>
         <w:rPr>
-          <w:rFonts w:ascii="Calibri" w:hAnsi="Calibri" w:eastAsia="Arial Unicode MS" w:cs="Arial Unicode MS"/>
+          <w:rFonts w:ascii="Arial Unicode MS" w:hAnsi="Arial Unicode MS" w:eastAsia="Arial Unicode MS" w:cs="Arial Unicode MS"/>
           <w:b/>
           <w:color w:val="176B4D"/>
           <w:sz w:val="21"/>
@@ -5268,7 +5268,7 @@
       </w:r>
       <w:r>
         <w:rPr>
-          <w:rFonts w:ascii="Calibri" w:hAnsi="Calibri" w:eastAsia="Arial Unicode MS" w:cs="Arial Unicode MS"/>
+          <w:rFonts w:ascii="Arial Unicode MS" w:hAnsi="Arial Unicode MS" w:eastAsia="Arial Unicode MS" w:cs="Arial Unicode MS"/>
           <w:color w:val="191F1D"/>
           <w:sz w:val="21"/>
         </w:rPr>
@@ -5282,7 +5282,7 @@
       </w:pPr>
       <w:r>
         <w:rPr>
-          <w:rFonts w:ascii="Calibri" w:hAnsi="Calibri" w:eastAsia="Arial Unicode MS" w:cs="Arial Unicode MS"/>
+          <w:rFonts w:ascii="Arial Unicode MS" w:hAnsi="Arial Unicode MS" w:eastAsia="Arial Unicode MS" w:cs="Arial Unicode MS"/>
           <w:b/>
           <w:color w:val="176B4D"/>
           <w:sz w:val="21"/>
@@ -5291,7 +5291,7 @@
       </w:r>
       <w:r>
         <w:rPr>
-          <w:rFonts w:ascii="Calibri" w:hAnsi="Calibri" w:eastAsia="Arial Unicode MS" w:cs="Arial Unicode MS"/>
+          <w:rFonts w:ascii="Arial Unicode MS" w:hAnsi="Arial Unicode MS" w:eastAsia="Arial Unicode MS" w:cs="Arial Unicode MS"/>
           <w:color w:val="191F1D"/>
           <w:sz w:val="21"/>
         </w:rPr>
@@ -5305,7 +5305,7 @@
       </w:pPr>
       <w:r>
         <w:rPr>
-          <w:rFonts w:ascii="Calibri" w:hAnsi="Calibri" w:eastAsia="Arial Unicode MS" w:cs="Arial Unicode MS"/>
+          <w:rFonts w:ascii="Arial Unicode MS" w:hAnsi="Arial Unicode MS" w:eastAsia="Arial Unicode MS" w:cs="Arial Unicode MS"/>
           <w:b/>
           <w:color w:val="176B4D"/>
           <w:sz w:val="21"/>
@@ -5314,7 +5314,7 @@
       </w:r>
       <w:r>
         <w:rPr>
-          <w:rFonts w:ascii="Calibri" w:hAnsi="Calibri" w:eastAsia="Arial Unicode MS" w:cs="Arial Unicode MS"/>
+          <w:rFonts w:ascii="Arial Unicode MS" w:hAnsi="Arial Unicode MS" w:eastAsia="Arial Unicode MS" w:cs="Arial Unicode MS"/>
           <w:color w:val="191F1D"/>
           <w:sz w:val="21"/>
         </w:rPr>
@@ -5328,7 +5328,7 @@
       </w:pPr>
       <w:r>
         <w:rPr>
-          <w:rFonts w:ascii="Calibri" w:hAnsi="Calibri" w:eastAsia="Arial Unicode MS" w:cs="Arial Unicode MS"/>
+          <w:rFonts w:ascii="Arial Unicode MS" w:hAnsi="Arial Unicode MS" w:eastAsia="Arial Unicode MS" w:cs="Arial Unicode MS"/>
           <w:b/>
           <w:color w:val="176B4D"/>
           <w:sz w:val="21"/>
@@ -5337,7 +5337,7 @@
       </w:r>
       <w:r>
         <w:rPr>
-          <w:rFonts w:ascii="Calibri" w:hAnsi="Calibri" w:eastAsia="Arial Unicode MS" w:cs="Arial Unicode MS"/>
+          <w:rFonts w:ascii="Arial Unicode MS" w:hAnsi="Arial Unicode MS" w:eastAsia="Arial Unicode MS" w:cs="Arial Unicode MS"/>
           <w:color w:val="191F1D"/>
           <w:sz w:val="21"/>
         </w:rPr>
@@ -5360,17 +5360,14 @@
   <w:p>
     <w:pPr>
       <w:pStyle w:val="Footer"/>
-      <w:jc w:val="right"/>
+      <w:jc w:val="center"/>
     </w:pPr>
     <w:r>
       <w:rPr>
-        <w:rFonts w:ascii="Calibri" w:hAnsi="Calibri" w:eastAsia="Arial Unicode MS" w:cs="Arial Unicode MS"/>
+        <w:rFonts w:ascii="Arial Unicode MS" w:hAnsi="Arial Unicode MS" w:eastAsia="Arial Unicode MS" w:cs="Arial Unicode MS"/>
         <w:color w:val="5B6560"/>
         <w:sz w:val="17"/>
       </w:rPr>
-      <w:t xml:space="preserve">ReOrch 智策  |  Page </w:t>
-    </w:r>
-    <w:r>
       <w:fldChar w:fldCharType="begin"/>
       <w:instrText xml:space="preserve">PAGE</w:instrText>
       <w:fldChar w:fldCharType="separate"/>
@@ -5747,7 +5744,7 @@
       <w:spacing w:before="0" w:after="120" w:line="264" w:lineRule="auto"/>
     </w:pPr>
     <w:rPr>
-      <w:rFonts w:ascii="Calibri" w:hAnsi="Calibri" w:eastAsia="Arial Unicode MS"/>
+      <w:rFonts w:ascii="Arial Unicode MS" w:hAnsi="Arial Unicode MS" w:eastAsia="Arial Unicode MS"/>
       <w:sz w:val="22"/>
     </w:rPr>
   </w:style>

</xml_diff>